<commit_message>
added labels to reaction pathways, added the figures to validation section (docx only)
</commit_message>
<xml_diff>
--- a/icfd2026/paper/Official_format_ICFD.docx
+++ b/icfd2026/paper/Official_format_ICFD.docx
@@ -62,7 +62,6 @@
       <w:r>
         <w:t>, Kitagawa Toshiaki</w:t>
       </w:r>
-      <w:proofErr w:type="gramStart"/>
       <w:r>
         <w:rPr>
           <w:vertAlign w:val="superscript"/>
@@ -76,16 +75,7 @@
         <w:t xml:space="preserve"> </w:t>
       </w:r>
       <w:r>
-        <w:t>,</w:t>
-      </w:r>
-      <w:proofErr w:type="spellStart"/>
-      <w:r>
-        <w:t>Ekenechukwu</w:t>
-      </w:r>
-      <w:proofErr w:type="spellEnd"/>
-      <w:proofErr w:type="gramEnd"/>
-      <w:r>
-        <w:t xml:space="preserve"> Chijioke Okafor</w:t>
+        <w:t>,Ekenechukwu Chijioke Okafor</w:t>
       </w:r>
       <w:r>
         <w:rPr>
@@ -198,21 +188,7 @@
         <w:rPr>
           <w:rFonts w:eastAsia="ＭＳ 明朝"/>
         </w:rPr>
-        <w:t>-</w:t>
-      </w:r>
-      <w:proofErr w:type="spellStart"/>
-      <w:r>
-        <w:rPr>
-          <w:rFonts w:eastAsia="ＭＳ 明朝"/>
-        </w:rPr>
-        <w:t>ku</w:t>
-      </w:r>
-      <w:proofErr w:type="spellEnd"/>
-      <w:r>
-        <w:rPr>
-          <w:rFonts w:eastAsia="ＭＳ 明朝"/>
-        </w:rPr>
-        <w:t xml:space="preserve">, </w:t>
+        <w:t xml:space="preserve">-ku, </w:t>
       </w:r>
       <w:r>
         <w:rPr>
@@ -303,14 +279,12 @@
         </w:rPr>
         <w:t xml:space="preserve">, </w:t>
       </w:r>
-      <w:proofErr w:type="spellStart"/>
       <w:r>
         <w:rPr>
           <w:rFonts w:eastAsia="ＭＳ 明朝"/>
         </w:rPr>
         <w:t>Susenji</w:t>
       </w:r>
-      <w:proofErr w:type="spellEnd"/>
       <w:r>
         <w:rPr>
           <w:rFonts w:eastAsia="ＭＳ 明朝"/>
@@ -327,21 +301,7 @@
         <w:rPr>
           <w:rFonts w:eastAsia="ＭＳ 明朝"/>
         </w:rPr>
-        <w:t>-</w:t>
-      </w:r>
-      <w:proofErr w:type="spellStart"/>
-      <w:r>
-        <w:rPr>
-          <w:rFonts w:eastAsia="ＭＳ 明朝"/>
-        </w:rPr>
-        <w:t>ku</w:t>
-      </w:r>
-      <w:proofErr w:type="spellEnd"/>
-      <w:r>
-        <w:rPr>
-          <w:rFonts w:eastAsia="ＭＳ 明朝"/>
-        </w:rPr>
-        <w:t xml:space="preserve">, </w:t>
+        <w:t xml:space="preserve">-ku, </w:t>
       </w:r>
       <w:r>
         <w:rPr>
@@ -408,11 +368,9 @@
       <w:r>
         <w:t xml:space="preserve"> and its blends </w:t>
       </w:r>
-      <w:proofErr w:type="gramStart"/>
       <w:r>
         <w:t>was</w:t>
       </w:r>
-      <w:proofErr w:type="gramEnd"/>
       <w:r>
         <w:t xml:space="preserve"> developed. Existing mechanisms were studied using reaction pathway analysis and sensitivity</w:t>
       </w:r>
@@ -803,13 +761,7 @@
           <w:rPr>
             <w:rFonts w:ascii="Cambria Math" w:hAnsi="Cambria Math"/>
           </w:rPr>
-          <m:t>≈</m:t>
-        </m:r>
-        <m:r>
-          <w:rPr>
-            <w:rFonts w:ascii="Cambria Math" w:hAnsi="Cambria Math"/>
-          </w:rPr>
-          <m:t>0.4</m:t>
+          <m:t>≈0.4</m:t>
         </m:r>
       </m:oMath>
       <w:r>
@@ -973,13 +925,7 @@
           <w:rPr>
             <w:rFonts w:ascii="Cambria Math" w:hAnsi="Cambria Math"/>
           </w:rPr>
-          <m:t>≈</m:t>
-        </m:r>
-        <m:r>
-          <w:rPr>
-            <w:rFonts w:ascii="Cambria Math" w:hAnsi="Cambria Math"/>
-          </w:rPr>
-          <m:t>0.4</m:t>
+          <m:t>≈0.4</m:t>
         </m:r>
       </m:oMath>
       <w:r>
@@ -1233,19 +1179,7 @@
           <w:rPr>
             <w:rFonts w:ascii="Cambria Math" w:hAnsi="Cambria Math"/>
           </w:rPr>
-          <m:t>ϕ=1.1</m:t>
-        </m:r>
-        <m:r>
-          <w:rPr>
-            <w:rFonts w:ascii="Cambria Math" w:hAnsi="Cambria Math"/>
-          </w:rPr>
-          <m:t>-</m:t>
-        </m:r>
-        <m:r>
-          <w:rPr>
-            <w:rFonts w:ascii="Cambria Math" w:hAnsi="Cambria Math"/>
-          </w:rPr>
-          <m:t>1.4</m:t>
+          <m:t>ϕ=1.1-1.4</m:t>
         </m:r>
       </m:oMath>
       <w:r>
@@ -1519,10 +1453,7 @@
         <w:fldChar w:fldCharType="begin"/>
       </w:r>
       <w:r>
-        <w:instrText xml:space="preserve"> REF _Ref235768995 \h </w:instrText>
-      </w:r>
-      <w:r>
-        <w:instrText xml:space="preserve"> \* MERGEFORMAT </w:instrText>
+        <w:instrText xml:space="preserve"> REF _Ref235768995 \h  \* MERGEFORMAT </w:instrText>
       </w:r>
       <w:r>
         <w:fldChar w:fldCharType="separate"/>
@@ -1982,44 +1913,47 @@
         <w:fldChar w:fldCharType="end"/>
       </w:r>
       <w:r>
-        <w:t xml:space="preserve"> detailed mechanism and Nakamura et al.'s </w:t>
+        <w:t xml:space="preserve"> detailed mechanism </w:t>
+      </w:r>
+      <w:r>
+        <w:t>was</w:t>
+      </w:r>
+      <w:r>
+        <w:t xml:space="preserve"> used in the simulations. Henceforth, for the purpose of discussion, these mechanisms shall be referred to as </w:t>
+      </w:r>
+      <w:r>
+        <w:lastRenderedPageBreak/>
+        <w:t>Okafor Reduced Mech</w:t>
+      </w:r>
+      <w:r>
+        <w:t xml:space="preserve"> and</w:t>
+      </w:r>
+      <w:r>
+        <w:t xml:space="preserve"> Gotama Mech respectively. A reduced chemical kinetic model</w:t>
+      </w:r>
+      <w:r>
+        <w:t>,</w:t>
+      </w:r>
+      <w:r>
+        <w:t xml:space="preserve"> based on Okafor Reduced Mech </w:t>
       </w:r>
       <w:r>
         <w:fldChar w:fldCharType="begin"/>
       </w:r>
       <w:r>
-        <w:instrText xml:space="preserve"> ADDIN ZOTERO_ITEM CSL_CITATION {"citationID":"BWLpPLRn","properties":{"unsorted":false,"formattedCitation":"[8]","plainCitation":"[8]","noteIndex":0},"citationItems":[{"id":780,"uris":["http://zotero.org/users/20740871/items/FX89RVZZ"],"itemData":{"id":780,"type":"article-journal","abstract":"Ammonia is considered to be one of the promising energy carriers in the future and reliable chemical kinetics to accurately predict ignition characteristics of ammonia/air mixtures is necessary for developing ammonia combustors. However, ignition characteristics of ammonia/air mixtures at low temperatures have not been well studied. The present study employed weak flames in a micro flow reactor with a controlled temperature profile, which have been extensively employed to examine ignition characteristics of hydrocarbons, to investigate ignition characteristics of ammonia/air mixtures at low temperatures. Species measurements for weak flames of ammonia/air mixtures at atmospheric pressure and equivalence ratios of 0.8, 1.0 and 1.2 under a maximum wall temperature of 1400 K were conducted using a mass spectrometer and profiles of the NH3, O2, H2O NO, and N2O mole fractions were obtained. Chemical kinetic modeling was conducted with extensive updates mainly for the N2Hx chemistry because N2Hx species were expected to be produced from the NH2 + NH2 reactions at low temperatures. The mechanism developed in the present study well predicted species profiles of NH3, O2 and H2O for weak flames measured in experiments. The present mechanism also well predicted the final values of the NO and N2O mole fractions behind the reaction zone of weak flames but overestimated these mole fractions in the reaction zone of weak flames. To confirm the existence of N2Hx species in the reaction zone of weak flames, signals from N2H4 were distinguished from measured signals. Sensitivity analysis and reaction flux analysis were conducted and the importance of the N2Hx chemistry in the reaction zone of weak flames at low temperatures was identified. Validation of the present mechanism with literature data on ignition delays and flame speeds were conducted and reasonable agreements with literature data were confirmed. For N2O and NO in the reaction zone of weak flames, however, there was discrepancy between measured and computational mole fractions and further improvements of chemical kinetics related to ammonia ignition are still necessary.","citation-key":"nakamuraKinetic2017","container-title":"Combustion and Flame","DOI":"10.1016/j.combustflame.2017.06.021","ISSN":"0010-2180","journalAbbreviation":"Combustion and Flame","page":"16-27","source":"ScienceDirect","title":"Kinetic modeling of ammonia/air weak flames in a micro flow reactor with a controlled temperature profile","volume":"185","author":[{"family":"Nakamura","given":"Hisashi"},{"family":"Hasegawa","given":"Susumu"},{"family":"Tezuka","given":"Takuya"}],"issued":{"date-parts":[["2017",11,1]]}}}],"schema":"https://github.com/citation-style-language/schema/raw/master/csl-citation.json"} </w:instrText>
+        <w:instrText xml:space="preserve"> ADDIN ZOTERO_ITEM CSL_CITATION {"citationID":"37J4HOGc","properties":{"unsorted":false,"formattedCitation":"[1]","plainCitation":"[1]","noteIndex":0},"citationItems":[{"id":196,"uris":["http://zotero.org/users/20740871/items/GI6AGGV5"],"itemData":{"id":196,"type":"article-journal","abstract":"Ammonia and blends of ammonia with methane are gaining increased interest as fuels for gas turbine applications and hence optimized reduced reaction mechanisms for the fuels are required for the development of combustors. However, there is a scarcity of measured data on the laminar burning velocity of the fuels for optimizing and validating reaction mechanisms especially at high pressures. In this study, an extensive set of measurements of the unstretched laminar burning velocity and Markstein lengths of CH4NH3-air flames at high pressures are reported for the first time and an optimized reduced reaction mechanism is proposed. The experiments were conducted in a constant volume chamber for various ammonia heat fractions in the fuel ranging from 0 to 0.30, equivalence ratios ranging from 0.7 to 1.3, and mixture pressures ranging from 0.10 to 0.50 MPa. The reduced reaction mechanism was developed from a detailed reaction mechanism for CH4NH3-air flames by Okafor et al., and optimized against the present measurements and data in the literature. It is shown that the reduced mechanism models the unstretched laminar burning velocity of NH3/air and CH4NH3-air flames with high fidelity at all studied conditions. It also models satisfactorily NH3, NO and CO concentration in CH4NH3O2N2 oxidation in a laminar flow reactor. Furthermore, the reduced mechanism is demonstrated to predict NO, OH, and NH profiles in a premixed stagnation NH3-air flame satisfactorily. The experimental measurements were also used to validate selected detailed reaction mechanisms. It was found that the significant over-prediction of NO production from NH3 oxidation by GRI Mech 3.0 is primarily due to the influence of the reaction NH+H2OHNO+H2, which in fact may not be important in fuel NO chemistry.","citation-key":"okaforMeasurement2019","container-title":"Combustion and Flame","DOI":"10.1016/j.combustflame.2019.03.008","ISSN":"0010-2180","journalAbbreviation":"Combustion and Flame","page":"162-175","source":"ScienceDirect","title":"Measurement and modelling of the laminar burning velocity of methane-ammonia-air flames at high pressures using a reduced reaction mechanism","volume":"204","author":[{"family":"Okafor","given":"Ekenechukwu Chijioke"},{"family":"Naito","given":"Yuji"},{"family":"Colson","given":"Sophie"},{"family":"Ichikawa","given":"Akinori"},{"family":"Kudo","given":"Taku"},{"family":"Hayakawa","given":"Akihiro"},{"family":"Kobayashi","given":"Hideaki"}],"issued":{"date-parts":[["2019",6,1]]}}}],"schema":"https://github.com/citation-style-language/schema/raw/master/csl-citation.json"} </w:instrText>
       </w:r>
       <w:r>
         <w:fldChar w:fldCharType="separate"/>
       </w:r>
       <w:r>
-        <w:t>[8]</w:t>
+        <w:t>[1]</w:t>
       </w:r>
       <w:r>
         <w:fldChar w:fldCharType="end"/>
       </w:r>
       <w:r>
-        <w:t xml:space="preserve"> mechanism were used in the simulations. Henceforth, for the purpose of discussion, </w:t>
-      </w:r>
-      <w:r>
-        <w:lastRenderedPageBreak/>
-        <w:t xml:space="preserve">these mechanisms shall be referred to as Okafor Reduced Mech, Gotama Mech and Nakamura Mech respectively. A reduced chemical kinetic model based on Okafor Reduced Mech. </w:t>
-      </w:r>
-      <w:r>
-        <w:fldChar w:fldCharType="begin"/>
-      </w:r>
-      <w:r>
-        <w:instrText xml:space="preserve"> ADDIN ZOTERO_ITEM CSL_CITATION {"citationID":"37J4HOGc","properties":{"unsorted":false,"formattedCitation":"[1]","plainCitation":"[1]","noteIndex":0},"citationItems":[{"id":196,"uris":["http://zotero.org/users/20740871/items/GI6AGGV5"],"itemData":{"id":196,"type":"article-journal","abstract":"Ammonia and blends of ammonia with methane are gaining increased interest as fuels for gas turbine applications and hence optimized reduced reaction mechanisms for the fuels are required for the development of combustors. However, there is a scarcity of measured data on the laminar burning velocity of the fuels for optimizing and validating reaction mechanisms especially at high pressures. In this study, an extensive set of measurements of the unstretched laminar burning velocity and Markstein lengths of CH4NH3-air flames at high pressures are reported for the first time and an optimized reduced reaction mechanism is proposed. The experiments were conducted in a constant volume chamber for various ammonia heat fractions in the fuel ranging from 0 to 0.30, equivalence ratios ranging from 0.7 to 1.3, and mixture pressures ranging from 0.10 to 0.50 MPa. The reduced reaction mechanism was developed from a detailed reaction mechanism for CH4NH3-air flames by Okafor et al., and optimized against the present measurements and data in the literature. It is shown that the reduced mechanism models the unstretched laminar burning velocity of NH3/air and CH4NH3-air flames with high fidelity at all studied conditions. It also models satisfactorily NH3, NO and CO concentration in CH4NH3O2N2 oxidation in a laminar flow reactor. Furthermore, the reduced mechanism is demonstrated to predict NO, OH, and NH profiles in a premixed stagnation NH3-air flame satisfactorily. The experimental measurements were also used to validate selected detailed reaction mechanisms. It was found that the significant over-prediction of NO production from NH3 oxidation by GRI Mech 3.0 is primarily due to the influence of the reaction NH+H2OHNO+H2, which in fact may not be important in fuel NO chemistry.","citation-key":"okaforMeasurement2019","container-title":"Combustion and Flame","DOI":"10.1016/j.combustflame.2019.03.008","ISSN":"0010-2180","journalAbbreviation":"Combustion and Flame","page":"162-175","source":"ScienceDirect","title":"Measurement and modelling of the laminar burning velocity of methane-ammonia-air flames at high pressures using a reduced reaction mechanism","volume":"204","author":[{"family":"Okafor","given":"Ekenechukwu Chijioke"},{"family":"Naito","given":"Yuji"},{"family":"Colson","given":"Sophie"},{"family":"Ichikawa","given":"Akinori"},{"family":"Kudo","given":"Taku"},{"family":"Hayakawa","given":"Akihiro"},{"family":"Kobayashi","given":"Hideaki"}],"issued":{"date-parts":[["2019",6,1]]}}}],"schema":"https://github.com/citation-style-language/schema/raw/master/csl-citation.json"} </w:instrText>
-      </w:r>
-      <w:r>
-        <w:fldChar w:fldCharType="separate"/>
-      </w:r>
-      <w:r>
-        <w:t>[1]</w:t>
-      </w:r>
-      <w:r>
-        <w:fldChar w:fldCharType="end"/>
+        <w:t>,</w:t>
       </w:r>
       <w:r>
         <w:t xml:space="preserve"> with 43 species and 152 reactions was developed as described in the following section. The developed mechanism will be refe</w:t>
@@ -2763,7 +2697,7 @@
         <w:rPr>
           <w:rFonts w:eastAsiaTheme="minorEastAsia"/>
         </w:rPr>
-        <w:t xml:space="preserve">'s comparison also highlights Gotama Mech and Nakamura Mech's </w:t>
+        <w:t xml:space="preserve">'s comparison also highlights Gotama Mech's </w:t>
       </w:r>
       <m:oMath>
         <m:sSub>
@@ -2829,7 +2763,19 @@
         <w:rPr>
           <w:rFonts w:eastAsiaTheme="minorEastAsia"/>
         </w:rPr>
-        <w:t xml:space="preserve"> at all </w:t>
+        <w:t xml:space="preserve"> </w:t>
+      </w:r>
+      <w:r>
+        <w:rPr>
+          <w:rFonts w:eastAsiaTheme="minorEastAsia"/>
+        </w:rPr>
+        <w:t>across</w:t>
+      </w:r>
+      <w:r>
+        <w:rPr>
+          <w:rFonts w:eastAsiaTheme="minorEastAsia"/>
+        </w:rPr>
+        <w:t xml:space="preserve"> all </w:t>
       </w:r>
       <m:oMath>
         <m:sSub>
@@ -2865,7 +2811,19 @@
         <w:rPr>
           <w:rFonts w:eastAsiaTheme="minorEastAsia"/>
         </w:rPr>
-        <w:t>. Understanding where Gotama Mech and Nakamura Mech differ from Okafor Reduced Mech should provide insights as to where the under-prediction of NH</w:t>
+        <w:t>. Understanding where Gotama Mech differ</w:t>
+      </w:r>
+      <w:r>
+        <w:rPr>
+          <w:rFonts w:eastAsiaTheme="minorEastAsia"/>
+        </w:rPr>
+        <w:t>s</w:t>
+      </w:r>
+      <w:r>
+        <w:rPr>
+          <w:rFonts w:eastAsiaTheme="minorEastAsia"/>
+        </w:rPr>
+        <w:t xml:space="preserve"> from Okafor Reduced Mech should provide insights as to where the under-prediction of NH</w:t>
       </w:r>
       <w:r>
         <w:rPr>
@@ -3094,13 +3052,7 @@
         <w:rPr>
           <w:rFonts w:eastAsiaTheme="minorEastAsia"/>
         </w:rPr>
-        <w:t xml:space="preserve"> in elementary </w:t>
-      </w:r>
-      <w:r>
-        <w:rPr>
-          <w:rFonts w:eastAsiaTheme="minorEastAsia"/>
-        </w:rPr>
-        <w:t xml:space="preserve">reaction </w:t>
+        <w:t xml:space="preserve"> in elementary reaction </w:t>
       </w:r>
       <w:r>
         <w:rPr>
@@ -3162,18 +3114,12 @@
         <w:rPr>
           <w:rFonts w:eastAsiaTheme="minorEastAsia"/>
         </w:rPr>
-        <w:instrText xml:space="preserve"> REF _Ref235768995 \h </w:instrText>
-      </w:r>
-      <w:r>
-        <w:rPr>
-          <w:rFonts w:eastAsiaTheme="minorEastAsia"/>
-        </w:rPr>
-      </w:r>
-      <w:r>
-        <w:rPr>
-          <w:rFonts w:eastAsiaTheme="minorEastAsia"/>
-        </w:rPr>
-        <w:instrText xml:space="preserve"> \* MERGEFORMAT </w:instrText>
+        <w:instrText xml:space="preserve"> REF _Ref235768995 \h  \* MERGEFORMAT </w:instrText>
+      </w:r>
+      <w:r>
+        <w:rPr>
+          <w:rFonts w:eastAsiaTheme="minorEastAsia"/>
+        </w:rPr>
       </w:r>
       <w:r>
         <w:rPr>
@@ -3203,7 +3149,13 @@
         <w:rPr>
           <w:rFonts w:eastAsiaTheme="minorEastAsia"/>
         </w:rPr>
-        <w:t>. The IROP, hence, characterize</w:t>
+        <w:t xml:space="preserve">. The IROP, hence, </w:t>
+      </w:r>
+      <w:r>
+        <w:rPr>
+          <w:rFonts w:eastAsiaTheme="minorEastAsia"/>
+        </w:rPr>
+        <w:t>characterize</w:t>
       </w:r>
       <w:r>
         <w:rPr>
@@ -3376,16 +3328,7 @@
                       <w:rPr>
                         <w:rFonts w:ascii="Cambria Math" w:hAnsi="Cambria Math"/>
                       </w:rPr>
-                      <m:t xml:space="preserve"> </m:t>
-                    </m:r>
-                    <m:r>
-                      <m:rPr>
-                        <m:sty m:val="p"/>
-                      </m:rPr>
-                      <w:rPr>
-                        <w:rFonts w:ascii="Cambria Math" w:hAnsi="Cambria Math"/>
-                      </w:rPr>
-                      <m:t>d</m:t>
+                      <m:t xml:space="preserve"> d</m:t>
                     </m:r>
                     <m:r>
                       <w:rPr>
@@ -4429,16 +4372,7 @@
           <w:rPr>
             <w:rFonts w:ascii="Cambria Math" w:eastAsiaTheme="minorEastAsia" w:hAnsi="Cambria Math"/>
           </w:rPr>
-          <m:t>NNH</m:t>
-        </m:r>
-        <m:r>
-          <m:rPr>
-            <m:sty m:val="p"/>
-          </m:rPr>
-          <w:rPr>
-            <w:rFonts w:ascii="Cambria Math" w:eastAsiaTheme="minorEastAsia" w:hAnsi="Cambria Math"/>
-          </w:rPr>
-          <m:t>→</m:t>
+          <m:t>NNH→</m:t>
         </m:r>
         <m:sSub>
           <m:sSubPr>
@@ -4457,16 +4391,7 @@
               <w:rPr>
                 <w:rFonts w:ascii="Cambria Math" w:eastAsiaTheme="minorEastAsia" w:hAnsi="Cambria Math"/>
               </w:rPr>
-              <m:t xml:space="preserve"> </m:t>
-            </m:r>
-            <m:r>
-              <m:rPr>
-                <m:sty m:val="p"/>
-              </m:rPr>
-              <w:rPr>
-                <w:rFonts w:ascii="Cambria Math" w:eastAsiaTheme="minorEastAsia" w:hAnsi="Cambria Math"/>
-              </w:rPr>
-              <m:t>N</m:t>
+              <m:t xml:space="preserve"> N</m:t>
             </m:r>
           </m:e>
           <m:sub>
@@ -4572,16 +4497,7 @@
                   <w:rPr>
                     <w:rFonts w:ascii="Cambria Math" w:hAnsi="Cambria Math"/>
                   </w:rPr>
-                  <m:t>N</m:t>
-                </m:r>
-                <m:r>
-                  <m:rPr>
-                    <m:sty m:val="p"/>
-                  </m:rPr>
-                  <w:rPr>
-                    <w:rFonts w:ascii="Cambria Math" w:hAnsi="Cambria Math"/>
-                  </w:rPr>
-                  <m:t>NH=</m:t>
+                  <m:t>NNH=</m:t>
                 </m:r>
                 <m:sSub>
                   <m:sSubPr>
@@ -5233,14 +5149,19 @@
         <w:rPr>
           <w:rFonts w:eastAsiaTheme="minorEastAsia"/>
         </w:rPr>
-        <w:t xml:space="preserve"> production </w:t>
-      </w:r>
-      <w:r>
-        <w:rPr>
-          <w:rFonts w:eastAsiaTheme="minorEastAsia"/>
-        </w:rPr>
-        <w:lastRenderedPageBreak/>
-        <w:t xml:space="preserve">further contributes to promote the pathway </w:t>
+        <w:t xml:space="preserve"> production further contributes to promote the pathway</w:t>
+      </w:r>
+      <w:r>
+        <w:rPr>
+          <w:rFonts w:eastAsiaTheme="minorEastAsia"/>
+        </w:rPr>
+        <w:t>s</w:t>
+      </w:r>
+      <w:r>
+        <w:rPr>
+          <w:rFonts w:eastAsiaTheme="minorEastAsia"/>
+        </w:rPr>
+        <w:t xml:space="preserve"> </w:t>
       </w:r>
       <m:oMath>
         <m:sSub>
@@ -5314,25 +5235,7 @@
           <w:rPr>
             <w:rFonts w:ascii="Cambria Math" w:eastAsiaTheme="minorEastAsia" w:hAnsi="Cambria Math"/>
           </w:rPr>
-          <m:t>→</m:t>
-        </m:r>
-        <m:r>
-          <m:rPr>
-            <m:sty m:val="p"/>
-          </m:rPr>
-          <w:rPr>
-            <w:rFonts w:ascii="Cambria Math" w:eastAsiaTheme="minorEastAsia" w:hAnsi="Cambria Math"/>
-          </w:rPr>
-          <m:t>NNH</m:t>
-        </m:r>
-        <m:r>
-          <m:rPr>
-            <m:sty m:val="p"/>
-          </m:rPr>
-          <w:rPr>
-            <w:rFonts w:ascii="Cambria Math" w:eastAsiaTheme="minorEastAsia" w:hAnsi="Cambria Math"/>
-          </w:rPr>
-          <m:t>→</m:t>
+          <m:t>→NNH→</m:t>
         </m:r>
         <m:sSub>
           <m:sSubPr>
@@ -5371,377 +5274,18 @@
         <w:rPr>
           <w:rFonts w:eastAsiaTheme="minorEastAsia"/>
         </w:rPr>
-        <w:t xml:space="preserve"> as the IROP for these pathways in Gotama Mech were approximately 2.8 times and 2.2 times that of Okafor Reduced Mech</w:t>
-      </w:r>
-      <w:r>
-        <w:rPr>
-          <w:rFonts w:eastAsiaTheme="minorEastAsia"/>
-        </w:rPr>
-        <w:t xml:space="preserve"> respectively</w:t>
-      </w:r>
-      <w:r>
-        <w:rPr>
-          <w:rFonts w:eastAsiaTheme="minorEastAsia"/>
-        </w:rPr>
-        <w:t>. In additon, (R1) was the significant reaction in the latter pathway suggesting .</w:t>
-      </w:r>
-    </w:p>
-    <w:p>
-      <w:pPr>
-        <w:pStyle w:val="Maintext"/>
-        <w:spacing w:line="0" w:lineRule="atLeast"/>
-        <w:ind w:firstLine="360"/>
-        <w:rPr>
-          <w:rFonts w:eastAsiaTheme="minorEastAsia"/>
-        </w:rPr>
-      </w:pPr>
-      <w:r>
-        <w:rPr>
-          <w:rFonts w:eastAsiaTheme="minorEastAsia"/>
-        </w:rPr>
-        <w:t>N</w:t>
-      </w:r>
-      <w:r>
-        <w:rPr>
-          <w:rFonts w:eastAsiaTheme="minorEastAsia"/>
-          <w:vertAlign w:val="subscript"/>
-        </w:rPr>
-        <w:t>2</w:t>
-      </w:r>
-      <w:r>
-        <w:rPr>
-          <w:rFonts w:eastAsiaTheme="minorEastAsia"/>
-        </w:rPr>
-        <w:t>H</w:t>
-      </w:r>
-      <w:r>
-        <w:rPr>
-          <w:rFonts w:eastAsiaTheme="minorEastAsia"/>
-          <w:vertAlign w:val="subscript"/>
-        </w:rPr>
-        <w:t>x</w:t>
-      </w:r>
-      <w:r>
-        <w:rPr>
-          <w:rFonts w:eastAsiaTheme="minorEastAsia"/>
-        </w:rPr>
-        <w:t xml:space="preserve"> species' involvement in NH3 and H2 oxidation pathway interactions as hydrogen concentrations in an NH</w:t>
-      </w:r>
-      <w:r>
-        <w:rPr>
-          <w:rFonts w:eastAsiaTheme="minorEastAsia"/>
-          <w:vertAlign w:val="subscript"/>
-        </w:rPr>
-        <w:t>3</w:t>
-      </w:r>
-      <w:r>
-        <w:rPr>
-          <w:rFonts w:eastAsiaTheme="minorEastAsia"/>
-        </w:rPr>
-        <w:t>/H</w:t>
-      </w:r>
-      <w:r>
-        <w:rPr>
-          <w:rFonts w:eastAsiaTheme="minorEastAsia"/>
-          <w:vertAlign w:val="subscript"/>
-        </w:rPr>
-        <w:t>2</w:t>
-      </w:r>
-      <w:r>
-        <w:rPr>
-          <w:rFonts w:eastAsiaTheme="minorEastAsia"/>
-        </w:rPr>
-        <w:t xml:space="preserve">/air flame at </w:t>
-      </w:r>
-      <m:oMath>
-        <m:sSub>
-          <m:sSubPr>
-            <m:ctrlPr>
-              <w:rPr>
-                <w:rFonts w:ascii="Cambria Math" w:eastAsiaTheme="minorEastAsia" w:hAnsi="Cambria Math"/>
-                <w:i/>
-              </w:rPr>
-            </m:ctrlPr>
-          </m:sSubPr>
-          <m:e>
-            <m:r>
-              <w:rPr>
-                <w:rFonts w:ascii="Cambria Math" w:eastAsiaTheme="minorEastAsia" w:hAnsi="Cambria Math"/>
-              </w:rPr>
-              <m:t>X</m:t>
-            </m:r>
-          </m:e>
-          <m:sub>
-            <m:r>
-              <m:rPr>
-                <m:sty m:val="p"/>
-              </m:rPr>
-              <w:rPr>
-                <w:rFonts w:ascii="Cambria Math" w:eastAsiaTheme="minorEastAsia" w:hAnsi="Cambria Math"/>
-              </w:rPr>
-              <m:t>H2</m:t>
-            </m:r>
-          </m:sub>
-        </m:sSub>
-        <m:r>
-          <w:rPr>
-            <w:rFonts w:ascii="Cambria Math" w:eastAsiaTheme="minorEastAsia" w:hAnsi="Cambria Math"/>
-          </w:rPr>
-          <m:t>=0.5</m:t>
-        </m:r>
-      </m:oMath>
-      <w:r>
-        <w:rPr>
-          <w:rFonts w:eastAsiaTheme="minorEastAsia"/>
-        </w:rPr>
-        <w:t xml:space="preserve"> was evident in Gotama Mech. Moreover, the general increase in IROP of </w:t>
-      </w:r>
-      <w:r>
-        <w:rPr>
-          <w:rFonts w:eastAsiaTheme="minorEastAsia"/>
-        </w:rPr>
-        <w:t>N</w:t>
-      </w:r>
-      <w:r>
-        <w:rPr>
-          <w:rFonts w:eastAsiaTheme="minorEastAsia"/>
-          <w:vertAlign w:val="subscript"/>
-        </w:rPr>
-        <w:t>2</w:t>
-      </w:r>
-      <w:r>
-        <w:rPr>
-          <w:rFonts w:eastAsiaTheme="minorEastAsia"/>
-        </w:rPr>
-        <w:t>H</w:t>
-      </w:r>
-      <w:r>
-        <w:rPr>
-          <w:rFonts w:eastAsiaTheme="minorEastAsia"/>
-          <w:vertAlign w:val="subscript"/>
-        </w:rPr>
-        <w:t>x</w:t>
-      </w:r>
-      <w:r>
-        <w:rPr>
-          <w:rFonts w:eastAsiaTheme="minorEastAsia"/>
-        </w:rPr>
-        <w:t xml:space="preserve"> </w:t>
-      </w:r>
-      <w:r>
-        <w:rPr>
-          <w:rFonts w:eastAsiaTheme="minorEastAsia"/>
-        </w:rPr>
-        <w:t xml:space="preserve">related reactions, relative to Okafor Reduced Mech's reaction pathway, along with the reactions and reaction pathways discussed in this section, it can be inferred that the </w:t>
-      </w:r>
-      <w:r>
-        <w:rPr>
-          <w:rFonts w:eastAsiaTheme="minorEastAsia"/>
-        </w:rPr>
-        <w:t>N</w:t>
-      </w:r>
-      <w:r>
-        <w:rPr>
-          <w:rFonts w:eastAsiaTheme="minorEastAsia"/>
-          <w:vertAlign w:val="subscript"/>
-        </w:rPr>
-        <w:t>2</w:t>
-      </w:r>
-      <w:r>
-        <w:rPr>
-          <w:rFonts w:eastAsiaTheme="minorEastAsia"/>
-        </w:rPr>
-        <w:t>H</w:t>
-      </w:r>
-      <w:r>
-        <w:rPr>
-          <w:rFonts w:eastAsiaTheme="minorEastAsia"/>
-          <w:vertAlign w:val="subscript"/>
-        </w:rPr>
-        <w:t>x</w:t>
-      </w:r>
-      <w:r>
-        <w:rPr>
-          <w:rFonts w:eastAsiaTheme="minorEastAsia"/>
-        </w:rPr>
-        <w:t xml:space="preserve"> </w:t>
-      </w:r>
-      <w:r>
-        <w:rPr>
-          <w:rFonts w:eastAsiaTheme="minorEastAsia"/>
-        </w:rPr>
-        <w:t xml:space="preserve">chemistry </w:t>
-      </w:r>
-      <w:r>
-        <w:rPr>
-          <w:rFonts w:eastAsiaTheme="minorEastAsia"/>
-        </w:rPr>
-        <w:t>has</w:t>
-      </w:r>
-      <w:r>
-        <w:rPr>
-          <w:rFonts w:eastAsiaTheme="minorEastAsia"/>
-        </w:rPr>
-        <w:t xml:space="preserve"> been modelled very differently in the two chemical kinetics models. Hence, to reproduce </w:t>
-      </w:r>
-      <w:r>
-        <w:rPr>
-          <w:rFonts w:eastAsiaTheme="minorEastAsia"/>
-        </w:rPr>
-        <w:t>this phenomenon</w:t>
-      </w:r>
-      <w:r>
-        <w:rPr>
-          <w:rFonts w:eastAsiaTheme="minorEastAsia"/>
-        </w:rPr>
-        <w:t xml:space="preserve"> accurately, Present Mech was developed by adding the </w:t>
-      </w:r>
-      <w:r>
-        <w:rPr>
-          <w:rFonts w:eastAsiaTheme="minorEastAsia"/>
-        </w:rPr>
-        <w:t>N</w:t>
-      </w:r>
-      <w:r>
-        <w:rPr>
-          <w:rFonts w:eastAsiaTheme="minorEastAsia"/>
-          <w:vertAlign w:val="subscript"/>
-        </w:rPr>
-        <w:t>2</w:t>
-      </w:r>
-      <w:r>
-        <w:rPr>
-          <w:rFonts w:eastAsiaTheme="minorEastAsia"/>
-        </w:rPr>
-        <w:t>H</w:t>
-      </w:r>
-      <w:r>
-        <w:rPr>
-          <w:rFonts w:eastAsiaTheme="minorEastAsia"/>
-          <w:vertAlign w:val="subscript"/>
-        </w:rPr>
-        <w:t>x</w:t>
-      </w:r>
-      <w:r>
-        <w:rPr>
-          <w:rFonts w:eastAsiaTheme="minorEastAsia"/>
-        </w:rPr>
-        <w:t xml:space="preserve"> </w:t>
-      </w:r>
-      <w:r>
-        <w:rPr>
-          <w:rFonts w:eastAsiaTheme="minorEastAsia"/>
-        </w:rPr>
-        <w:t xml:space="preserve">chemistry from Gotama Mech </w:t>
-      </w:r>
-      <w:r>
-        <w:rPr>
-          <w:rFonts w:eastAsiaTheme="minorEastAsia"/>
-        </w:rPr>
-        <w:t>[6]</w:t>
-      </w:r>
-      <w:r>
-        <w:rPr>
-          <w:rFonts w:eastAsiaTheme="minorEastAsia"/>
-        </w:rPr>
-        <w:t xml:space="preserve"> to Okafor Reduced Mech </w:t>
-      </w:r>
-      <w:r>
-        <w:rPr>
-          <w:rFonts w:eastAsiaTheme="minorEastAsia"/>
-        </w:rPr>
-        <w:t>[1]</w:t>
-      </w:r>
-      <w:r>
-        <w:rPr>
-          <w:rFonts w:eastAsiaTheme="minorEastAsia"/>
-        </w:rPr>
-        <w:t xml:space="preserve">. The reaction pathway of the Present Mech, hence, behaves similar to Gotama Mech when xH2=0.5 in the binary fuel. Figure \ref{fig-lbv_nh3-h2} shows that, consequently, the Present Mech's </w:t>
-      </w:r>
-      <m:oMath>
-        <m:sSub>
-          <m:sSubPr>
-            <m:ctrlPr>
-              <w:rPr>
-                <w:rFonts w:ascii="Cambria Math" w:eastAsiaTheme="minorEastAsia" w:hAnsi="Cambria Math"/>
-              </w:rPr>
-            </m:ctrlPr>
-          </m:sSubPr>
-          <m:e>
-            <m:r>
-              <w:rPr>
-                <w:rFonts w:ascii="Cambria Math" w:eastAsiaTheme="minorEastAsia" w:hAnsi="Cambria Math"/>
-              </w:rPr>
-              <m:t>S</m:t>
-            </m:r>
-          </m:e>
-          <m:sub>
-            <m:r>
-              <w:rPr>
-                <w:rFonts w:ascii="Cambria Math" w:eastAsiaTheme="minorEastAsia" w:hAnsi="Cambria Math"/>
-              </w:rPr>
-              <m:t>L</m:t>
-            </m:r>
-          </m:sub>
-        </m:sSub>
-      </m:oMath>
-      <w:r>
-        <w:rPr>
-          <w:rFonts w:eastAsiaTheme="minorEastAsia"/>
-        </w:rPr>
-        <w:t xml:space="preserve"> </w:t>
-      </w:r>
-      <w:r>
-        <w:rPr>
-          <w:rFonts w:eastAsiaTheme="minorEastAsia"/>
-        </w:rPr>
-        <w:t>predictions improve due to this and can now emulate experimental measurements of stoichiometric NH</w:t>
-      </w:r>
-      <w:r>
-        <w:rPr>
-          <w:rFonts w:eastAsiaTheme="minorEastAsia"/>
-          <w:vertAlign w:val="subscript"/>
-        </w:rPr>
-        <w:t>3</w:t>
-      </w:r>
-      <w:r>
-        <w:rPr>
-          <w:rFonts w:eastAsiaTheme="minorEastAsia"/>
-        </w:rPr>
-        <w:t>/H</w:t>
-      </w:r>
-      <w:r>
-        <w:rPr>
-          <w:rFonts w:eastAsiaTheme="minorEastAsia"/>
-          <w:vertAlign w:val="subscript"/>
-        </w:rPr>
-        <w:t>2</w:t>
-      </w:r>
-      <w:r>
-        <w:rPr>
-          <w:rFonts w:eastAsiaTheme="minorEastAsia"/>
-        </w:rPr>
-        <w:t>/air burning velocity accurately across all hydrogen concentrations at atmospheric pressure.</w:t>
-      </w:r>
-    </w:p>
-    <w:p>
-      <w:pPr>
-        <w:pStyle w:val="Maintext"/>
-        <w:spacing w:line="0" w:lineRule="atLeast"/>
-        <w:ind w:firstLine="360"/>
-        <w:rPr>
-          <w:rFonts w:eastAsiaTheme="minorEastAsia"/>
-        </w:rPr>
-      </w:pPr>
+        <w:t xml:space="preserve"> as the IROP for these pathways in Gotama </w:t>
+      </w:r>
       <w:r>
         <w:rPr>
           <w:rFonts w:eastAsia="ＭＳ 明朝"/>
           <w:noProof/>
         </w:rPr>
+        <w:lastRenderedPageBreak/>
         <mc:AlternateContent>
           <mc:Choice Requires="wps">
             <w:drawing>
-              <wp:anchor distT="0" distB="0" distL="114300" distR="114300" simplePos="0" relativeHeight="251661312" behindDoc="1" locked="0" layoutInCell="1" allowOverlap="1" wp14:anchorId="29B972F5" wp14:editId="263913AF">
+              <wp:anchor distT="0" distB="0" distL="114300" distR="114300" simplePos="0" relativeHeight="251661312" behindDoc="1" locked="0" layoutInCell="1" allowOverlap="1" wp14:anchorId="29B972F5" wp14:editId="6F2A8869">
                 <wp:simplePos x="721995" y="4406900"/>
                 <wp:positionH relativeFrom="margin">
                   <wp:align>center</wp:align>
@@ -5749,8 +5293,8 @@
                 <wp:positionV relativeFrom="margin">
                   <wp:align>top</wp:align>
                 </wp:positionV>
-                <wp:extent cx="6092190" cy="3752215"/>
-                <wp:effectExtent l="0" t="0" r="3810" b="635"/>
+                <wp:extent cx="6092190" cy="3380740"/>
+                <wp:effectExtent l="0" t="0" r="3810" b="0"/>
                 <wp:wrapSquare wrapText="bothSides"/>
                 <wp:docPr id="5" name="テキスト ボックス 2"/>
                 <wp:cNvGraphicFramePr>
@@ -5765,7 +5309,7 @@
                       <wps:spPr bwMode="auto">
                         <a:xfrm>
                           <a:off x="0" y="0"/>
-                          <a:ext cx="6092190" cy="3752215"/>
+                          <a:ext cx="6092190" cy="3381307"/>
                         </a:xfrm>
                         <a:prstGeom prst="rect">
                           <a:avLst/>
@@ -5791,20 +5335,15 @@
                             <w:pPr>
                               <w:jc w:val="center"/>
                             </w:pPr>
-                          </w:p>
-                          <w:p>
-                            <w:pPr>
-                              <w:jc w:val="center"/>
-                            </w:pPr>
                             <w:r>
                               <w:rPr>
                                 <w:rFonts w:eastAsia="ＭＳ 明朝" w:hint="eastAsia"/>
                                 <w:noProof/>
                               </w:rPr>
                               <w:drawing>
-                                <wp:inline distT="0" distB="0" distL="0" distR="0" wp14:anchorId="79718452" wp14:editId="12EE3E25">
-                                  <wp:extent cx="6178815" cy="2494783"/>
-                                  <wp:effectExtent l="0" t="0" r="0" b="1270"/>
+                                <wp:inline distT="0" distB="0" distL="0" distR="0" wp14:anchorId="79718452" wp14:editId="1BD82988">
+                                  <wp:extent cx="5881324" cy="2224359"/>
+                                  <wp:effectExtent l="0" t="0" r="5715" b="5080"/>
                                   <wp:docPr id="1405510766" name="図 1725804894"/>
                                   <wp:cNvGraphicFramePr>
                                     <a:graphicFrameLocks xmlns:a="http://schemas.openxmlformats.org/drawingml/2006/main" noChangeAspect="1"/>
@@ -5813,7 +5352,7 @@
                                     <a:graphicData uri="http://schemas.openxmlformats.org/drawingml/2006/picture">
                                       <pic:pic xmlns:pic="http://schemas.openxmlformats.org/drawingml/2006/picture">
                                         <pic:nvPicPr>
-                                          <pic:cNvPr id="242845277" name="図 1725804894"/>
+                                          <pic:cNvPr id="1405510766" name="図 1725804894"/>
                                           <pic:cNvPicPr>
                                             <a:picLocks noChangeAspect="1" noChangeArrowheads="1"/>
                                           </pic:cNvPicPr>
@@ -5833,7 +5372,7 @@
                                         <pic:spPr bwMode="auto">
                                           <a:xfrm>
                                             <a:off x="0" y="0"/>
-                                            <a:ext cx="6203110" cy="2504592"/>
+                                            <a:ext cx="5881324" cy="2224359"/>
                                           </a:xfrm>
                                           <a:prstGeom prst="rect">
                                             <a:avLst/>
@@ -6044,14 +5583,9 @@
           </mc:Choice>
           <mc:Fallback>
             <w:pict>
-              <v:shape w14:anchorId="29B972F5" id="テキスト ボックス 2" o:spid="_x0000_s1027" type="#_x0000_t202" style="position:absolute;left:0;text-align:left;margin-left:0;margin-top:0;width:479.7pt;height:295.45pt;z-index:-251655168;visibility:visible;mso-wrap-style:square;mso-width-percent:0;mso-height-percent:0;mso-wrap-distance-left:9pt;mso-wrap-distance-top:0;mso-wrap-distance-right:9pt;mso-wrap-distance-bottom:0;mso-position-horizontal:center;mso-position-horizontal-relative:margin;mso-position-vertical:top;mso-position-vertical-relative:margin;mso-width-percent:0;mso-height-percent:0;mso-width-relative:page;mso-height-relative:page;v-text-anchor:top" o:gfxdata="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" stroked="f">
+              <v:shape w14:anchorId="29B972F5" id="テキスト ボックス 2" o:spid="_x0000_s1027" type="#_x0000_t202" style="position:absolute;left:0;text-align:left;margin-left:0;margin-top:0;width:479.7pt;height:266.2pt;z-index:-251655168;visibility:visible;mso-wrap-style:square;mso-width-percent:0;mso-height-percent:0;mso-wrap-distance-left:9pt;mso-wrap-distance-top:0;mso-wrap-distance-right:9pt;mso-wrap-distance-bottom:0;mso-position-horizontal:center;mso-position-horizontal-relative:margin;mso-position-vertical:top;mso-position-vertical-relative:margin;mso-width-percent:0;mso-height-percent:0;mso-width-relative:page;mso-height-relative:page;v-text-anchor:top" o:gfxdata="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" stroked="f">
                 <v:textbox>
                   <w:txbxContent>
-                    <w:p>
-                      <w:pPr>
-                        <w:jc w:val="center"/>
-                      </w:pPr>
-                    </w:p>
                     <w:p>
                       <w:pPr>
                         <w:jc w:val="center"/>
@@ -6067,9 +5601,9 @@
                           <w:noProof/>
                         </w:rPr>
                         <w:drawing>
-                          <wp:inline distT="0" distB="0" distL="0" distR="0" wp14:anchorId="79718452" wp14:editId="12EE3E25">
-                            <wp:extent cx="6178815" cy="2494783"/>
-                            <wp:effectExtent l="0" t="0" r="0" b="1270"/>
+                          <wp:inline distT="0" distB="0" distL="0" distR="0" wp14:anchorId="79718452" wp14:editId="1BD82988">
+                            <wp:extent cx="5881324" cy="2224359"/>
+                            <wp:effectExtent l="0" t="0" r="5715" b="5080"/>
                             <wp:docPr id="1405510766" name="図 1725804894"/>
                             <wp:cNvGraphicFramePr>
                               <a:graphicFrameLocks xmlns:a="http://schemas.openxmlformats.org/drawingml/2006/main" noChangeAspect="1"/>
@@ -6078,7 +5612,7 @@
                               <a:graphicData uri="http://schemas.openxmlformats.org/drawingml/2006/picture">
                                 <pic:pic xmlns:pic="http://schemas.openxmlformats.org/drawingml/2006/picture">
                                   <pic:nvPicPr>
-                                    <pic:cNvPr id="242845277" name="図 1725804894"/>
+                                    <pic:cNvPr id="1405510766" name="図 1725804894"/>
                                     <pic:cNvPicPr>
                                       <a:picLocks noChangeAspect="1" noChangeArrowheads="1"/>
                                     </pic:cNvPicPr>
@@ -6098,7 +5632,7 @@
                                   <pic:spPr bwMode="auto">
                                     <a:xfrm>
                                       <a:off x="0" y="0"/>
-                                      <a:ext cx="6203110" cy="2504592"/>
+                                      <a:ext cx="5881324" cy="2224359"/>
                                     </a:xfrm>
                                     <a:prstGeom prst="rect">
                                       <a:avLst/>
@@ -6298,6 +5832,24 @@
           </mc:Fallback>
         </mc:AlternateContent>
       </w:r>
+      <w:r>
+        <w:rPr>
+          <w:rFonts w:eastAsiaTheme="minorEastAsia"/>
+        </w:rPr>
+        <w:t>Mech were approximately 2.8 times and 2.2 times that of Okafor Reduced Mech</w:t>
+      </w:r>
+      <w:r>
+        <w:rPr>
+          <w:rFonts w:eastAsiaTheme="minorEastAsia"/>
+        </w:rPr>
+        <w:t xml:space="preserve"> respectively</w:t>
+      </w:r>
+      <w:r>
+        <w:rPr>
+          <w:rFonts w:eastAsiaTheme="minorEastAsia"/>
+        </w:rPr>
+        <w:t>. In additon, (R1) was the significant reaction in the latter pathway suggesting .</w:t>
+      </w:r>
     </w:p>
     <w:p>
       <w:pPr>
@@ -6312,11 +5864,12 @@
         <w:rPr>
           <w:rFonts w:eastAsiaTheme="minorEastAsia"/>
         </w:rPr>
-        <w:t xml:space="preserve">Figure </w:t>
-      </w:r>
-      <w:r>
-        <w:rPr>
-          <w:rFonts w:eastAsiaTheme="minorEastAsia"/>
+        <w:t>N</w:t>
+      </w:r>
+      <w:r>
+        <w:rPr>
+          <w:rFonts w:eastAsiaTheme="minorEastAsia"/>
+          <w:vertAlign w:val="subscript"/>
         </w:rPr>
         <w:t>2</w:t>
       </w:r>
@@ -6324,7 +5877,251 @@
         <w:rPr>
           <w:rFonts w:eastAsiaTheme="minorEastAsia"/>
         </w:rPr>
-        <w:t xml:space="preserve"> shows the normalized sensitivity of </w:t>
+        <w:t>H</w:t>
+      </w:r>
+      <w:r>
+        <w:rPr>
+          <w:rFonts w:eastAsiaTheme="minorEastAsia"/>
+          <w:vertAlign w:val="subscript"/>
+        </w:rPr>
+        <w:t>x</w:t>
+      </w:r>
+      <w:r>
+        <w:rPr>
+          <w:rFonts w:eastAsiaTheme="minorEastAsia"/>
+        </w:rPr>
+        <w:t xml:space="preserve"> species' involvement in NH3 and H2 oxidation pathway interactions as hydrogen concentrations in an NH</w:t>
+      </w:r>
+      <w:r>
+        <w:rPr>
+          <w:rFonts w:eastAsiaTheme="minorEastAsia"/>
+          <w:vertAlign w:val="subscript"/>
+        </w:rPr>
+        <w:t>3</w:t>
+      </w:r>
+      <w:r>
+        <w:rPr>
+          <w:rFonts w:eastAsiaTheme="minorEastAsia"/>
+        </w:rPr>
+        <w:t>/H</w:t>
+      </w:r>
+      <w:r>
+        <w:rPr>
+          <w:rFonts w:eastAsiaTheme="minorEastAsia"/>
+          <w:vertAlign w:val="subscript"/>
+        </w:rPr>
+        <w:t>2</w:t>
+      </w:r>
+      <w:r>
+        <w:rPr>
+          <w:rFonts w:eastAsiaTheme="minorEastAsia"/>
+        </w:rPr>
+        <w:t xml:space="preserve">/air flame at </w:t>
+      </w:r>
+      <m:oMath>
+        <m:sSub>
+          <m:sSubPr>
+            <m:ctrlPr>
+              <w:rPr>
+                <w:rFonts w:ascii="Cambria Math" w:eastAsiaTheme="minorEastAsia" w:hAnsi="Cambria Math"/>
+                <w:i/>
+              </w:rPr>
+            </m:ctrlPr>
+          </m:sSubPr>
+          <m:e>
+            <m:r>
+              <w:rPr>
+                <w:rFonts w:ascii="Cambria Math" w:eastAsiaTheme="minorEastAsia" w:hAnsi="Cambria Math"/>
+              </w:rPr>
+              <m:t>X</m:t>
+            </m:r>
+          </m:e>
+          <m:sub>
+            <m:r>
+              <m:rPr>
+                <m:sty m:val="p"/>
+              </m:rPr>
+              <w:rPr>
+                <w:rFonts w:ascii="Cambria Math" w:eastAsiaTheme="minorEastAsia" w:hAnsi="Cambria Math"/>
+              </w:rPr>
+              <m:t>H2</m:t>
+            </m:r>
+          </m:sub>
+        </m:sSub>
+        <m:r>
+          <w:rPr>
+            <w:rFonts w:ascii="Cambria Math" w:eastAsiaTheme="minorEastAsia" w:hAnsi="Cambria Math"/>
+          </w:rPr>
+          <m:t>=0.5</m:t>
+        </m:r>
+      </m:oMath>
+      <w:r>
+        <w:rPr>
+          <w:rFonts w:eastAsiaTheme="minorEastAsia"/>
+        </w:rPr>
+        <w:t xml:space="preserve"> was evident in Gotama Mech. Moreover, the general increase in IROP of </w:t>
+      </w:r>
+      <w:r>
+        <w:rPr>
+          <w:rFonts w:eastAsiaTheme="minorEastAsia"/>
+        </w:rPr>
+        <w:t>N</w:t>
+      </w:r>
+      <w:r>
+        <w:rPr>
+          <w:rFonts w:eastAsiaTheme="minorEastAsia"/>
+          <w:vertAlign w:val="subscript"/>
+        </w:rPr>
+        <w:t>2</w:t>
+      </w:r>
+      <w:r>
+        <w:rPr>
+          <w:rFonts w:eastAsiaTheme="minorEastAsia"/>
+        </w:rPr>
+        <w:t>H</w:t>
+      </w:r>
+      <w:r>
+        <w:rPr>
+          <w:rFonts w:eastAsiaTheme="minorEastAsia"/>
+          <w:vertAlign w:val="subscript"/>
+        </w:rPr>
+        <w:t>x</w:t>
+      </w:r>
+      <w:r>
+        <w:rPr>
+          <w:rFonts w:eastAsiaTheme="minorEastAsia"/>
+        </w:rPr>
+        <w:t xml:space="preserve"> </w:t>
+      </w:r>
+      <w:r>
+        <w:rPr>
+          <w:rFonts w:eastAsiaTheme="minorEastAsia"/>
+        </w:rPr>
+        <w:t xml:space="preserve">related reactions, relative to Okafor Reduced Mech's reaction pathway, along with the reactions and reaction pathways discussed in this section, it can be inferred that the </w:t>
+      </w:r>
+      <w:r>
+        <w:rPr>
+          <w:rFonts w:eastAsiaTheme="minorEastAsia"/>
+        </w:rPr>
+        <w:t>N</w:t>
+      </w:r>
+      <w:r>
+        <w:rPr>
+          <w:rFonts w:eastAsiaTheme="minorEastAsia"/>
+          <w:vertAlign w:val="subscript"/>
+        </w:rPr>
+        <w:t>2</w:t>
+      </w:r>
+      <w:r>
+        <w:rPr>
+          <w:rFonts w:eastAsiaTheme="minorEastAsia"/>
+        </w:rPr>
+        <w:t>H</w:t>
+      </w:r>
+      <w:r>
+        <w:rPr>
+          <w:rFonts w:eastAsiaTheme="minorEastAsia"/>
+          <w:vertAlign w:val="subscript"/>
+        </w:rPr>
+        <w:t>x</w:t>
+      </w:r>
+      <w:r>
+        <w:rPr>
+          <w:rFonts w:eastAsiaTheme="minorEastAsia"/>
+        </w:rPr>
+        <w:t xml:space="preserve"> </w:t>
+      </w:r>
+      <w:r>
+        <w:rPr>
+          <w:rFonts w:eastAsiaTheme="minorEastAsia"/>
+        </w:rPr>
+        <w:t xml:space="preserve">chemistry </w:t>
+      </w:r>
+      <w:r>
+        <w:rPr>
+          <w:rFonts w:eastAsiaTheme="minorEastAsia"/>
+        </w:rPr>
+        <w:t>has</w:t>
+      </w:r>
+      <w:r>
+        <w:rPr>
+          <w:rFonts w:eastAsiaTheme="minorEastAsia"/>
+        </w:rPr>
+        <w:t xml:space="preserve"> been modelled very differently in the two chemical kinetics models. Hence, to reproduce </w:t>
+      </w:r>
+      <w:r>
+        <w:rPr>
+          <w:rFonts w:eastAsiaTheme="minorEastAsia"/>
+        </w:rPr>
+        <w:t>this phenomenon</w:t>
+      </w:r>
+      <w:r>
+        <w:rPr>
+          <w:rFonts w:eastAsiaTheme="minorEastAsia"/>
+        </w:rPr>
+        <w:t xml:space="preserve"> accurately, Present Mech was developed by adding the </w:t>
+      </w:r>
+      <w:r>
+        <w:rPr>
+          <w:rFonts w:eastAsiaTheme="minorEastAsia"/>
+        </w:rPr>
+        <w:t>N</w:t>
+      </w:r>
+      <w:r>
+        <w:rPr>
+          <w:rFonts w:eastAsiaTheme="minorEastAsia"/>
+          <w:vertAlign w:val="subscript"/>
+        </w:rPr>
+        <w:t>2</w:t>
+      </w:r>
+      <w:r>
+        <w:rPr>
+          <w:rFonts w:eastAsiaTheme="minorEastAsia"/>
+        </w:rPr>
+        <w:t>H</w:t>
+      </w:r>
+      <w:r>
+        <w:rPr>
+          <w:rFonts w:eastAsiaTheme="minorEastAsia"/>
+          <w:vertAlign w:val="subscript"/>
+        </w:rPr>
+        <w:t>x</w:t>
+      </w:r>
+      <w:r>
+        <w:rPr>
+          <w:rFonts w:eastAsiaTheme="minorEastAsia"/>
+        </w:rPr>
+        <w:t xml:space="preserve"> </w:t>
+      </w:r>
+      <w:r>
+        <w:rPr>
+          <w:rFonts w:eastAsiaTheme="minorEastAsia"/>
+        </w:rPr>
+        <w:t xml:space="preserve">chemistry from Gotama Mech </w:t>
+      </w:r>
+      <w:r>
+        <w:rPr>
+          <w:rFonts w:eastAsiaTheme="minorEastAsia"/>
+        </w:rPr>
+        <w:t>[6]</w:t>
+      </w:r>
+      <w:r>
+        <w:rPr>
+          <w:rFonts w:eastAsiaTheme="minorEastAsia"/>
+        </w:rPr>
+        <w:t xml:space="preserve"> to Okafor Reduced Mech </w:t>
+      </w:r>
+      <w:r>
+        <w:rPr>
+          <w:rFonts w:eastAsiaTheme="minorEastAsia"/>
+        </w:rPr>
+        <w:t>[1]</w:t>
+      </w:r>
+      <w:r>
+        <w:rPr>
+          <w:rFonts w:eastAsiaTheme="minorEastAsia"/>
+        </w:rPr>
+        <w:t xml:space="preserve">. The reaction pathway of the Present Mech, hence, behaves similar to Gotama Mech when xH2=0.5 in the binary fuel. Figure \ref{fig-lbv_nh3-h2} shows that, consequently, the Present Mech's </w:t>
       </w:r>
       <m:oMath>
         <m:sSub>
@@ -6357,7 +6154,77 @@
         <w:rPr>
           <w:rFonts w:eastAsiaTheme="minorEastAsia"/>
         </w:rPr>
-        <w:t xml:space="preserve"> to rate constants of the elementary reactions using the Present Mech. Reaction (R4) is shown to play a significant role in promoting </w:t>
+        <w:t xml:space="preserve"> </w:t>
+      </w:r>
+      <w:r>
+        <w:rPr>
+          <w:rFonts w:eastAsiaTheme="minorEastAsia"/>
+        </w:rPr>
+        <w:t>predictions improve due to this and can now emulate experimental measurements of stoichiometric NH</w:t>
+      </w:r>
+      <w:r>
+        <w:rPr>
+          <w:rFonts w:eastAsiaTheme="minorEastAsia"/>
+          <w:vertAlign w:val="subscript"/>
+        </w:rPr>
+        <w:t>3</w:t>
+      </w:r>
+      <w:r>
+        <w:rPr>
+          <w:rFonts w:eastAsiaTheme="minorEastAsia"/>
+        </w:rPr>
+        <w:t>/H</w:t>
+      </w:r>
+      <w:r>
+        <w:rPr>
+          <w:rFonts w:eastAsiaTheme="minorEastAsia"/>
+          <w:vertAlign w:val="subscript"/>
+        </w:rPr>
+        <w:t>2</w:t>
+      </w:r>
+      <w:r>
+        <w:rPr>
+          <w:rFonts w:eastAsiaTheme="minorEastAsia"/>
+        </w:rPr>
+        <w:t>/air burning velocity accurately across all hydrogen concentrations at atmospheric pressure.</w:t>
+      </w:r>
+    </w:p>
+    <w:p>
+      <w:pPr>
+        <w:pStyle w:val="Maintext"/>
+        <w:spacing w:line="0" w:lineRule="atLeast"/>
+        <w:ind w:firstLine="360"/>
+        <w:rPr>
+          <w:rFonts w:eastAsiaTheme="minorEastAsia"/>
+        </w:rPr>
+      </w:pPr>
+    </w:p>
+    <w:p>
+      <w:pPr>
+        <w:pStyle w:val="Maintext"/>
+        <w:spacing w:line="0" w:lineRule="atLeast"/>
+        <w:ind w:firstLine="360"/>
+        <w:rPr>
+          <w:rFonts w:eastAsiaTheme="minorEastAsia"/>
+        </w:rPr>
+      </w:pPr>
+      <w:r>
+        <w:rPr>
+          <w:rFonts w:eastAsiaTheme="minorEastAsia"/>
+        </w:rPr>
+        <w:t xml:space="preserve">Figure </w:t>
+      </w:r>
+      <w:r>
+        <w:rPr>
+          <w:rFonts w:eastAsiaTheme="minorEastAsia"/>
+        </w:rPr>
+        <w:t>2</w:t>
+      </w:r>
+      <w:r>
+        <w:rPr>
+          <w:rFonts w:eastAsiaTheme="minorEastAsia"/>
+        </w:rPr>
+        <w:t xml:space="preserve"> shows the normalized sensitivity of </w:t>
       </w:r>
       <m:oMath>
         <m:sSub>
@@ -6390,7 +6257,7 @@
         <w:rPr>
           <w:rFonts w:eastAsiaTheme="minorEastAsia"/>
         </w:rPr>
-        <w:t xml:space="preserve"> in Present Mech while remaining insignificant in Okafor Reduced Mech. In addition, reaction (R1) only significantly inhibits </w:t>
+        <w:t xml:space="preserve"> to rate constants of the elementary reactions using the Present Mech. Reaction (R4) is shown to play a significant role in promoting </w:t>
       </w:r>
       <m:oMath>
         <m:sSub>
@@ -6423,7 +6290,7 @@
         <w:rPr>
           <w:rFonts w:eastAsiaTheme="minorEastAsia"/>
         </w:rPr>
-        <w:t xml:space="preserve"> in the Present Mech while remaining insignificant Okafor Reduced Mech's sensitiviy analysis. The figure also shows other NHx and N2Hx related reactions being more significant with respect to </w:t>
+        <w:t xml:space="preserve"> in Present Mech while remaining insignificant in Okafor Reduced Mech. In addition, reaction (R1) only significantly inhibits </w:t>
       </w:r>
       <m:oMath>
         <m:sSub>
@@ -6431,7 +6298,6 @@
             <m:ctrlPr>
               <w:rPr>
                 <w:rFonts w:ascii="Cambria Math" w:eastAsiaTheme="minorEastAsia" w:hAnsi="Cambria Math"/>
-                <w:i/>
               </w:rPr>
             </m:ctrlPr>
           </m:sSubPr>
@@ -6457,61 +6323,7 @@
         <w:rPr>
           <w:rFonts w:eastAsiaTheme="minorEastAsia"/>
         </w:rPr>
-        <w:t xml:space="preserve"> in Present Mech at intermediate hydrogen concentration.</w:t>
-      </w:r>
-    </w:p>
-    <w:p>
-      <w:pPr>
-        <w:pStyle w:val="Maintext"/>
-        <w:spacing w:line="0" w:lineRule="atLeast"/>
-        <w:ind w:firstLine="360"/>
-        <w:rPr>
-          <w:rFonts w:eastAsiaTheme="minorEastAsia"/>
-        </w:rPr>
-      </w:pPr>
-      <w:r>
-        <w:rPr>
-          <w:rFonts w:eastAsiaTheme="minorEastAsia"/>
-        </w:rPr>
-        <w:t>The reactions (R2), (R3) and (R4) involve N</w:t>
-      </w:r>
-      <w:r>
-        <w:rPr>
-          <w:rFonts w:eastAsiaTheme="minorEastAsia"/>
-          <w:vertAlign w:val="subscript"/>
-        </w:rPr>
-        <w:t>2</w:t>
-      </w:r>
-      <w:r>
-        <w:rPr>
-          <w:rFonts w:eastAsiaTheme="minorEastAsia"/>
-        </w:rPr>
-        <w:t>H</w:t>
-      </w:r>
-      <w:r>
-        <w:rPr>
-          <w:rFonts w:eastAsiaTheme="minorEastAsia"/>
-          <w:vertAlign w:val="subscript"/>
-        </w:rPr>
-        <w:t>x</w:t>
-      </w:r>
-      <w:r>
-        <w:rPr>
-          <w:rFonts w:eastAsiaTheme="minorEastAsia"/>
-        </w:rPr>
-        <w:t xml:space="preserve"> species and control H radical concentration</w:t>
-      </w:r>
-      <w:r>
-        <w:rPr>
-          <w:rFonts w:eastAsiaTheme="minorEastAsia"/>
-        </w:rPr>
-        <w:t xml:space="preserve">s, </w:t>
-      </w:r>
-      <w:r>
-        <w:rPr>
-          <w:rFonts w:eastAsiaTheme="minorEastAsia"/>
-        </w:rPr>
-        <w:t xml:space="preserve">an important radical for promoting </w:t>
+        <w:t xml:space="preserve"> in the Present Mech while remaining insignificant Okafor Reduced Mech's sensitiviy analysis. The figure also shows other NHx and N2Hx related reactions being more significant with respect to </w:t>
       </w:r>
       <m:oMath>
         <m:sSub>
@@ -6519,6 +6331,7 @@
             <m:ctrlPr>
               <w:rPr>
                 <w:rFonts w:ascii="Cambria Math" w:eastAsiaTheme="minorEastAsia" w:hAnsi="Cambria Math"/>
+                <w:i/>
               </w:rPr>
             </m:ctrlPr>
           </m:sSubPr>
@@ -6544,7 +6357,23 @@
         <w:rPr>
           <w:rFonts w:eastAsiaTheme="minorEastAsia"/>
         </w:rPr>
-        <w:t>. The increased IROP of these reactions in Present Mech imply an increase in H radical concentration which, correlates with the increased burning veloctiy predictions of this mechanism relative to Okafor Reduced Mech. Moreover, the formation and consumption of N</w:t>
+        <w:t xml:space="preserve"> in Present Mech at intermediate hydrogen concentration.</w:t>
+      </w:r>
+    </w:p>
+    <w:p>
+      <w:pPr>
+        <w:pStyle w:val="Maintext"/>
+        <w:spacing w:line="0" w:lineRule="atLeast"/>
+        <w:ind w:firstLine="360"/>
+        <w:rPr>
+          <w:rFonts w:eastAsiaTheme="minorEastAsia"/>
+        </w:rPr>
+      </w:pPr>
+      <w:r>
+        <w:rPr>
+          <w:rFonts w:eastAsiaTheme="minorEastAsia"/>
+        </w:rPr>
+        <w:t>The reactions (R2), (R3) and (R4) involve N</w:t>
       </w:r>
       <w:r>
         <w:rPr>
@@ -6564,202 +6393,25 @@
           <w:rFonts w:eastAsiaTheme="minorEastAsia"/>
           <w:vertAlign w:val="subscript"/>
         </w:rPr>
-        <w:t>3</w:t>
-      </w:r>
-      <w:r>
-        <w:rPr>
-          <w:rFonts w:eastAsiaTheme="minorEastAsia"/>
-        </w:rPr>
-        <w:t xml:space="preserve"> with (R1) and (R2) respectively control NH and NH</w:t>
-      </w:r>
-      <w:r>
-        <w:rPr>
-          <w:rFonts w:eastAsiaTheme="minorEastAsia"/>
-          <w:vertAlign w:val="subscript"/>
-        </w:rPr>
-        <w:t>2</w:t>
-      </w:r>
-      <w:r>
-        <w:rPr>
-          <w:rFonts w:eastAsiaTheme="minorEastAsia"/>
-        </w:rPr>
-        <w:t xml:space="preserve"> concentrations. NH</w:t>
-      </w:r>
-      <w:r>
-        <w:rPr>
-          <w:rFonts w:eastAsiaTheme="minorEastAsia"/>
-          <w:vertAlign w:val="subscript"/>
-        </w:rPr>
         <w:t>x</w:t>
       </w:r>
       <w:r>
         <w:rPr>
           <w:rFonts w:eastAsiaTheme="minorEastAsia"/>
         </w:rPr>
-        <w:t xml:space="preserve"> species are important as they interact with H and OH radicals </w:t>
-      </w:r>
-      <w:r>
-        <w:rPr>
-          <w:rFonts w:eastAsiaTheme="minorEastAsia"/>
-        </w:rPr>
-        <w:t>and</w:t>
-      </w:r>
-      <w:r>
-        <w:rPr>
-          <w:rFonts w:eastAsiaTheme="minorEastAsia"/>
-        </w:rPr>
-        <w:t xml:space="preserve"> produce these radicals. (R4) is an example of NH</w:t>
-      </w:r>
-      <w:r>
-        <w:rPr>
-          <w:rFonts w:eastAsiaTheme="minorEastAsia"/>
-          <w:vertAlign w:val="subscript"/>
-        </w:rPr>
-        <w:t>x</w:t>
-      </w:r>
-      <w:r>
-        <w:rPr>
-          <w:rFonts w:eastAsiaTheme="minorEastAsia"/>
-        </w:rPr>
-        <w:t xml:space="preserve"> species' involved in the production of an H radical. The other product of (R4), N</w:t>
-      </w:r>
-      <w:r>
-        <w:rPr>
-          <w:rFonts w:eastAsiaTheme="minorEastAsia"/>
-          <w:vertAlign w:val="subscript"/>
-        </w:rPr>
-        <w:t>2</w:t>
-      </w:r>
-      <w:r>
-        <w:rPr>
-          <w:rFonts w:eastAsiaTheme="minorEastAsia"/>
-        </w:rPr>
-        <w:t>H</w:t>
-      </w:r>
-      <w:r>
-        <w:rPr>
-          <w:rFonts w:eastAsiaTheme="minorEastAsia"/>
-          <w:vertAlign w:val="subscript"/>
-        </w:rPr>
-        <w:t>2</w:t>
-      </w:r>
-      <w:r>
-        <w:rPr>
-          <w:rFonts w:eastAsiaTheme="minorEastAsia"/>
-        </w:rPr>
-        <w:t xml:space="preserve">, is part of the pathway to form NNH which also produces H radicals via (R3). Moreover, reaction (R4)'s significant positive effect on the flame's burning velocity further </w:t>
-      </w:r>
-      <w:r>
-        <w:rPr>
-          <w:rFonts w:eastAsiaTheme="minorEastAsia"/>
-        </w:rPr>
-        <w:t>supports the theory</w:t>
-      </w:r>
-      <w:r>
-        <w:rPr>
-          <w:rFonts w:eastAsiaTheme="minorEastAsia"/>
-        </w:rPr>
-        <w:t xml:space="preserve"> </w:t>
-      </w:r>
-      <w:r>
-        <w:rPr>
-          <w:rFonts w:eastAsiaTheme="minorEastAsia"/>
-        </w:rPr>
-        <w:t>that</w:t>
-      </w:r>
-      <w:r>
-        <w:rPr>
-          <w:rFonts w:eastAsiaTheme="minorEastAsia"/>
-        </w:rPr>
-        <w:t xml:space="preserve"> N</w:t>
-      </w:r>
-      <w:r>
-        <w:rPr>
-          <w:rFonts w:eastAsiaTheme="minorEastAsia"/>
-          <w:vertAlign w:val="subscript"/>
-        </w:rPr>
-        <w:t>2</w:t>
-      </w:r>
-      <w:r>
-        <w:rPr>
-          <w:rFonts w:eastAsiaTheme="minorEastAsia"/>
-        </w:rPr>
-        <w:t>H</w:t>
-      </w:r>
-      <w:r>
-        <w:rPr>
-          <w:rFonts w:eastAsiaTheme="minorEastAsia"/>
-          <w:vertAlign w:val="subscript"/>
-        </w:rPr>
-        <w:t>x</w:t>
-      </w:r>
-      <w:r>
-        <w:rPr>
-          <w:rFonts w:eastAsiaTheme="minorEastAsia"/>
-        </w:rPr>
-        <w:t xml:space="preserve"> species and their reaction pathways </w:t>
-      </w:r>
-      <w:r>
-        <w:rPr>
-          <w:rFonts w:eastAsiaTheme="minorEastAsia"/>
-        </w:rPr>
-        <w:t>are important to accurately describe flame with</w:t>
-      </w:r>
-      <w:r>
-        <w:rPr>
-          <w:rFonts w:eastAsiaTheme="minorEastAsia"/>
-        </w:rPr>
-        <w:t xml:space="preserve"> fuel </w:t>
-      </w:r>
-      <w:r>
-        <w:rPr>
-          <w:rFonts w:eastAsiaTheme="minorEastAsia"/>
-        </w:rPr>
-        <w:t>compositions</w:t>
-      </w:r>
-      <w:r>
-        <w:rPr>
-          <w:rFonts w:eastAsiaTheme="minorEastAsia"/>
-        </w:rPr>
-        <w:t xml:space="preserve"> of intermediate hydrogen concentration. Therefore, the Present Mech with a more accurate N</w:t>
-      </w:r>
-      <w:r>
-        <w:rPr>
-          <w:rFonts w:eastAsiaTheme="minorEastAsia"/>
-          <w:vertAlign w:val="subscript"/>
-        </w:rPr>
-        <w:t>2</w:t>
-      </w:r>
-      <w:r>
-        <w:rPr>
-          <w:rFonts w:eastAsiaTheme="minorEastAsia"/>
-        </w:rPr>
-        <w:t>H</w:t>
-      </w:r>
-      <w:r>
-        <w:rPr>
-          <w:rFonts w:eastAsiaTheme="minorEastAsia"/>
-          <w:vertAlign w:val="subscript"/>
-        </w:rPr>
-        <w:t>x</w:t>
-      </w:r>
-      <w:r>
-        <w:rPr>
-          <w:rFonts w:eastAsiaTheme="minorEastAsia"/>
-        </w:rPr>
-        <w:t xml:space="preserve"> chemistry </w:t>
-      </w:r>
-      <w:r>
-        <w:rPr>
-          <w:rFonts w:eastAsiaTheme="minorEastAsia"/>
-        </w:rPr>
-        <w:t>can</w:t>
-      </w:r>
-      <w:r>
-        <w:rPr>
-          <w:rFonts w:eastAsiaTheme="minorEastAsia"/>
-        </w:rPr>
-        <w:t xml:space="preserve"> predict </w:t>
+        <w:t xml:space="preserve"> species and control H radical concentration</w:t>
+      </w:r>
+      <w:r>
+        <w:rPr>
+          <w:rFonts w:eastAsiaTheme="minorEastAsia"/>
+        </w:rPr>
+        <w:t xml:space="preserve">s, </w:t>
+      </w:r>
+      <w:r>
+        <w:rPr>
+          <w:rFonts w:eastAsiaTheme="minorEastAsia"/>
+        </w:rPr>
+        <w:t xml:space="preserve">an important radical for promoting </w:t>
       </w:r>
       <m:oMath>
         <m:sSub>
@@ -6792,53 +6444,236 @@
         <w:rPr>
           <w:rFonts w:eastAsiaTheme="minorEastAsia"/>
         </w:rPr>
-        <w:t xml:space="preserve"> under these conditions accurately</w:t>
-      </w:r>
-      <w:r>
-        <w:rPr>
-          <w:rFonts w:eastAsiaTheme="minorEastAsia"/>
-        </w:rPr>
-        <w:t>.</w:t>
-      </w:r>
-    </w:p>
-    <w:p>
-      <w:pPr>
-        <w:pStyle w:val="Maintext"/>
-        <w:spacing w:line="0" w:lineRule="atLeast"/>
-        <w:ind w:firstLine="360"/>
-        <w:rPr>
-          <w:rFonts w:eastAsiaTheme="minorEastAsia"/>
-        </w:rPr>
-      </w:pPr>
-    </w:p>
-    <w:p>
-      <w:pPr>
-        <w:pStyle w:val="section"/>
-      </w:pPr>
-      <w:r>
-        <w:t>Validation</w:t>
-      </w:r>
-    </w:p>
-    <w:p>
-      <w:pPr>
-        <w:pStyle w:val="Maintext"/>
-      </w:pPr>
-      <w:r>
-        <w:t xml:space="preserve">The Present Mech was validated with experimental data for </w:t>
+        <w:t>. The increased IROP of these reactions in Present Mech imply an increase in H radical concentration which, correlates with the increased burning veloctiy predictions of this mechanism relative to Okafor Reduced Mech. Moreover, the formation and consumption of N</w:t>
+      </w:r>
+      <w:r>
+        <w:rPr>
+          <w:rFonts w:eastAsiaTheme="minorEastAsia"/>
+          <w:vertAlign w:val="subscript"/>
+        </w:rPr>
+        <w:t>2</w:t>
+      </w:r>
+      <w:r>
+        <w:rPr>
+          <w:rFonts w:eastAsiaTheme="minorEastAsia"/>
+        </w:rPr>
+        <w:t>H</w:t>
+      </w:r>
+      <w:r>
+        <w:rPr>
+          <w:rFonts w:eastAsiaTheme="minorEastAsia"/>
+          <w:vertAlign w:val="subscript"/>
+        </w:rPr>
+        <w:t>3</w:t>
+      </w:r>
+      <w:r>
+        <w:rPr>
+          <w:rFonts w:eastAsiaTheme="minorEastAsia"/>
+        </w:rPr>
+        <w:t xml:space="preserve"> with (R1) and (R2) respectively control NH and NH</w:t>
+      </w:r>
+      <w:r>
+        <w:rPr>
+          <w:rFonts w:eastAsiaTheme="minorEastAsia"/>
+          <w:vertAlign w:val="subscript"/>
+        </w:rPr>
+        <w:t>2</w:t>
+      </w:r>
+      <w:r>
+        <w:rPr>
+          <w:rFonts w:eastAsiaTheme="minorEastAsia"/>
+        </w:rPr>
+        <w:t xml:space="preserve"> concentrations. NH</w:t>
+      </w:r>
+      <w:r>
+        <w:rPr>
+          <w:rFonts w:eastAsiaTheme="minorEastAsia"/>
+          <w:vertAlign w:val="subscript"/>
+        </w:rPr>
+        <w:t>x</w:t>
+      </w:r>
+      <w:r>
+        <w:rPr>
+          <w:rFonts w:eastAsiaTheme="minorEastAsia"/>
+        </w:rPr>
+        <w:t xml:space="preserve"> species are important as they interact with H and OH radicals </w:t>
+      </w:r>
+      <w:r>
+        <w:rPr>
+          <w:rFonts w:eastAsiaTheme="minorEastAsia"/>
+        </w:rPr>
+        <w:t>and</w:t>
+      </w:r>
+      <w:r>
+        <w:rPr>
+          <w:rFonts w:eastAsiaTheme="minorEastAsia"/>
+        </w:rPr>
+        <w:t xml:space="preserve"> produce these radicals. (R4) is an example of NH</w:t>
+      </w:r>
+      <w:r>
+        <w:rPr>
+          <w:rFonts w:eastAsiaTheme="minorEastAsia"/>
+          <w:vertAlign w:val="subscript"/>
+        </w:rPr>
+        <w:t>x</w:t>
+      </w:r>
+      <w:r>
+        <w:rPr>
+          <w:rFonts w:eastAsiaTheme="minorEastAsia"/>
+        </w:rPr>
+        <w:t xml:space="preserve"> species' involved in the production of an H radical. The other product of (R4), N</w:t>
+      </w:r>
+      <w:r>
+        <w:rPr>
+          <w:rFonts w:eastAsiaTheme="minorEastAsia"/>
+          <w:vertAlign w:val="subscript"/>
+        </w:rPr>
+        <w:t>2</w:t>
+      </w:r>
+      <w:r>
+        <w:rPr>
+          <w:rFonts w:eastAsiaTheme="minorEastAsia"/>
+        </w:rPr>
+        <w:t>H</w:t>
+      </w:r>
+      <w:r>
+        <w:rPr>
+          <w:rFonts w:eastAsiaTheme="minorEastAsia"/>
+          <w:vertAlign w:val="subscript"/>
+        </w:rPr>
+        <w:t>2</w:t>
+      </w:r>
+      <w:r>
+        <w:rPr>
+          <w:rFonts w:eastAsiaTheme="minorEastAsia"/>
+        </w:rPr>
+        <w:t xml:space="preserve">, is part of the pathway to form NNH which also produces H radicals via (R3). Moreover, reaction (R4)'s significant positive effect on the flame's burning velocity further </w:t>
+      </w:r>
+      <w:r>
+        <w:rPr>
+          <w:rFonts w:eastAsiaTheme="minorEastAsia"/>
+        </w:rPr>
+        <w:t>supports the theory</w:t>
+      </w:r>
+      <w:r>
+        <w:rPr>
+          <w:rFonts w:eastAsiaTheme="minorEastAsia"/>
+        </w:rPr>
+        <w:t xml:space="preserve"> </w:t>
+      </w:r>
+      <w:r>
+        <w:rPr>
+          <w:rFonts w:eastAsiaTheme="minorEastAsia"/>
+        </w:rPr>
+        <w:t>that</w:t>
+      </w:r>
+      <w:r>
+        <w:rPr>
+          <w:rFonts w:eastAsiaTheme="minorEastAsia"/>
+        </w:rPr>
+        <w:t xml:space="preserve"> N</w:t>
+      </w:r>
+      <w:r>
+        <w:rPr>
+          <w:rFonts w:eastAsiaTheme="minorEastAsia"/>
+          <w:vertAlign w:val="subscript"/>
+        </w:rPr>
+        <w:t>2</w:t>
+      </w:r>
+      <w:r>
+        <w:rPr>
+          <w:rFonts w:eastAsiaTheme="minorEastAsia"/>
+        </w:rPr>
+        <w:t>H</w:t>
+      </w:r>
+      <w:r>
+        <w:rPr>
+          <w:rFonts w:eastAsiaTheme="minorEastAsia"/>
+          <w:vertAlign w:val="subscript"/>
+        </w:rPr>
+        <w:t>x</w:t>
+      </w:r>
+      <w:r>
+        <w:rPr>
+          <w:rFonts w:eastAsiaTheme="minorEastAsia"/>
+        </w:rPr>
+        <w:t xml:space="preserve"> species and their reaction pathways </w:t>
+      </w:r>
+      <w:r>
+        <w:rPr>
+          <w:rFonts w:eastAsiaTheme="minorEastAsia"/>
+        </w:rPr>
+        <w:t>are important to accurately describe flame with</w:t>
+      </w:r>
+      <w:r>
+        <w:rPr>
+          <w:rFonts w:eastAsiaTheme="minorEastAsia"/>
+        </w:rPr>
+        <w:t xml:space="preserve"> fuel </w:t>
+      </w:r>
+      <w:r>
+        <w:rPr>
+          <w:rFonts w:eastAsiaTheme="minorEastAsia"/>
+        </w:rPr>
+        <w:t>compositions</w:t>
+      </w:r>
+      <w:r>
+        <w:rPr>
+          <w:rFonts w:eastAsiaTheme="minorEastAsia"/>
+        </w:rPr>
+        <w:t xml:space="preserve"> of intermediate hydrogen concentration. Therefore, the Present Mech with a more accurate N</w:t>
+      </w:r>
+      <w:r>
+        <w:rPr>
+          <w:rFonts w:eastAsiaTheme="minorEastAsia"/>
+          <w:vertAlign w:val="subscript"/>
+        </w:rPr>
+        <w:t>2</w:t>
+      </w:r>
+      <w:r>
+        <w:rPr>
+          <w:rFonts w:eastAsiaTheme="minorEastAsia"/>
+        </w:rPr>
+        <w:t>H</w:t>
+      </w:r>
+      <w:r>
+        <w:rPr>
+          <w:rFonts w:eastAsiaTheme="minorEastAsia"/>
+          <w:vertAlign w:val="subscript"/>
+        </w:rPr>
+        <w:t>x</w:t>
+      </w:r>
+      <w:r>
+        <w:rPr>
+          <w:rFonts w:eastAsiaTheme="minorEastAsia"/>
+        </w:rPr>
+        <w:t xml:space="preserve"> chemistry </w:t>
+      </w:r>
+      <w:r>
+        <w:rPr>
+          <w:rFonts w:eastAsiaTheme="minorEastAsia"/>
+        </w:rPr>
+        <w:t>can</w:t>
+      </w:r>
+      <w:r>
+        <w:rPr>
+          <w:rFonts w:eastAsiaTheme="minorEastAsia"/>
+        </w:rPr>
+        <w:t xml:space="preserve"> predict </w:t>
       </w:r>
       <m:oMath>
         <m:sSub>
           <m:sSubPr>
             <m:ctrlPr>
               <w:rPr>
-                <w:rFonts w:ascii="Cambria Math" w:hAnsi="Cambria Math"/>
+                <w:rFonts w:ascii="Cambria Math" w:eastAsiaTheme="minorEastAsia" w:hAnsi="Cambria Math"/>
               </w:rPr>
             </m:ctrlPr>
           </m:sSubPr>
           <m:e>
             <m:r>
               <w:rPr>
-                <w:rFonts w:ascii="Cambria Math" w:hAnsi="Cambria Math"/>
+                <w:rFonts w:ascii="Cambria Math" w:eastAsiaTheme="minorEastAsia" w:hAnsi="Cambria Math"/>
               </w:rPr>
               <m:t>S</m:t>
             </m:r>
@@ -6846,7 +6681,7 @@
           <m:sub>
             <m:r>
               <w:rPr>
-                <w:rFonts w:ascii="Cambria Math" w:hAnsi="Cambria Math"/>
+                <w:rFonts w:ascii="Cambria Math" w:eastAsiaTheme="minorEastAsia" w:hAnsi="Cambria Math"/>
               </w:rPr>
               <m:t>L</m:t>
             </m:r>
@@ -6854,82 +6689,42 @@
         </m:sSub>
       </m:oMath>
       <w:r>
-        <w:t xml:space="preserve"> of NH</w:t>
-      </w:r>
-      <w:r>
-        <w:rPr>
-          <w:vertAlign w:val="subscript"/>
-        </w:rPr>
-        <w:t>3</w:t>
-      </w:r>
-      <w:r>
-        <w:t>/H</w:t>
-      </w:r>
-      <w:r>
-        <w:rPr>
-          <w:vertAlign w:val="subscript"/>
-        </w:rPr>
-        <w:t>2</w:t>
-      </w:r>
-      <w:r>
-        <w:t xml:space="preserve">/air from the datasets consolidated by Han et al. </w:t>
-      </w:r>
-      <w:r>
-        <w:fldChar w:fldCharType="begin"/>
-      </w:r>
-      <w:r>
-        <w:instrText xml:space="preserve"> ADDIN ZOTERO_ITEM CSL_CITATION {"citationID":"g6iCrZkh","properties":{"unsorted":false,"formattedCitation":"[10]","plainCitation":"[10]","noteIndex":0},"citationItems":[{"id":720,"uris":["http://zotero.org/users/20740871/items/FXITQJ6I"],"itemData":{"id":720,"type":"article-journal","abstract":"Ammonia (NH3) is a promising carbon-free fuel, where the H2 enrichment strategy often adopted to enhance the combustion. One of the fundamental combustion properties, the laminar burning velocity (SL), has been extensively investigated in the literature. Many measurements providing laminar burning velocity data are available, but exhibited significant data scatter, i.e., inconsistency much beyond the reported uncertainties among different experimental results under the same conditions. Ensuring data consistency is crucial for reliable model validation and the development of predictive kinetic models with low uncertainty. The present study focuses on the data consistency of NH3+H2 laminar burning velocities. To complement the existing literature datasets for consistency analysis, experiments were performed using the heat flux method at 298 K and 1 atm, and at various equivalence ratios, oxygen ratios, and H2 blending ratios (xH2). Based on simulations of six widely-used kinetic models from Han, Stagni, Konnov, Shrestha, KAUST, and NUIG, linear relationship was found between lnSL and xH2 across a broad range of conditions, with sensitivity analysis understanding the trend from a kinetic perspective. Based on this linear relationship, a new data consistency criterion was proposed. Through the new and the previously existing criteria, 12 consistent experimental datasets were identified from the 20 available datasets of NH3+H2+N2+O2 laminar burning velocities (already excluding those without stretch or heat loss corrections). The present consistency analysis noticeably reduced the data scatter ranges, e.g., for 60%NH3+40%H2+air laminar burning velocities at 298 K and 1 atm, it was reduced from 9 cm/s to 3 cm/s, the latter being comparable to the reported experimental uncertainties. In addition to the found consistent data sets, which were suggested for future model validation and optimization studies, the present methodology using all available data consistency criteria has potential to help other fuel systems to filter out less reliable data sets, effectively overcoming the data scatter from different measurements.","citation-key":"hannovel2026","container-title":"Combustion and Flame","DOI":"10.1016/j.combustflame.2026.114855","ISSN":"0010-2180","journalAbbreviation":"Combustion and Flame","page":"114855","source":"ScienceDirect","title":"A novel data consistency analysis for experimental laminar burning velocities of NH3-H2 mixtures","volume":"286","author":[{"family":"Han","given":"Xinlu"},{"family":"Wan","given":"Kaidi"},{"family":"Nagy","given":"Tibor"}],"issued":{"date-parts":[["2026",4,1]]}}}],"schema":"https://github.com/citation-style-language/schema/raw/master/csl-citation.json"} </w:instrText>
-      </w:r>
-      <w:r>
-        <w:fldChar w:fldCharType="separate"/>
-      </w:r>
-      <w:r>
-        <w:t>[10]</w:t>
-      </w:r>
-      <w:r>
-        <w:fldChar w:fldCharType="end"/>
-      </w:r>
-      <w:r>
-        <w:t>. These data sets were proven to be consistent with each other and widely used chemical kinetic mechanisms. Present Mech was validated for NH</w:t>
-      </w:r>
-      <w:r>
-        <w:rPr>
-          <w:vertAlign w:val="subscript"/>
-        </w:rPr>
-        <w:t>3</w:t>
-      </w:r>
-      <w:r>
-        <w:t>/CH</w:t>
-      </w:r>
-      <w:r>
-        <w:rPr>
-          <w:vertAlign w:val="subscript"/>
-        </w:rPr>
-        <w:t>4</w:t>
-      </w:r>
-      <w:r>
-        <w:t xml:space="preserve">/air flames also. Experimental data for </w:t>
-      </w:r>
-      <w:r>
-        <w:t>NH</w:t>
-      </w:r>
-      <w:r>
-        <w:rPr>
-          <w:vertAlign w:val="subscript"/>
-        </w:rPr>
-        <w:t>3</w:t>
-      </w:r>
-      <w:r>
-        <w:t>/CH</w:t>
-      </w:r>
-      <w:r>
-        <w:rPr>
-          <w:vertAlign w:val="subscript"/>
-        </w:rPr>
-        <w:t>4</w:t>
-      </w:r>
-      <w:r>
-        <w:t xml:space="preserve">/air </w:t>
+        <w:rPr>
+          <w:rFonts w:eastAsiaTheme="minorEastAsia"/>
+        </w:rPr>
+        <w:t xml:space="preserve"> under these conditions accurately</w:t>
+      </w:r>
+      <w:r>
+        <w:rPr>
+          <w:rFonts w:eastAsiaTheme="minorEastAsia"/>
+        </w:rPr>
+        <w:t>.</w:t>
+      </w:r>
+    </w:p>
+    <w:p>
+      <w:pPr>
+        <w:pStyle w:val="Maintext"/>
+        <w:spacing w:line="0" w:lineRule="atLeast"/>
+        <w:ind w:firstLine="360"/>
+        <w:rPr>
+          <w:rFonts w:eastAsiaTheme="minorEastAsia"/>
+        </w:rPr>
+      </w:pPr>
+    </w:p>
+    <w:p>
+      <w:pPr>
+        <w:pStyle w:val="section"/>
+      </w:pPr>
+      <w:r>
+        <w:t>Validation</w:t>
+      </w:r>
+    </w:p>
+    <w:p>
+      <w:pPr>
+        <w:pStyle w:val="Maintext"/>
+      </w:pPr>
+      <w:r>
+        <w:t xml:space="preserve">The Present Mech was validated with experimental data for </w:t>
       </w:r>
       <m:oMath>
         <m:sSub>
@@ -6959,77 +6754,82 @@
         </m:sSub>
       </m:oMath>
       <w:r>
-        <w:t xml:space="preserve"> was compiled from</w:t>
-      </w:r>
-      <w:r>
-        <w:t xml:space="preserve"> </w:t>
-      </w:r>
-      <w:r>
-        <w:t xml:space="preserve">three datasets: Okafor et al. (2019) </w:t>
+        <w:t xml:space="preserve"> of NH</w:t>
+      </w:r>
+      <w:r>
+        <w:rPr>
+          <w:vertAlign w:val="subscript"/>
+        </w:rPr>
+        <w:t>3</w:t>
+      </w:r>
+      <w:r>
+        <w:t>/H</w:t>
+      </w:r>
+      <w:r>
+        <w:rPr>
+          <w:vertAlign w:val="subscript"/>
+        </w:rPr>
+        <w:t>2</w:t>
+      </w:r>
+      <w:r>
+        <w:t xml:space="preserve">/air from the datasets consolidated by Han et al. </w:t>
       </w:r>
       <w:r>
         <w:fldChar w:fldCharType="begin"/>
       </w:r>
       <w:r>
-        <w:instrText xml:space="preserve"> ADDIN ZOTERO_ITEM CSL_CITATION {"citationID":"idJpMGCp","properties":{"unsorted":false,"formattedCitation":"[1]","plainCitation":"[1]","noteIndex":0},"citationItems":[{"id":196,"uris":["http://zotero.org/users/20740871/items/GI6AGGV5"],"itemData":{"id":196,"type":"article-journal","abstract":"Ammonia and blends of ammonia with methane are gaining increased interest as fuels for gas turbine applications and hence optimized reduced reaction mechanisms for the fuels are required for the development of combustors. However, there is a scarcity of measured data on the laminar burning velocity of the fuels for optimizing and validating reaction mechanisms especially at high pressures. In this study, an extensive set of measurements of the unstretched laminar burning velocity and Markstein lengths of CH4NH3-air flames at high pressures are reported for the first time and an optimized reduced reaction mechanism is proposed. The experiments were conducted in a constant volume chamber for various ammonia heat fractions in the fuel ranging from 0 to 0.30, equivalence ratios ranging from 0.7 to 1.3, and mixture pressures ranging from 0.10 to 0.50 MPa. The reduced reaction mechanism was developed from a detailed reaction mechanism for CH4NH3-air flames by Okafor et al., and optimized against the present measurements and data in the literature. It is shown that the reduced mechanism models the unstretched laminar burning velocity of NH3/air and CH4NH3-air flames with high fidelity at all studied conditions. It also models satisfactorily NH3, NO and CO concentration in CH4NH3O2N2 oxidation in a laminar flow reactor. Furthermore, the reduced mechanism is demonstrated to predict NO, OH, and NH profiles in a premixed stagnation NH3-air flame satisfactorily. The experimental measurements were also used to validate selected detailed reaction mechanisms. It was found that the significant over-prediction of NO production from NH3 oxidation by GRI Mech 3.0 is primarily due to the influence of the reaction NH+H2OHNO+H2, which in fact may not be important in fuel NO chemistry.","citation-key":"okaforMeasurement2019","container-title":"Combustion and Flame","DOI":"10.1016/j.combustflame.2019.03.008","ISSN":"0010-2180","journalAbbreviation":"Combustion and Flame","page":"162-175","source":"ScienceDirect","title":"Measurement and modelling of the laminar burning velocity of methane-ammonia-air flames at high pressures using a reduced reaction mechanism","volume":"204","author":[{"family":"Okafor","given":"Ekenechukwu Chijioke"},{"family":"Naito","given":"Yuji"},{"family":"Colson","given":"Sophie"},{"family":"Ichikawa","given":"Akinori"},{"family":"Kudo","given":"Taku"},{"family":"Hayakawa","given":"Akihiro"},{"family":"Kobayashi","given":"Hideaki"}],"issued":{"date-parts":[["2019",6,1]]}}}],"schema":"https://github.com/citation-style-language/schema/raw/master/csl-citation.json"} </w:instrText>
+        <w:instrText xml:space="preserve"> ADDIN ZOTERO_ITEM CSL_CITATION {"citationID":"g6iCrZkh","properties":{"unsorted":false,"formattedCitation":"[10]","plainCitation":"[10]","noteIndex":0},"citationItems":[{"id":720,"uris":["http://zotero.org/users/20740871/items/FXITQJ6I"],"itemData":{"id":720,"type":"article-journal","abstract":"Ammonia (NH3) is a promising carbon-free fuel, where the H2 enrichment strategy often adopted to enhance the combustion. One of the fundamental combustion properties, the laminar burning velocity (SL), has been extensively investigated in the literature. Many measurements providing laminar burning velocity data are available, but exhibited significant data scatter, i.e., inconsistency much beyond the reported uncertainties among different experimental results under the same conditions. Ensuring data consistency is crucial for reliable model validation and the development of predictive kinetic models with low uncertainty. The present study focuses on the data consistency of NH3+H2 laminar burning velocities. To complement the existing literature datasets for consistency analysis, experiments were performed using the heat flux method at 298 K and 1 atm, and at various equivalence ratios, oxygen ratios, and H2 blending ratios (xH2). Based on simulations of six widely-used kinetic models from Han, Stagni, Konnov, Shrestha, KAUST, and NUIG, linear relationship was found between lnSL and xH2 across a broad range of conditions, with sensitivity analysis understanding the trend from a kinetic perspective. Based on this linear relationship, a new data consistency criterion was proposed. Through the new and the previously existing criteria, 12 consistent experimental datasets were identified from the 20 available datasets of NH3+H2+N2+O2 laminar burning velocities (already excluding those without stretch or heat loss corrections). The present consistency analysis noticeably reduced the data scatter ranges, e.g., for 60%NH3+40%H2+air laminar burning velocities at 298 K and 1 atm, it was reduced from 9 cm/s to 3 cm/s, the latter being comparable to the reported experimental uncertainties. In addition to the found consistent data sets, which were suggested for future model validation and optimization studies, the present methodology using all available data consistency criteria has potential to help other fuel systems to filter out less reliable data sets, effectively overcoming the data scatter from different measurements.","citation-key":"hannovel2026","container-title":"Combustion and Flame","DOI":"10.1016/j.combustflame.2026.114855","ISSN":"0010-2180","journalAbbreviation":"Combustion and Flame","page":"114855","source":"ScienceDirect","title":"A novel data consistency analysis for experimental laminar burning velocities of NH3-H2 mixtures","volume":"286","author":[{"family":"Han","given":"Xinlu"},{"family":"Wan","given":"Kaidi"},{"family":"Nagy","given":"Tibor"}],"issued":{"date-parts":[["2026",4,1]]}}}],"schema":"https://github.com/citation-style-language/schema/raw/master/csl-citation.json"} </w:instrText>
       </w:r>
       <w:r>
         <w:fldChar w:fldCharType="separate"/>
       </w:r>
       <w:r>
-        <w:t>[1]</w:t>
+        <w:t>[10]</w:t>
       </w:r>
       <w:r>
         <w:fldChar w:fldCharType="end"/>
       </w:r>
       <w:r>
-        <w:t xml:space="preserve">, Han et al. (2019) </w:t>
-      </w:r>
-      <w:r>
-        <w:fldChar w:fldCharType="begin"/>
-      </w:r>
-      <w:r>
-        <w:instrText xml:space="preserve"> ADDIN ZOTERO_ITEM CSL_CITATION {"citationID":"hRHllHiM","properties":{"unsorted":false,"formattedCitation":"[11]","plainCitation":"[11]","noteIndex":0},"citationItems":[{"id":251,"uris":["http://zotero.org/users/20740871/items/F9C8WH9E"],"itemData":{"id":251,"type":"article-journal","abstract":"Ammonia (NH3) is a promising energy carrier to store and transport renewable hydrogen (H2) that can be generated using, e.g., wind and solar energy. Direct combustion of NH3 is one of the possible methods to utilize the energy by the end users. To understand the combustion characteristics of NH3 as a fuel, the laminar burning velocities of NH3/air, NH3/H2/air, NH3/CO/air and NH3/CH4/air premixed flames were investigated experimentally using the heat flux method. Measurements are reported for a wide range of equivalence ratios and blending ratios. Kinetic modeling was also performed using available chemical kinetic mechanisms, namely the GRI-Mech 3.0, the Okafor et al. and the San Diego mechanisms. The experimental results for NH3/air flames agree well with the literature data and it is found that blending NH3 with H2 is the most effective manner to increase the burning velocity of NH3 based fuel mixtures. None of the kinetic mechanisms used can accurately predict most of the measured data. Sensitivity and reaction path analyses indicate that the oxidation of NH3 blended with the additive fuels considered can be understood as the parallel oxidation processes of the individual fuels, and that the source of discrepancy between the experimental and modeling results is related to the inaccuracy of the rate parameters of the N-containing reactions. In this regard, the present detailed and reliable experimental data is of special value for model development and validation.","citation-key":"hanExperimentalKineticModeling2019","container-title":"Combustion and Flame","DOI":"10.1016/j.combustflame.2019.05.003","ISSN":"0010-2180","journalAbbreviation":"Combustion and Flame","page":"214-226","source":"ScienceDirect","title":"Experimental and kinetic modeling study of laminar burning velocities of NH3/air, NH3/H2/air, NH3/CO/air and NH3/CH4/air premixed flames","volume":"206","author":[{"family":"Han","given":"Xinlu"},{"family":"Wang","given":"Zhihua"},{"family":"Costa","given":"Mário"},{"family":"Sun","given":"Zhiwei"},{"family":"He","given":"Yong"},{"family":"Cen","given":"Kefa"}],"issued":{"date-parts":[["2019",8,1]]}}}],"schema":"https://github.com/citation-style-language/schema/raw/master/csl-citation.json"} </w:instrText>
-      </w:r>
-      <w:r>
-        <w:fldChar w:fldCharType="separate"/>
-      </w:r>
-      <w:r>
-        <w:t>[11]</w:t>
-      </w:r>
-      <w:r>
-        <w:fldChar w:fldCharType="end"/>
-      </w:r>
-      <w:r>
-        <w:t xml:space="preserve"> and Ling et al</w:t>
-      </w:r>
-      <w:r>
-        <w:t>.</w:t>
-      </w:r>
-      <w:r>
-        <w:t xml:space="preserve"> (2026) </w:t>
-      </w:r>
-      <w:r>
-        <w:fldChar w:fldCharType="begin"/>
-      </w:r>
-      <w:r>
-        <w:instrText xml:space="preserve"> ADDIN ZOTERO_ITEM CSL_CITATION {"citationID":"5apekVSt","properties":{"unsorted":false,"formattedCitation":"[12]","plainCitation":"[12]","noteIndex":0},"citationItems":[{"id":742,"uris":["http://zotero.org/users/20740871/items/77FZMWLF"],"itemData":{"id":742,"type":"article-journal","abstract":"Blending the carbon-free alternative fuel, NH3, into natural gas flames has potential to reduce the carbon emissions. The understanding of fundamental combustion properties is essential for in applications. In this study, the laminar burning velocity (SL) of the pre-dissociated ammonia + methane flame was measured by the heat flux method, under equivalent ratio ϕ = 0.6-1.5, oxygen concentration xO2 = 0.21-0.3 and ammonia dissociating ratio γ = 0-1, at 298 K and 1 atm. Most of the conditions have not been reported before in literature. Simulations were caried out using four models, where Han model shows the best agreement with the present experimental data. Reaction sensitivity analysis confirms a recent finding (DOI: 10.1016/j.proci.2024.105653) oxygen concentration and unburned mixture temperature Tu have the same effect on the SL of pre-dissociated NH3 + CH4 flame. Therefore, experimental data measured at 298 K under various oxygen conditions can be used to validate the kinetic model at elevated unburned temperatures, without requiring direct high-temperature measurements. Results show that SL increases linearly with oxygen content. and higher γ significantly amplify the promoting effect of NH3, particularly under lean and rich conditions. At Tu = 598 K, α slightly decreases with the increase of γ in lean conditions, while Ea shows non-monotonic variation. Radical analysis reveals that NH and NNH compete to consume H and OH at low γ, whereas enhanced dissociating continuously replenishes H radicals, weakening nitrogen hydrogen competition. At ϕ = 1, α remains nearly constant and Ea stabilizes when γ &gt; 0.4. Under rich conditions, both α and Ea show significant non-monotonic behavior due to γ redistributes flux between carbon chain and nitrogen radical pathways. Oxygen limitation reduces the sensitivity of H and OH, while CH3 decreases and NH, NNH increase. Nitrogen conversion follows: NH3→NH2→NH→N2O→N2, shifting from oxidation dominated NO formation under lean conditions to NCO mediated reduction mechanism under stoichiometric and rich conditions. With increasing γ, nitrogen transformation progressively favors the reduction pathway.","citation-key":"lingExperimental2026","container-title":"Journal of the Energy Institute","DOI":"10.1016/j.joei.2026.102503","ISSN":"1743-9671","journalAbbreviation":"Journal of the Energy Institute","page":"102503","source":"ScienceDirect","title":"Experimental and kinetic modeling study of the laminar burning velocity of pre-dissociated NH3 + CH4 flames","volume":"126","author":[{"family":"Ling","given":"Zhongqian"},{"family":"Lin","given":"Jiayi"},{"family":"Li","given":"Jiamin"},{"family":"Han","given":"Xinlu"},{"family":"Liu","given":"Maosheng"},{"family":"Yuan","given":"Dingkun"},{"family":"Wang","given":"Zhihua"}],"issued":{"date-parts":[["2026",6,1]]}}}],"schema":"https://github.com/citation-style-language/schema/raw/master/csl-citation.json"} </w:instrText>
-      </w:r>
-      <w:r>
-        <w:fldChar w:fldCharType="separate"/>
-      </w:r>
-      <w:r>
-        <w:t>[12]</w:t>
-      </w:r>
-      <w:r>
-        <w:fldChar w:fldCharType="end"/>
-      </w:r>
-      <w:r>
-        <w:t xml:space="preserve">. However, experimental datasets, for </w:t>
-      </w:r>
-      <w:r>
-        <w:lastRenderedPageBreak/>
-        <w:t xml:space="preserve">both fuel blends, lacked ample </w:t>
+        <w:t>. These data sets were proven to be consistent with each other and widely used chemical kinetic mechanisms. Present Mech was validated for NH</w:t>
+      </w:r>
+      <w:r>
+        <w:rPr>
+          <w:vertAlign w:val="subscript"/>
+        </w:rPr>
+        <w:t>3</w:t>
+      </w:r>
+      <w:r>
+        <w:t>/CH</w:t>
+      </w:r>
+      <w:r>
+        <w:rPr>
+          <w:vertAlign w:val="subscript"/>
+        </w:rPr>
+        <w:t>4</w:t>
+      </w:r>
+      <w:r>
+        <w:t xml:space="preserve">/air flames also. Experimental data for </w:t>
+      </w:r>
+      <w:r>
+        <w:t>NH</w:t>
+      </w:r>
+      <w:r>
+        <w:rPr>
+          <w:vertAlign w:val="subscript"/>
+        </w:rPr>
+        <w:t>3</w:t>
+      </w:r>
+      <w:r>
+        <w:t>/CH</w:t>
+      </w:r>
+      <w:r>
+        <w:rPr>
+          <w:vertAlign w:val="subscript"/>
+        </w:rPr>
+        <w:t>4</w:t>
+      </w:r>
+      <w:r>
+        <w:t xml:space="preserve">/air </w:t>
       </w:r>
       <m:oMath>
         <m:sSub>
@@ -7059,33 +6859,73 @@
         </m:sSub>
       </m:oMath>
       <w:r>
-        <w:t xml:space="preserve"> measurements at elevated pressures, making validation of Present Mech for high pressure combustion difficult.</w:t>
-      </w:r>
-    </w:p>
-    <w:p>
-      <w:pPr>
-        <w:pStyle w:val="Maintext"/>
-      </w:pPr>
-      <w:r>
-        <w:t>The results displayed accurate modelling of NH</w:t>
-      </w:r>
-      <w:r>
-        <w:rPr>
-          <w:vertAlign w:val="subscript"/>
-        </w:rPr>
-        <w:t>3</w:t>
-      </w:r>
-      <w:r>
-        <w:t>/H</w:t>
-      </w:r>
-      <w:r>
-        <w:rPr>
-          <w:vertAlign w:val="subscript"/>
-        </w:rPr>
-        <w:t>2</w:t>
-      </w:r>
-      <w:r>
-        <w:t xml:space="preserve">/air </w:t>
+        <w:t xml:space="preserve"> was compiled from</w:t>
+      </w:r>
+      <w:r>
+        <w:t xml:space="preserve"> </w:t>
+      </w:r>
+      <w:r>
+        <w:t xml:space="preserve">three datasets: Okafor et al. (2019) </w:t>
+      </w:r>
+      <w:r>
+        <w:fldChar w:fldCharType="begin"/>
+      </w:r>
+      <w:r>
+        <w:instrText xml:space="preserve"> ADDIN ZOTERO_ITEM CSL_CITATION {"citationID":"idJpMGCp","properties":{"unsorted":false,"formattedCitation":"[1]","plainCitation":"[1]","noteIndex":0},"citationItems":[{"id":196,"uris":["http://zotero.org/users/20740871/items/GI6AGGV5"],"itemData":{"id":196,"type":"article-journal","abstract":"Ammonia and blends of ammonia with methane are gaining increased interest as fuels for gas turbine applications and hence optimized reduced reaction mechanisms for the fuels are required for the development of combustors. However, there is a scarcity of measured data on the laminar burning velocity of the fuels for optimizing and validating reaction mechanisms especially at high pressures. In this study, an extensive set of measurements of the unstretched laminar burning velocity and Markstein lengths of CH4NH3-air flames at high pressures are reported for the first time and an optimized reduced reaction mechanism is proposed. The experiments were conducted in a constant volume chamber for various ammonia heat fractions in the fuel ranging from 0 to 0.30, equivalence ratios ranging from 0.7 to 1.3, and mixture pressures ranging from 0.10 to 0.50 MPa. The reduced reaction mechanism was developed from a detailed reaction mechanism for CH4NH3-air flames by Okafor et al., and optimized against the present measurements and data in the literature. It is shown that the reduced mechanism models the unstretched laminar burning velocity of NH3/air and CH4NH3-air flames with high fidelity at all studied conditions. It also models satisfactorily NH3, NO and CO concentration in CH4NH3O2N2 oxidation in a laminar flow reactor. Furthermore, the reduced mechanism is demonstrated to predict NO, OH, and NH profiles in a premixed stagnation NH3-air flame satisfactorily. The experimental measurements were also used to validate selected detailed reaction mechanisms. It was found that the significant over-prediction of NO production from NH3 oxidation by GRI Mech 3.0 is primarily due to the influence of the reaction NH+H2OHNO+H2, which in fact may not be important in fuel NO chemistry.","citation-key":"okaforMeasurement2019","container-title":"Combustion and Flame","DOI":"10.1016/j.combustflame.2019.03.008","ISSN":"0010-2180","journalAbbreviation":"Combustion and Flame","page":"162-175","source":"ScienceDirect","title":"Measurement and modelling of the laminar burning velocity of methane-ammonia-air flames at high pressures using a reduced reaction mechanism","volume":"204","author":[{"family":"Okafor","given":"Ekenechukwu Chijioke"},{"family":"Naito","given":"Yuji"},{"family":"Colson","given":"Sophie"},{"family":"Ichikawa","given":"Akinori"},{"family":"Kudo","given":"Taku"},{"family":"Hayakawa","given":"Akihiro"},{"family":"Kobayashi","given":"Hideaki"}],"issued":{"date-parts":[["2019",6,1]]}}}],"schema":"https://github.com/citation-style-language/schema/raw/master/csl-citation.json"} </w:instrText>
+      </w:r>
+      <w:r>
+        <w:fldChar w:fldCharType="separate"/>
+      </w:r>
+      <w:r>
+        <w:t>[1]</w:t>
+      </w:r>
+      <w:r>
+        <w:fldChar w:fldCharType="end"/>
+      </w:r>
+      <w:r>
+        <w:t xml:space="preserve">, Han et al. (2019) </w:t>
+      </w:r>
+      <w:r>
+        <w:fldChar w:fldCharType="begin"/>
+      </w:r>
+      <w:r>
+        <w:instrText xml:space="preserve"> ADDIN ZOTERO_ITEM CSL_CITATION {"citationID":"hRHllHiM","properties":{"unsorted":false,"formattedCitation":"[11]","plainCitation":"[11]","noteIndex":0},"citationItems":[{"id":251,"uris":["http://zotero.org/users/20740871/items/F9C8WH9E"],"itemData":{"id":251,"type":"article-journal","abstract":"Ammonia (NH3) is a promising energy carrier to store and transport renewable hydrogen (H2) that can be generated using, e.g., wind and solar energy. Direct combustion of NH3 is one of the possible methods to utilize the energy by the end users. To understand the combustion characteristics of NH3 as a fuel, the laminar burning velocities of NH3/air, NH3/H2/air, NH3/CO/air and NH3/CH4/air premixed flames were investigated experimentally using the heat flux method. Measurements are reported for a wide range of equivalence ratios and blending ratios. Kinetic modeling was also performed using available chemical kinetic mechanisms, namely the GRI-Mech 3.0, the Okafor et al. and the San Diego mechanisms. The experimental results for NH3/air flames agree well with the literature data and it is found that blending NH3 with H2 is the most effective manner to increase the burning velocity of NH3 based fuel mixtures. None of the kinetic mechanisms used can accurately predict most of the measured data. Sensitivity and reaction path analyses indicate that the oxidation of NH3 blended with the additive fuels considered can be understood as the parallel oxidation processes of the individual fuels, and that the source of discrepancy between the experimental and modeling results is related to the inaccuracy of the rate parameters of the N-containing reactions. In this regard, the present detailed and reliable experimental data is of special value for model development and validation.","citation-key":"hanExperimentalKineticModeling2019","container-title":"Combustion and Flame","DOI":"10.1016/j.combustflame.2019.05.003","ISSN":"0010-2180","journalAbbreviation":"Combustion and Flame","page":"214-226","source":"ScienceDirect","title":"Experimental and kinetic modeling study of laminar burning velocities of NH3/air, NH3/H2/air, NH3/CO/air and NH3/CH4/air premixed flames","volume":"206","author":[{"family":"Han","given":"Xinlu"},{"family":"Wang","given":"Zhihua"},{"family":"Costa","given":"Mário"},{"family":"Sun","given":"Zhiwei"},{"family":"He","given":"Yong"},{"family":"Cen","given":"Kefa"}],"issued":{"date-parts":[["2019",8,1]]}}}],"schema":"https://github.com/citation-style-language/schema/raw/master/csl-citation.json"} </w:instrText>
+      </w:r>
+      <w:r>
+        <w:fldChar w:fldCharType="separate"/>
+      </w:r>
+      <w:r>
+        <w:t>[11]</w:t>
+      </w:r>
+      <w:r>
+        <w:fldChar w:fldCharType="end"/>
+      </w:r>
+      <w:r>
+        <w:t xml:space="preserve"> and Ling et al</w:t>
+      </w:r>
+      <w:r>
+        <w:t>.</w:t>
+      </w:r>
+      <w:r>
+        <w:t xml:space="preserve"> (2026) </w:t>
+      </w:r>
+      <w:r>
+        <w:fldChar w:fldCharType="begin"/>
+      </w:r>
+      <w:r>
+        <w:instrText xml:space="preserve"> ADDIN ZOTERO_ITEM CSL_CITATION {"citationID":"5apekVSt","properties":{"unsorted":false,"formattedCitation":"[12]","plainCitation":"[12]","noteIndex":0},"citationItems":[{"id":742,"uris":["http://zotero.org/users/20740871/items/77FZMWLF"],"itemData":{"id":742,"type":"article-journal","abstract":"Blending the carbon-free alternative fuel, NH3, into natural gas flames has potential to reduce the carbon emissions. The understanding of fundamental combustion properties is essential for in applications. In this study, the laminar burning velocity (SL) of the pre-dissociated ammonia + methane flame was measured by the heat flux method, under equivalent ratio ϕ = 0.6-1.5, oxygen concentration xO2 = 0.21-0.3 and ammonia dissociating ratio γ = 0-1, at 298 K and 1 atm. Most of the conditions have not been reported before in literature. Simulations were caried out using four models, where Han model shows the best agreement with the present experimental data. Reaction sensitivity analysis confirms a recent finding (DOI: 10.1016/j.proci.2024.105653) oxygen concentration and unburned mixture temperature Tu have the same effect on the SL of pre-dissociated NH3 + CH4 flame. Therefore, experimental data measured at 298 K under various oxygen conditions can be used to validate the kinetic model at elevated unburned temperatures, without requiring direct high-temperature measurements. Results show that SL increases linearly with oxygen content. and higher γ significantly amplify the promoting effect of NH3, particularly under lean and rich conditions. At Tu = 598 K, α slightly decreases with the increase of γ in lean conditions, while Ea shows non-monotonic variation. Radical analysis reveals that NH and NNH compete to consume H and OH at low γ, whereas enhanced dissociating continuously replenishes H radicals, weakening nitrogen hydrogen competition. At ϕ = 1, α remains nearly constant and Ea stabilizes when γ &gt; 0.4. Under rich conditions, both α and Ea show significant non-monotonic behavior due to γ redistributes flux between carbon chain and nitrogen radical pathways. Oxygen limitation reduces the sensitivity of H and OH, while CH3 decreases and NH, NNH increase. Nitrogen conversion follows: NH3→NH2→NH→N2O→N2, shifting from oxidation dominated NO formation under lean conditions to NCO mediated reduction mechanism under stoichiometric and rich conditions. With increasing γ, nitrogen transformation progressively favors the reduction pathway.","citation-key":"lingExperimental2026","container-title":"Journal of the Energy Institute","DOI":"10.1016/j.joei.2026.102503","ISSN":"1743-9671","journalAbbreviation":"Journal of the Energy Institute","page":"102503","source":"ScienceDirect","title":"Experimental and kinetic modeling study of the laminar burning velocity of pre-dissociated NH3 + CH4 flames","volume":"126","author":[{"family":"Ling","given":"Zhongqian"},{"family":"Lin","given":"Jiayi"},{"family":"Li","given":"Jiamin"},{"family":"Han","given":"Xinlu"},{"family":"Liu","given":"Maosheng"},{"family":"Yuan","given":"Dingkun"},{"family":"Wang","given":"Zhihua"}],"issued":{"date-parts":[["2026",6,1]]}}}],"schema":"https://github.com/citation-style-language/schema/raw/master/csl-citation.json"} </w:instrText>
+      </w:r>
+      <w:r>
+        <w:fldChar w:fldCharType="separate"/>
+      </w:r>
+      <w:r>
+        <w:t>[12]</w:t>
+      </w:r>
+      <w:r>
+        <w:fldChar w:fldCharType="end"/>
+      </w:r>
+      <w:r>
+        <w:t xml:space="preserve">. However, experimental datasets, for both fuel blends, lacked ample </w:t>
       </w:r>
       <m:oMath>
         <m:sSub>
@@ -7115,7 +6955,710 @@
         </m:sSub>
       </m:oMath>
       <w:r>
-        <w:t xml:space="preserve"> at all the equivalence ratios tested for all hydrogen </w:t>
+        <w:t xml:space="preserve"> measurements at elevated pressures, making validation of Present Mech for high pressure combustion difficult.</w:t>
+      </w:r>
+    </w:p>
+    <w:p>
+      <w:pPr>
+        <w:pStyle w:val="Maintext"/>
+      </w:pPr>
+      <w:r>
+        <w:t>Figure 3</w:t>
+      </w:r>
+      <w:r>
+        <w:t xml:space="preserve"> compar</w:t>
+      </w:r>
+      <w:r>
+        <w:t xml:space="preserve">es </w:t>
+      </w:r>
+      <w:r>
+        <w:t>NH</w:t>
+      </w:r>
+      <w:r>
+        <w:rPr>
+          <w:vertAlign w:val="subscript"/>
+        </w:rPr>
+        <w:t>3</w:t>
+      </w:r>
+      <w:r>
+        <w:t>/CH</w:t>
+      </w:r>
+      <w:r>
+        <w:rPr>
+          <w:vertAlign w:val="subscript"/>
+        </w:rPr>
+        <w:t>4</w:t>
+      </w:r>
+      <w:r>
+        <w:t>/air predictions</w:t>
+      </w:r>
+      <w:r>
+        <w:t xml:space="preserve"> by the Present Mech</w:t>
+      </w:r>
+      <w:r>
+        <w:t xml:space="preserve"> to </w:t>
+      </w:r>
+      <w:r>
+        <w:t xml:space="preserve">experimentally </w:t>
+      </w:r>
+      <w:r>
+        <w:t xml:space="preserve">measured </w:t>
+      </w:r>
+      <m:oMath>
+        <m:sSub>
+          <m:sSubPr>
+            <m:ctrlPr>
+              <w:rPr>
+                <w:rFonts w:ascii="Cambria Math" w:hAnsi="Cambria Math"/>
+                <w:i/>
+              </w:rPr>
+            </m:ctrlPr>
+          </m:sSubPr>
+          <m:e>
+            <m:r>
+              <w:rPr>
+                <w:rFonts w:ascii="Cambria Math" w:hAnsi="Cambria Math"/>
+              </w:rPr>
+              <m:t>S</m:t>
+            </m:r>
+          </m:e>
+          <m:sub>
+            <m:r>
+              <w:rPr>
+                <w:rFonts w:ascii="Cambria Math" w:hAnsi="Cambria Math"/>
+              </w:rPr>
+              <m:t>L</m:t>
+            </m:r>
+          </m:sub>
+        </m:sSub>
+      </m:oMath>
+      <w:r>
+        <w:t xml:space="preserve"> from literature</w:t>
+      </w:r>
+      <w:r>
+        <w:t xml:space="preserve"> at stoichiometric equivalence ratio and </w:t>
+      </w:r>
+      <w:r>
+        <w:lastRenderedPageBreak/>
+        <w:t>atmospheric pressure</w:t>
+      </w:r>
+      <w:r>
+        <w:t xml:space="preserve"> to</w:t>
+      </w:r>
+      <w:r>
+        <w:t xml:space="preserve"> depict</w:t>
+      </w:r>
+      <w:r>
+        <w:t xml:space="preserve"> that</w:t>
+      </w:r>
+      <w:r>
+        <w:t xml:space="preserve"> </w:t>
+      </w:r>
+      <w:r>
+        <w:t xml:space="preserve">the </w:t>
+      </w:r>
+      <m:oMath>
+        <m:sSub>
+          <m:sSubPr>
+            <m:ctrlPr>
+              <w:rPr>
+                <w:rFonts w:ascii="Cambria Math" w:hAnsi="Cambria Math"/>
+              </w:rPr>
+            </m:ctrlPr>
+          </m:sSubPr>
+          <m:e>
+            <m:r>
+              <w:rPr>
+                <w:rFonts w:ascii="Cambria Math" w:hAnsi="Cambria Math"/>
+              </w:rPr>
+              <m:t>S</m:t>
+            </m:r>
+          </m:e>
+          <m:sub>
+            <m:r>
+              <w:rPr>
+                <w:rFonts w:ascii="Cambria Math" w:hAnsi="Cambria Math"/>
+              </w:rPr>
+              <m:t>L</m:t>
+            </m:r>
+          </m:sub>
+        </m:sSub>
+      </m:oMath>
+      <w:r>
+        <w:t xml:space="preserve"> predictions are satisfactory. The model </w:t>
+      </w:r>
+      <w:r>
+        <w:t xml:space="preserve">also was able to validate </w:t>
+      </w:r>
+      <m:oMath>
+        <m:sSub>
+          <m:sSubPr>
+            <m:ctrlPr>
+              <w:rPr>
+                <w:rFonts w:ascii="Cambria Math" w:hAnsi="Cambria Math"/>
+              </w:rPr>
+            </m:ctrlPr>
+          </m:sSubPr>
+          <m:e>
+            <m:r>
+              <w:rPr>
+                <w:rFonts w:ascii="Cambria Math" w:hAnsi="Cambria Math"/>
+              </w:rPr>
+              <m:t>S</m:t>
+            </m:r>
+          </m:e>
+          <m:sub>
+            <m:r>
+              <w:rPr>
+                <w:rFonts w:ascii="Cambria Math" w:hAnsi="Cambria Math"/>
+              </w:rPr>
+              <m:t>L</m:t>
+            </m:r>
+          </m:sub>
+        </m:sSub>
+      </m:oMath>
+      <w:r>
+        <w:t xml:space="preserve"> predictions </w:t>
+      </w:r>
+      <w:r>
+        <w:t>with</w:t>
+      </w:r>
+      <w:r>
+        <w:t xml:space="preserve"> Okafor et al. (2019)</w:t>
+      </w:r>
+      <w:r>
+        <w:t>’s</w:t>
+      </w:r>
+      <w:r>
+        <w:t xml:space="preserve"> </w:t>
+      </w:r>
+      <w:r>
+        <w:fldChar w:fldCharType="begin"/>
+      </w:r>
+      <w:r>
+        <w:instrText xml:space="preserve"> ADDIN ZOTERO_ITEM CSL_CITATION {"citationID":"RaXOGHsk","properties":{"unsorted":false,"formattedCitation":"[1]","plainCitation":"[1]","noteIndex":0},"citationItems":[{"id":196,"uris":["http://zotero.org/users/20740871/items/GI6AGGV5"],"itemData":{"id":196,"type":"article-journal","abstract":"Ammonia and blends of ammonia with methane are gaining increased interest as fuels for gas turbine applications and hence optimized reduced reaction mechanisms for the fuels are required for the development of combustors. However, there is a scarcity of measured data on the laminar burning velocity of the fuels for optimizing and validating reaction mechanisms especially at high pressures. In this study, an extensive set of measurements of the unstretched laminar burning velocity and Markstein lengths of CH4NH3-air flames at high pressures are reported for the first time and an optimized reduced reaction mechanism is proposed. The experiments were conducted in a constant volume chamber for various ammonia heat fractions in the fuel ranging from 0 to 0.30, equivalence ratios ranging from 0.7 to 1.3, and mixture pressures ranging from 0.10 to 0.50 MPa. The reduced reaction mechanism was developed from a detailed reaction mechanism for CH4NH3-air flames by Okafor et al., and optimized against the present measurements and data in the literature. It is shown that the reduced mechanism models the unstretched laminar burning velocity of NH3/air and CH4NH3-air flames with high fidelity at all studied conditions. It also models satisfactorily NH3, NO and CO concentration in CH4NH3O2N2 oxidation in a laminar flow reactor. Furthermore, the reduced mechanism is demonstrated to predict NO, OH, and NH profiles in a premixed stagnation NH3-air flame satisfactorily. The experimental measurements were also used to validate selected detailed reaction mechanisms. It was found that the significant over-prediction of NO production from NH3 oxidation by GRI Mech 3.0 is primarily due to the influence of the reaction NH+H2OHNO+H2, which in fact may not be important in fuel NO chemistry.","citation-key":"okaforMeasurement2019","container-title":"Combustion and Flame","DOI":"10.1016/j.combustflame.2019.03.008","ISSN":"0010-2180","journalAbbreviation":"Combustion and Flame","page":"162-175","source":"ScienceDirect","title":"Measurement and modelling of the laminar burning velocity of methane-ammonia-air flames at high pressures using a reduced reaction mechanism","volume":"204","author":[{"family":"Okafor","given":"Ekenechukwu Chijioke"},{"family":"Naito","given":"Yuji"},{"family":"Colson","given":"Sophie"},{"family":"Ichikawa","given":"Akinori"},{"family":"Kudo","given":"Taku"},{"family":"Hayakawa","given":"Akihiro"},{"family":"Kobayashi","given":"Hideaki"}],"issued":{"date-parts":[["2019",6,1]]}}}],"schema":"https://github.com/citation-style-language/schema/raw/master/csl-citation.json"} </w:instrText>
+      </w:r>
+      <w:r>
+        <w:fldChar w:fldCharType="separate"/>
+      </w:r>
+      <w:r>
+        <w:t>[1]</w:t>
+      </w:r>
+      <w:r>
+        <w:fldChar w:fldCharType="end"/>
+      </w:r>
+      <w:r>
+        <w:t xml:space="preserve"> </w:t>
+      </w:r>
+      <w:r>
+        <w:t xml:space="preserve">datasets for </w:t>
+      </w:r>
+      <w:r>
+        <w:t>elevated pressures and different equivalence ratios. This implies that the underlying Okafor Reduced Mech optimizations for NH</w:t>
+      </w:r>
+      <w:r>
+        <w:rPr>
+          <w:vertAlign w:val="subscript"/>
+        </w:rPr>
+        <w:t>3</w:t>
+      </w:r>
+      <w:r>
+        <w:t>/CH</w:t>
+      </w:r>
+      <w:r>
+        <w:rPr>
+          <w:vertAlign w:val="subscript"/>
+        </w:rPr>
+        <w:t>4</w:t>
+      </w:r>
+      <w:r>
+        <w:t xml:space="preserve">/air flame chemistry in </w:t>
+      </w:r>
+      <w:r>
+        <w:t xml:space="preserve">Present Mech </w:t>
+      </w:r>
+      <w:r>
+        <w:t>remain</w:t>
+      </w:r>
+      <w:r>
+        <w:t>ed</w:t>
+      </w:r>
+      <w:r>
+        <w:t xml:space="preserve"> unaffected.</w:t>
+      </w:r>
+      <w:r>
+        <w:rPr>
+          <w:rFonts w:eastAsiaTheme="minorEastAsia"/>
+          <w:noProof/>
+          <w:kern w:val="0"/>
+          <w:sz w:val="24"/>
+          <w:szCs w:val="24"/>
+          <w:lang w:val="en-GB"/>
+        </w:rPr>
+        <mc:AlternateContent>
+          <mc:Choice Requires="wps">
+            <w:drawing>
+              <wp:anchor distT="0" distB="0" distL="114300" distR="114300" simplePos="0" relativeHeight="251667456" behindDoc="0" locked="1" layoutInCell="1" allowOverlap="1" wp14:anchorId="0A6FC5EE" wp14:editId="7D08F899">
+                <wp:simplePos x="0" y="0"/>
+                <wp:positionH relativeFrom="page">
+                  <wp:posOffset>720090</wp:posOffset>
+                </wp:positionH>
+                <wp:positionV relativeFrom="page">
+                  <wp:posOffset>6226175</wp:posOffset>
+                </wp:positionV>
+                <wp:extent cx="3049270" cy="2624455"/>
+                <wp:effectExtent l="0" t="0" r="0" b="4445"/>
+                <wp:wrapTopAndBottom/>
+                <wp:docPr id="2031747829" name="Text Box 9"/>
+                <wp:cNvGraphicFramePr>
+                  <a:graphicFrameLocks xmlns:a="http://schemas.openxmlformats.org/drawingml/2006/main"/>
+                </wp:cNvGraphicFramePr>
+                <a:graphic xmlns:a="http://schemas.openxmlformats.org/drawingml/2006/main">
+                  <a:graphicData uri="http://schemas.microsoft.com/office/word/2010/wordprocessingShape">
+                    <wps:wsp>
+                      <wps:cNvSpPr txBox="1">
+                        <a:spLocks noChangeArrowheads="1"/>
+                      </wps:cNvSpPr>
+                      <wps:spPr bwMode="auto">
+                        <a:xfrm>
+                          <a:off x="0" y="0"/>
+                          <a:ext cx="3049270" cy="2624455"/>
+                        </a:xfrm>
+                        <a:prstGeom prst="rect">
+                          <a:avLst/>
+                        </a:prstGeom>
+                        <a:solidFill>
+                          <a:srgbClr val="FFFFFF"/>
+                        </a:solidFill>
+                        <a:ln w="9525">
+                          <a:noFill/>
+                          <a:miter lim="800000"/>
+                          <a:headEnd/>
+                          <a:tailEnd/>
+                        </a:ln>
+                      </wps:spPr>
+                      <wps:txbx>
+                        <w:txbxContent>
+                          <w:p>
+                            <w:pPr>
+                              <w:jc w:val="center"/>
+                            </w:pPr>
+                            <w:r>
+                              <w:rPr>
+                                <w:rFonts w:asciiTheme="minorHAnsi" w:eastAsiaTheme="minorEastAsia" w:hAnsiTheme="minorHAnsi" w:cstheme="minorBidi"/>
+                                <w:noProof/>
+                                <w:kern w:val="0"/>
+                                <w:lang w:val="en-GB"/>
+                              </w:rPr>
+                              <w:drawing>
+                                <wp:inline distT="0" distB="0" distL="0" distR="0" wp14:anchorId="2E2208D0" wp14:editId="76BCDF1E">
+                                  <wp:extent cx="2875591" cy="1725354"/>
+                                  <wp:effectExtent l="0" t="0" r="1270" b="8255"/>
+                                  <wp:docPr id="1983131052" name="Picture 8"/>
+                                  <wp:cNvGraphicFramePr>
+                                    <a:graphicFrameLocks xmlns:a="http://schemas.openxmlformats.org/drawingml/2006/main" noChangeAspect="1"/>
+                                  </wp:cNvGraphicFramePr>
+                                  <a:graphic xmlns:a="http://schemas.openxmlformats.org/drawingml/2006/main">
+                                    <a:graphicData uri="http://schemas.openxmlformats.org/drawingml/2006/picture">
+                                      <pic:pic xmlns:pic="http://schemas.openxmlformats.org/drawingml/2006/picture">
+                                        <pic:nvPicPr>
+                                          <pic:cNvPr id="1983131052" name="Picture 8"/>
+                                          <pic:cNvPicPr>
+                                            <a:picLocks noChangeAspect="1" noChangeArrowheads="1"/>
+                                          </pic:cNvPicPr>
+                                        </pic:nvPicPr>
+                                        <pic:blipFill>
+                                          <a:blip r:embed="rId11">
+                                            <a:extLst>
+                                              <a:ext uri="{28A0092B-C50C-407E-A947-70E740481C1C}">
+                                                <a14:useLocalDpi xmlns:a14="http://schemas.microsoft.com/office/drawing/2010/main" val="0"/>
+                                              </a:ext>
+                                            </a:extLst>
+                                          </a:blip>
+                                          <a:stretch>
+                                            <a:fillRect/>
+                                          </a:stretch>
+                                        </pic:blipFill>
+                                        <pic:spPr bwMode="auto">
+                                          <a:xfrm>
+                                            <a:off x="0" y="0"/>
+                                            <a:ext cx="2875591" cy="1725354"/>
+                                          </a:xfrm>
+                                          <a:prstGeom prst="rect">
+                                            <a:avLst/>
+                                          </a:prstGeom>
+                                          <a:noFill/>
+                                          <a:ln>
+                                            <a:noFill/>
+                                          </a:ln>
+                                        </pic:spPr>
+                                      </pic:pic>
+                                    </a:graphicData>
+                                  </a:graphic>
+                                </wp:inline>
+                              </w:drawing>
+                            </w:r>
+                          </w:p>
+                          <w:p>
+                            <w:pPr>
+                              <w:pStyle w:val="TableFigurecaption"/>
+                              <w:spacing w:beforeLines="100" w:before="240"/>
+                              <w:rPr>
+                                <w:rFonts w:eastAsia="ＭＳ 明朝"/>
+                              </w:rPr>
+                            </w:pPr>
+                            <w:r>
+                              <w:rPr>
+                                <w:rFonts w:eastAsia="ＭＳ 明朝"/>
+                              </w:rPr>
+                              <w:t>Fig. </w:t>
+                            </w:r>
+                            <w:r>
+                              <w:rPr>
+                                <w:rFonts w:eastAsia="ＭＳ 明朝"/>
+                              </w:rPr>
+                              <w:t>5</w:t>
+                            </w:r>
+                            <w:r>
+                              <w:rPr>
+                                <w:rFonts w:eastAsia="ＭＳ 明朝"/>
+                              </w:rPr>
+                              <w:t xml:space="preserve"> </w:t>
+                            </w:r>
+                            <w:r>
+                              <w:rPr>
+                                <w:rFonts w:eastAsia="ＭＳ 明朝"/>
+                              </w:rPr>
+                              <w:t xml:space="preserve">Experimental and numerical laminar burning velocity of NH3/H2/air flames under </w:t>
+                            </w:r>
+                            <w:r>
+                              <w:rPr>
+                                <w:rFonts w:eastAsia="ＭＳ 明朝"/>
+                              </w:rPr>
+                              <w:t>lean</w:t>
+                            </w:r>
+                            <w:r>
+                              <w:rPr>
+                                <w:rFonts w:eastAsia="ＭＳ 明朝"/>
+                              </w:rPr>
+                              <w:t xml:space="preserve"> condition</w:t>
+                            </w:r>
+                            <w:r>
+                              <w:rPr>
+                                <w:rFonts w:eastAsia="ＭＳ 明朝"/>
+                              </w:rPr>
+                              <w:t xml:space="preserve"> (</w:t>
+                            </w:r>
+                            <m:oMath>
+                              <m:r>
+                                <w:rPr>
+                                  <w:rFonts w:ascii="Cambria Math" w:eastAsia="ＭＳ 明朝" w:hAnsi="Cambria Math"/>
+                                </w:rPr>
+                                <m:t>ϕ</m:t>
+                              </m:r>
+                              <m:r>
+                                <w:rPr>
+                                  <w:rFonts w:ascii="Cambria Math" w:eastAsia="ＭＳ 明朝" w:hAnsi="Cambria Math"/>
+                                </w:rPr>
+                                <m:t>=</m:t>
+                              </m:r>
+                              <m:r>
+                                <w:rPr>
+                                  <w:rFonts w:ascii="Cambria Math" w:eastAsia="ＭＳ 明朝" w:hAnsi="Cambria Math"/>
+                                </w:rPr>
+                                <m:t>1.4</m:t>
+                              </m:r>
+                              <m:r>
+                                <w:rPr>
+                                  <w:rFonts w:ascii="Cambria Math" w:eastAsia="ＭＳ 明朝" w:hAnsi="Cambria Math"/>
+                                </w:rPr>
+                                <m:t>)</m:t>
+                              </m:r>
+                            </m:oMath>
+                            <w:r>
+                              <w:rPr>
+                                <w:rFonts w:eastAsia="ＭＳ 明朝"/>
+                              </w:rPr>
+                              <w:t xml:space="preserve"> and 1 atm of pressure</w:t>
+                            </w:r>
+                            <w:r>
+                              <w:rPr>
+                                <w:rFonts w:eastAsia="ＭＳ 明朝"/>
+                              </w:rPr>
+                              <w:t xml:space="preserve"> at various hydrogen concentrations.</w:t>
+                            </w:r>
+                          </w:p>
+                          <w:p>
+                            <w:pPr>
+                              <w:pStyle w:val="TableFigurecaption"/>
+                              <w:spacing w:beforeLines="100" w:before="240" w:afterLines="0" w:after="0"/>
+                              <w:rPr>
+                                <w:rFonts w:eastAsia="ＭＳ 明朝"/>
+                              </w:rPr>
+                            </w:pPr>
+                          </w:p>
+                        </w:txbxContent>
+                      </wps:txbx>
+                      <wps:bodyPr rot="0" vertOverflow="clip" horzOverflow="clip" vert="horz" wrap="square" lIns="91440" tIns="45720" rIns="91440" bIns="45720" anchor="t" anchorCtr="0">
+                        <a:noAutofit/>
+                      </wps:bodyPr>
+                    </wps:wsp>
+                  </a:graphicData>
+                </a:graphic>
+                <wp14:sizeRelH relativeFrom="margin">
+                  <wp14:pctWidth>0</wp14:pctWidth>
+                </wp14:sizeRelH>
+                <wp14:sizeRelV relativeFrom="margin">
+                  <wp14:pctHeight>0</wp14:pctHeight>
+                </wp14:sizeRelV>
+              </wp:anchor>
+            </w:drawing>
+          </mc:Choice>
+          <mc:Fallback>
+            <w:pict>
+              <v:shape w14:anchorId="0A6FC5EE" id="Text Box 9" o:spid="_x0000_s1028" type="#_x0000_t202" style="position:absolute;left:0;text-align:left;margin-left:56.7pt;margin-top:490.25pt;width:240.1pt;height:206.65pt;z-index:251667456;visibility:visible;mso-wrap-style:square;mso-width-percent:0;mso-height-percent:0;mso-wrap-distance-left:9pt;mso-wrap-distance-top:0;mso-wrap-distance-right:9pt;mso-wrap-distance-bottom:0;mso-position-horizontal:absolute;mso-position-horizontal-relative:page;mso-position-vertical:absolute;mso-position-vertical-relative:page;mso-width-percent:0;mso-height-percent:0;mso-width-relative:margin;mso-height-relative:margin;v-text-anchor:top" o:gfxdata="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" stroked="f">
+                <v:textbox>
+                  <w:txbxContent>
+                    <w:p>
+                      <w:pPr>
+                        <w:jc w:val="center"/>
+                      </w:pPr>
+                      <w:r>
+                        <w:rPr>
+                          <w:rFonts w:asciiTheme="minorHAnsi" w:eastAsiaTheme="minorEastAsia" w:hAnsiTheme="minorHAnsi" w:cstheme="minorBidi"/>
+                          <w:noProof/>
+                          <w:kern w:val="0"/>
+                          <w:lang w:val="en-GB"/>
+                        </w:rPr>
+                        <w:drawing>
+                          <wp:inline distT="0" distB="0" distL="0" distR="0" wp14:anchorId="2E2208D0" wp14:editId="76BCDF1E">
+                            <wp:extent cx="2875591" cy="1725354"/>
+                            <wp:effectExtent l="0" t="0" r="1270" b="8255"/>
+                            <wp:docPr id="1983131052" name="Picture 8"/>
+                            <wp:cNvGraphicFramePr>
+                              <a:graphicFrameLocks xmlns:a="http://schemas.openxmlformats.org/drawingml/2006/main" noChangeAspect="1"/>
+                            </wp:cNvGraphicFramePr>
+                            <a:graphic xmlns:a="http://schemas.openxmlformats.org/drawingml/2006/main">
+                              <a:graphicData uri="http://schemas.openxmlformats.org/drawingml/2006/picture">
+                                <pic:pic xmlns:pic="http://schemas.openxmlformats.org/drawingml/2006/picture">
+                                  <pic:nvPicPr>
+                                    <pic:cNvPr id="1983131052" name="Picture 8"/>
+                                    <pic:cNvPicPr>
+                                      <a:picLocks noChangeAspect="1" noChangeArrowheads="1"/>
+                                    </pic:cNvPicPr>
+                                  </pic:nvPicPr>
+                                  <pic:blipFill>
+                                    <a:blip r:embed="rId11">
+                                      <a:extLst>
+                                        <a:ext uri="{28A0092B-C50C-407E-A947-70E740481C1C}">
+                                          <a14:useLocalDpi xmlns:a14="http://schemas.microsoft.com/office/drawing/2010/main" val="0"/>
+                                        </a:ext>
+                                      </a:extLst>
+                                    </a:blip>
+                                    <a:stretch>
+                                      <a:fillRect/>
+                                    </a:stretch>
+                                  </pic:blipFill>
+                                  <pic:spPr bwMode="auto">
+                                    <a:xfrm>
+                                      <a:off x="0" y="0"/>
+                                      <a:ext cx="2875591" cy="1725354"/>
+                                    </a:xfrm>
+                                    <a:prstGeom prst="rect">
+                                      <a:avLst/>
+                                    </a:prstGeom>
+                                    <a:noFill/>
+                                    <a:ln>
+                                      <a:noFill/>
+                                    </a:ln>
+                                  </pic:spPr>
+                                </pic:pic>
+                              </a:graphicData>
+                            </a:graphic>
+                          </wp:inline>
+                        </w:drawing>
+                      </w:r>
+                    </w:p>
+                    <w:p>
+                      <w:pPr>
+                        <w:pStyle w:val="TableFigurecaption"/>
+                        <w:spacing w:beforeLines="100" w:before="240"/>
+                        <w:rPr>
+                          <w:rFonts w:eastAsia="ＭＳ 明朝"/>
+                        </w:rPr>
+                      </w:pPr>
+                      <w:r>
+                        <w:rPr>
+                          <w:rFonts w:eastAsia="ＭＳ 明朝"/>
+                        </w:rPr>
+                        <w:t>Fig. </w:t>
+                      </w:r>
+                      <w:r>
+                        <w:rPr>
+                          <w:rFonts w:eastAsia="ＭＳ 明朝"/>
+                        </w:rPr>
+                        <w:t>5</w:t>
+                      </w:r>
+                      <w:r>
+                        <w:rPr>
+                          <w:rFonts w:eastAsia="ＭＳ 明朝"/>
+                        </w:rPr>
+                        <w:t xml:space="preserve"> </w:t>
+                      </w:r>
+                      <w:r>
+                        <w:rPr>
+                          <w:rFonts w:eastAsia="ＭＳ 明朝"/>
+                        </w:rPr>
+                        <w:t xml:space="preserve">Experimental and numerical laminar burning velocity of NH3/H2/air flames under </w:t>
+                      </w:r>
+                      <w:r>
+                        <w:rPr>
+                          <w:rFonts w:eastAsia="ＭＳ 明朝"/>
+                        </w:rPr>
+                        <w:t>lean</w:t>
+                      </w:r>
+                      <w:r>
+                        <w:rPr>
+                          <w:rFonts w:eastAsia="ＭＳ 明朝"/>
+                        </w:rPr>
+                        <w:t xml:space="preserve"> condition</w:t>
+                      </w:r>
+                      <w:r>
+                        <w:rPr>
+                          <w:rFonts w:eastAsia="ＭＳ 明朝"/>
+                        </w:rPr>
+                        <w:t xml:space="preserve"> (</w:t>
+                      </w:r>
+                      <m:oMath>
+                        <m:r>
+                          <w:rPr>
+                            <w:rFonts w:ascii="Cambria Math" w:eastAsia="ＭＳ 明朝" w:hAnsi="Cambria Math"/>
+                          </w:rPr>
+                          <m:t>ϕ</m:t>
+                        </m:r>
+                        <m:r>
+                          <w:rPr>
+                            <w:rFonts w:ascii="Cambria Math" w:eastAsia="ＭＳ 明朝" w:hAnsi="Cambria Math"/>
+                          </w:rPr>
+                          <m:t>=</m:t>
+                        </m:r>
+                        <m:r>
+                          <w:rPr>
+                            <w:rFonts w:ascii="Cambria Math" w:eastAsia="ＭＳ 明朝" w:hAnsi="Cambria Math"/>
+                          </w:rPr>
+                          <m:t>1.4</m:t>
+                        </m:r>
+                        <m:r>
+                          <w:rPr>
+                            <w:rFonts w:ascii="Cambria Math" w:eastAsia="ＭＳ 明朝" w:hAnsi="Cambria Math"/>
+                          </w:rPr>
+                          <m:t>)</m:t>
+                        </m:r>
+                      </m:oMath>
+                      <w:r>
+                        <w:rPr>
+                          <w:rFonts w:eastAsia="ＭＳ 明朝"/>
+                        </w:rPr>
+                        <w:t xml:space="preserve"> and 1 atm of pressure</w:t>
+                      </w:r>
+                      <w:r>
+                        <w:rPr>
+                          <w:rFonts w:eastAsia="ＭＳ 明朝"/>
+                        </w:rPr>
+                        <w:t xml:space="preserve"> at various hydrogen concentrations.</w:t>
+                      </w:r>
+                    </w:p>
+                    <w:p>
+                      <w:pPr>
+                        <w:pStyle w:val="TableFigurecaption"/>
+                        <w:spacing w:beforeLines="100" w:before="240" w:afterLines="0" w:after="0"/>
+                        <w:rPr>
+                          <w:rFonts w:eastAsia="ＭＳ 明朝"/>
+                        </w:rPr>
+                      </w:pPr>
+                    </w:p>
+                  </w:txbxContent>
+                </v:textbox>
+                <w10:wrap type="topAndBottom" anchorx="page" anchory="page"/>
+                <w10:anchorlock/>
+              </v:shape>
+            </w:pict>
+          </mc:Fallback>
+        </mc:AlternateContent>
+      </w:r>
+      <w:r>
+        <w:t xml:space="preserve"> </w:t>
+      </w:r>
+    </w:p>
+    <w:p>
+      <w:pPr>
+        <w:pStyle w:val="Maintext"/>
+      </w:pPr>
+      <w:r>
+        <w:t>Figure 4 and 5</w:t>
+      </w:r>
+      <w:r>
+        <w:t xml:space="preserve"> displayed accurate modelling of NH</w:t>
+      </w:r>
+      <w:r>
+        <w:rPr>
+          <w:vertAlign w:val="subscript"/>
+        </w:rPr>
+        <w:t>3</w:t>
+      </w:r>
+      <w:r>
+        <w:t>/H</w:t>
+      </w:r>
+      <w:r>
+        <w:rPr>
+          <w:vertAlign w:val="subscript"/>
+        </w:rPr>
+        <w:t>2</w:t>
+      </w:r>
+      <w:r>
+        <w:t xml:space="preserve">/air </w:t>
+      </w:r>
+      <m:oMath>
+        <m:sSub>
+          <m:sSubPr>
+            <m:ctrlPr>
+              <w:rPr>
+                <w:rFonts w:ascii="Cambria Math" w:hAnsi="Cambria Math"/>
+              </w:rPr>
+            </m:ctrlPr>
+          </m:sSubPr>
+          <m:e>
+            <m:r>
+              <w:rPr>
+                <w:rFonts w:ascii="Cambria Math" w:hAnsi="Cambria Math"/>
+              </w:rPr>
+              <m:t>S</m:t>
+            </m:r>
+          </m:e>
+          <m:sub>
+            <m:r>
+              <w:rPr>
+                <w:rFonts w:ascii="Cambria Math" w:hAnsi="Cambria Math"/>
+              </w:rPr>
+              <m:t>L</m:t>
+            </m:r>
+          </m:sub>
+        </m:sSub>
+      </m:oMath>
+      <w:r>
+        <w:t xml:space="preserve"> at </w:t>
+      </w:r>
+      <w:r>
+        <w:t>lean and rich</w:t>
+      </w:r>
+      <w:r>
+        <w:t xml:space="preserve"> equivalence ratios </w:t>
+      </w:r>
+      <w:r>
+        <w:t xml:space="preserve">respectively </w:t>
+      </w:r>
+      <w:r>
+        <w:t xml:space="preserve">tested for all hydrogen </w:t>
       </w:r>
       <w:r>
         <w:t>concentration</w:t>
@@ -7124,7 +7667,809 @@
         <w:t xml:space="preserve">s at </w:t>
       </w:r>
       <w:r>
-        <w:t>atmospheric pressure. At 3 atm of pressure, intermediate H2 concentration (</w:t>
+        <w:t xml:space="preserve">atmospheric pressure. </w:t>
+      </w:r>
+      <w:r>
+        <w:t>Moreover, a</w:t>
+      </w:r>
+      <w:r>
+        <w:t xml:space="preserve">t 3 </w:t>
+      </w:r>
+      <w:r>
+        <w:rPr>
+          <w:rFonts w:eastAsiaTheme="minorEastAsia"/>
+          <w:noProof/>
+          <w:kern w:val="0"/>
+          <w:sz w:val="24"/>
+          <w:szCs w:val="24"/>
+          <w:lang w:val="en-GB"/>
+        </w:rPr>
+        <mc:AlternateContent>
+          <mc:Choice Requires="wps">
+            <w:drawing>
+              <wp:anchor distT="0" distB="0" distL="114300" distR="114300" simplePos="0" relativeHeight="251665408" behindDoc="0" locked="1" layoutInCell="1" allowOverlap="1" wp14:anchorId="32E81171" wp14:editId="3AA0A12E">
+                <wp:simplePos x="0" y="0"/>
+                <wp:positionH relativeFrom="page">
+                  <wp:posOffset>716915</wp:posOffset>
+                </wp:positionH>
+                <wp:positionV relativeFrom="page">
+                  <wp:posOffset>3453130</wp:posOffset>
+                </wp:positionV>
+                <wp:extent cx="3049270" cy="2624455"/>
+                <wp:effectExtent l="0" t="0" r="0" b="4445"/>
+                <wp:wrapTopAndBottom/>
+                <wp:docPr id="1824329621" name="Text Box 9"/>
+                <wp:cNvGraphicFramePr>
+                  <a:graphicFrameLocks xmlns:a="http://schemas.openxmlformats.org/drawingml/2006/main"/>
+                </wp:cNvGraphicFramePr>
+                <a:graphic xmlns:a="http://schemas.openxmlformats.org/drawingml/2006/main">
+                  <a:graphicData uri="http://schemas.microsoft.com/office/word/2010/wordprocessingShape">
+                    <wps:wsp>
+                      <wps:cNvSpPr txBox="1">
+                        <a:spLocks noChangeArrowheads="1"/>
+                      </wps:cNvSpPr>
+                      <wps:spPr bwMode="auto">
+                        <a:xfrm>
+                          <a:off x="0" y="0"/>
+                          <a:ext cx="3049270" cy="2624455"/>
+                        </a:xfrm>
+                        <a:prstGeom prst="rect">
+                          <a:avLst/>
+                        </a:prstGeom>
+                        <a:solidFill>
+                          <a:srgbClr val="FFFFFF"/>
+                        </a:solidFill>
+                        <a:ln w="9525">
+                          <a:noFill/>
+                          <a:miter lim="800000"/>
+                          <a:headEnd/>
+                          <a:tailEnd/>
+                        </a:ln>
+                      </wps:spPr>
+                      <wps:txbx>
+                        <w:txbxContent>
+                          <w:p>
+                            <w:pPr>
+                              <w:jc w:val="center"/>
+                            </w:pPr>
+                            <w:r>
+                              <w:rPr>
+                                <w:rFonts w:asciiTheme="minorHAnsi" w:eastAsiaTheme="minorEastAsia" w:hAnsiTheme="minorHAnsi" w:cstheme="minorBidi"/>
+                                <w:noProof/>
+                                <w:kern w:val="0"/>
+                                <w:lang w:val="en-GB"/>
+                              </w:rPr>
+                              <w:drawing>
+                                <wp:inline distT="0" distB="0" distL="0" distR="0" wp14:anchorId="0BF1E81B" wp14:editId="50235F79">
+                                  <wp:extent cx="2875591" cy="1725354"/>
+                                  <wp:effectExtent l="0" t="0" r="1270" b="8255"/>
+                                  <wp:docPr id="104796288" name="Picture 8"/>
+                                  <wp:cNvGraphicFramePr>
+                                    <a:graphicFrameLocks xmlns:a="http://schemas.openxmlformats.org/drawingml/2006/main" noChangeAspect="1"/>
+                                  </wp:cNvGraphicFramePr>
+                                  <a:graphic xmlns:a="http://schemas.openxmlformats.org/drawingml/2006/main">
+                                    <a:graphicData uri="http://schemas.openxmlformats.org/drawingml/2006/picture">
+                                      <pic:pic xmlns:pic="http://schemas.openxmlformats.org/drawingml/2006/picture">
+                                        <pic:nvPicPr>
+                                          <pic:cNvPr id="104796288" name="Picture 8"/>
+                                          <pic:cNvPicPr>
+                                            <a:picLocks noChangeAspect="1" noChangeArrowheads="1"/>
+                                          </pic:cNvPicPr>
+                                        </pic:nvPicPr>
+                                        <pic:blipFill>
+                                          <a:blip r:embed="rId12">
+                                            <a:extLst>
+                                              <a:ext uri="{28A0092B-C50C-407E-A947-70E740481C1C}">
+                                                <a14:useLocalDpi xmlns:a14="http://schemas.microsoft.com/office/drawing/2010/main" val="0"/>
+                                              </a:ext>
+                                            </a:extLst>
+                                          </a:blip>
+                                          <a:stretch>
+                                            <a:fillRect/>
+                                          </a:stretch>
+                                        </pic:blipFill>
+                                        <pic:spPr bwMode="auto">
+                                          <a:xfrm>
+                                            <a:off x="0" y="0"/>
+                                            <a:ext cx="2875591" cy="1725354"/>
+                                          </a:xfrm>
+                                          <a:prstGeom prst="rect">
+                                            <a:avLst/>
+                                          </a:prstGeom>
+                                          <a:noFill/>
+                                          <a:ln>
+                                            <a:noFill/>
+                                          </a:ln>
+                                        </pic:spPr>
+                                      </pic:pic>
+                                    </a:graphicData>
+                                  </a:graphic>
+                                </wp:inline>
+                              </w:drawing>
+                            </w:r>
+                          </w:p>
+                          <w:p>
+                            <w:pPr>
+                              <w:pStyle w:val="TableFigurecaption"/>
+                              <w:spacing w:beforeLines="100" w:before="240"/>
+                              <w:rPr>
+                                <w:rFonts w:eastAsia="ＭＳ 明朝"/>
+                              </w:rPr>
+                            </w:pPr>
+                            <w:r>
+                              <w:rPr>
+                                <w:rFonts w:eastAsia="ＭＳ 明朝"/>
+                              </w:rPr>
+                              <w:t>Fig. </w:t>
+                            </w:r>
+                            <w:r>
+                              <w:rPr>
+                                <w:rFonts w:eastAsia="ＭＳ 明朝"/>
+                              </w:rPr>
+                              <w:t>4</w:t>
+                            </w:r>
+                            <w:r>
+                              <w:rPr>
+                                <w:rFonts w:eastAsia="ＭＳ 明朝"/>
+                              </w:rPr>
+                              <w:t xml:space="preserve"> </w:t>
+                            </w:r>
+                            <w:r>
+                              <w:rPr>
+                                <w:rFonts w:eastAsia="ＭＳ 明朝"/>
+                              </w:rPr>
+                              <w:t xml:space="preserve">Experimental and numerical laminar burning velocity of NH3/H2/air flames under </w:t>
+                            </w:r>
+                            <w:r>
+                              <w:rPr>
+                                <w:rFonts w:eastAsia="ＭＳ 明朝"/>
+                              </w:rPr>
+                              <w:t>lean</w:t>
+                            </w:r>
+                            <w:r>
+                              <w:rPr>
+                                <w:rFonts w:eastAsia="ＭＳ 明朝"/>
+                              </w:rPr>
+                              <w:t xml:space="preserve"> condition</w:t>
+                            </w:r>
+                            <w:r>
+                              <w:rPr>
+                                <w:rFonts w:eastAsia="ＭＳ 明朝"/>
+                              </w:rPr>
+                              <w:t xml:space="preserve"> (</w:t>
+                            </w:r>
+                            <m:oMath>
+                              <m:r>
+                                <w:rPr>
+                                  <w:rFonts w:ascii="Cambria Math" w:eastAsia="ＭＳ 明朝" w:hAnsi="Cambria Math"/>
+                                </w:rPr>
+                                <m:t>ϕ</m:t>
+                              </m:r>
+                              <m:r>
+                                <w:rPr>
+                                  <w:rFonts w:ascii="Cambria Math" w:eastAsia="ＭＳ 明朝" w:hAnsi="Cambria Math"/>
+                                </w:rPr>
+                                <m:t>=0.7)</m:t>
+                              </m:r>
+                            </m:oMath>
+                            <w:r>
+                              <w:rPr>
+                                <w:rFonts w:eastAsia="ＭＳ 明朝"/>
+                              </w:rPr>
+                              <w:t xml:space="preserve"> and 1 atm of pressure</w:t>
+                            </w:r>
+                            <w:r>
+                              <w:rPr>
+                                <w:rFonts w:eastAsia="ＭＳ 明朝"/>
+                              </w:rPr>
+                              <w:t xml:space="preserve"> at various hydrogen concentrations.</w:t>
+                            </w:r>
+                          </w:p>
+                          <w:p>
+                            <w:pPr>
+                              <w:pStyle w:val="TableFigurecaption"/>
+                              <w:spacing w:beforeLines="100" w:before="240" w:afterLines="0" w:after="0"/>
+                              <w:rPr>
+                                <w:rFonts w:eastAsia="ＭＳ 明朝"/>
+                              </w:rPr>
+                            </w:pPr>
+                          </w:p>
+                        </w:txbxContent>
+                      </wps:txbx>
+                      <wps:bodyPr rot="0" vertOverflow="clip" horzOverflow="clip" vert="horz" wrap="square" lIns="91440" tIns="45720" rIns="91440" bIns="45720" anchor="t" anchorCtr="0">
+                        <a:noAutofit/>
+                      </wps:bodyPr>
+                    </wps:wsp>
+                  </a:graphicData>
+                </a:graphic>
+                <wp14:sizeRelH relativeFrom="margin">
+                  <wp14:pctWidth>0</wp14:pctWidth>
+                </wp14:sizeRelH>
+                <wp14:sizeRelV relativeFrom="margin">
+                  <wp14:pctHeight>0</wp14:pctHeight>
+                </wp14:sizeRelV>
+              </wp:anchor>
+            </w:drawing>
+          </mc:Choice>
+          <mc:Fallback>
+            <w:pict>
+              <v:shape w14:anchorId="32E81171" id="_x0000_s1029" type="#_x0000_t202" style="position:absolute;left:0;text-align:left;margin-left:56.45pt;margin-top:271.9pt;width:240.1pt;height:206.65pt;z-index:251665408;visibility:visible;mso-wrap-style:square;mso-width-percent:0;mso-height-percent:0;mso-wrap-distance-left:9pt;mso-wrap-distance-top:0;mso-wrap-distance-right:9pt;mso-wrap-distance-bottom:0;mso-position-horizontal:absolute;mso-position-horizontal-relative:page;mso-position-vertical:absolute;mso-position-vertical-relative:page;mso-width-percent:0;mso-height-percent:0;mso-width-relative:margin;mso-height-relative:margin;v-text-anchor:top" o:gfxdata="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" stroked="f">
+                <v:textbox>
+                  <w:txbxContent>
+                    <w:p>
+                      <w:pPr>
+                        <w:jc w:val="center"/>
+                      </w:pPr>
+                      <w:r>
+                        <w:rPr>
+                          <w:rFonts w:asciiTheme="minorHAnsi" w:eastAsiaTheme="minorEastAsia" w:hAnsiTheme="minorHAnsi" w:cstheme="minorBidi"/>
+                          <w:noProof/>
+                          <w:kern w:val="0"/>
+                          <w:lang w:val="en-GB"/>
+                        </w:rPr>
+                        <w:drawing>
+                          <wp:inline distT="0" distB="0" distL="0" distR="0" wp14:anchorId="0BF1E81B" wp14:editId="50235F79">
+                            <wp:extent cx="2875591" cy="1725354"/>
+                            <wp:effectExtent l="0" t="0" r="1270" b="8255"/>
+                            <wp:docPr id="104796288" name="Picture 8"/>
+                            <wp:cNvGraphicFramePr>
+                              <a:graphicFrameLocks xmlns:a="http://schemas.openxmlformats.org/drawingml/2006/main" noChangeAspect="1"/>
+                            </wp:cNvGraphicFramePr>
+                            <a:graphic xmlns:a="http://schemas.openxmlformats.org/drawingml/2006/main">
+                              <a:graphicData uri="http://schemas.openxmlformats.org/drawingml/2006/picture">
+                                <pic:pic xmlns:pic="http://schemas.openxmlformats.org/drawingml/2006/picture">
+                                  <pic:nvPicPr>
+                                    <pic:cNvPr id="104796288" name="Picture 8"/>
+                                    <pic:cNvPicPr>
+                                      <a:picLocks noChangeAspect="1" noChangeArrowheads="1"/>
+                                    </pic:cNvPicPr>
+                                  </pic:nvPicPr>
+                                  <pic:blipFill>
+                                    <a:blip r:embed="rId12">
+                                      <a:extLst>
+                                        <a:ext uri="{28A0092B-C50C-407E-A947-70E740481C1C}">
+                                          <a14:useLocalDpi xmlns:a14="http://schemas.microsoft.com/office/drawing/2010/main" val="0"/>
+                                        </a:ext>
+                                      </a:extLst>
+                                    </a:blip>
+                                    <a:stretch>
+                                      <a:fillRect/>
+                                    </a:stretch>
+                                  </pic:blipFill>
+                                  <pic:spPr bwMode="auto">
+                                    <a:xfrm>
+                                      <a:off x="0" y="0"/>
+                                      <a:ext cx="2875591" cy="1725354"/>
+                                    </a:xfrm>
+                                    <a:prstGeom prst="rect">
+                                      <a:avLst/>
+                                    </a:prstGeom>
+                                    <a:noFill/>
+                                    <a:ln>
+                                      <a:noFill/>
+                                    </a:ln>
+                                  </pic:spPr>
+                                </pic:pic>
+                              </a:graphicData>
+                            </a:graphic>
+                          </wp:inline>
+                        </w:drawing>
+                      </w:r>
+                    </w:p>
+                    <w:p>
+                      <w:pPr>
+                        <w:pStyle w:val="TableFigurecaption"/>
+                        <w:spacing w:beforeLines="100" w:before="240"/>
+                        <w:rPr>
+                          <w:rFonts w:eastAsia="ＭＳ 明朝"/>
+                        </w:rPr>
+                      </w:pPr>
+                      <w:r>
+                        <w:rPr>
+                          <w:rFonts w:eastAsia="ＭＳ 明朝"/>
+                        </w:rPr>
+                        <w:t>Fig. </w:t>
+                      </w:r>
+                      <w:r>
+                        <w:rPr>
+                          <w:rFonts w:eastAsia="ＭＳ 明朝"/>
+                        </w:rPr>
+                        <w:t>4</w:t>
+                      </w:r>
+                      <w:r>
+                        <w:rPr>
+                          <w:rFonts w:eastAsia="ＭＳ 明朝"/>
+                        </w:rPr>
+                        <w:t xml:space="preserve"> </w:t>
+                      </w:r>
+                      <w:r>
+                        <w:rPr>
+                          <w:rFonts w:eastAsia="ＭＳ 明朝"/>
+                        </w:rPr>
+                        <w:t xml:space="preserve">Experimental and numerical laminar burning velocity of NH3/H2/air flames under </w:t>
+                      </w:r>
+                      <w:r>
+                        <w:rPr>
+                          <w:rFonts w:eastAsia="ＭＳ 明朝"/>
+                        </w:rPr>
+                        <w:t>lean</w:t>
+                      </w:r>
+                      <w:r>
+                        <w:rPr>
+                          <w:rFonts w:eastAsia="ＭＳ 明朝"/>
+                        </w:rPr>
+                        <w:t xml:space="preserve"> condition</w:t>
+                      </w:r>
+                      <w:r>
+                        <w:rPr>
+                          <w:rFonts w:eastAsia="ＭＳ 明朝"/>
+                        </w:rPr>
+                        <w:t xml:space="preserve"> (</w:t>
+                      </w:r>
+                      <m:oMath>
+                        <m:r>
+                          <w:rPr>
+                            <w:rFonts w:ascii="Cambria Math" w:eastAsia="ＭＳ 明朝" w:hAnsi="Cambria Math"/>
+                          </w:rPr>
+                          <m:t>ϕ</m:t>
+                        </m:r>
+                        <m:r>
+                          <w:rPr>
+                            <w:rFonts w:ascii="Cambria Math" w:eastAsia="ＭＳ 明朝" w:hAnsi="Cambria Math"/>
+                          </w:rPr>
+                          <m:t>=0.7)</m:t>
+                        </m:r>
+                      </m:oMath>
+                      <w:r>
+                        <w:rPr>
+                          <w:rFonts w:eastAsia="ＭＳ 明朝"/>
+                        </w:rPr>
+                        <w:t xml:space="preserve"> and 1 atm of pressure</w:t>
+                      </w:r>
+                      <w:r>
+                        <w:rPr>
+                          <w:rFonts w:eastAsia="ＭＳ 明朝"/>
+                        </w:rPr>
+                        <w:t xml:space="preserve"> at various hydrogen concentrations.</w:t>
+                      </w:r>
+                    </w:p>
+                    <w:p>
+                      <w:pPr>
+                        <w:pStyle w:val="TableFigurecaption"/>
+                        <w:spacing w:beforeLines="100" w:before="240" w:afterLines="0" w:after="0"/>
+                        <w:rPr>
+                          <w:rFonts w:eastAsia="ＭＳ 明朝"/>
+                        </w:rPr>
+                      </w:pPr>
+                    </w:p>
+                  </w:txbxContent>
+                </v:textbox>
+                <w10:wrap type="topAndBottom" anchorx="page" anchory="page"/>
+                <w10:anchorlock/>
+              </v:shape>
+            </w:pict>
+          </mc:Fallback>
+        </mc:AlternateContent>
+      </w:r>
+      <w:r>
+        <w:rPr>
+          <w:rFonts w:eastAsiaTheme="minorEastAsia"/>
+          <w:noProof/>
+          <w:kern w:val="0"/>
+          <w:sz w:val="24"/>
+          <w:szCs w:val="24"/>
+          <w:lang w:val="en-GB"/>
+        </w:rPr>
+        <mc:AlternateContent>
+          <mc:Choice Requires="wps">
+            <w:drawing>
+              <wp:anchor distT="0" distB="0" distL="114300" distR="114300" simplePos="0" relativeHeight="251663360" behindDoc="0" locked="1" layoutInCell="1" allowOverlap="1" wp14:anchorId="1B1AD8E6" wp14:editId="4B212E60">
+                <wp:simplePos x="0" y="0"/>
+                <wp:positionH relativeFrom="page">
+                  <wp:posOffset>716915</wp:posOffset>
+                </wp:positionH>
+                <wp:positionV relativeFrom="page">
+                  <wp:posOffset>901065</wp:posOffset>
+                </wp:positionV>
+                <wp:extent cx="3049270" cy="2677160"/>
+                <wp:effectExtent l="0" t="0" r="0" b="8890"/>
+                <wp:wrapTopAndBottom/>
+                <wp:docPr id="1785345321" name="Text Box 5"/>
+                <wp:cNvGraphicFramePr>
+                  <a:graphicFrameLocks xmlns:a="http://schemas.openxmlformats.org/drawingml/2006/main"/>
+                </wp:cNvGraphicFramePr>
+                <a:graphic xmlns:a="http://schemas.openxmlformats.org/drawingml/2006/main">
+                  <a:graphicData uri="http://schemas.microsoft.com/office/word/2010/wordprocessingShape">
+                    <wps:wsp>
+                      <wps:cNvSpPr txBox="1">
+                        <a:spLocks noChangeArrowheads="1"/>
+                      </wps:cNvSpPr>
+                      <wps:spPr bwMode="auto">
+                        <a:xfrm>
+                          <a:off x="0" y="0"/>
+                          <a:ext cx="3049270" cy="2677160"/>
+                        </a:xfrm>
+                        <a:prstGeom prst="rect">
+                          <a:avLst/>
+                        </a:prstGeom>
+                        <a:solidFill>
+                          <a:srgbClr val="FFFFFF"/>
+                        </a:solidFill>
+                        <a:ln w="9525">
+                          <a:noFill/>
+                          <a:miter lim="800000"/>
+                          <a:headEnd/>
+                          <a:tailEnd/>
+                        </a:ln>
+                      </wps:spPr>
+                      <wps:txbx>
+                        <w:txbxContent>
+                          <w:p>
+                            <w:pPr>
+                              <w:jc w:val="center"/>
+                            </w:pPr>
+                            <w:r>
+                              <w:rPr>
+                                <w:rFonts w:asciiTheme="minorHAnsi" w:eastAsiaTheme="minorEastAsia" w:hAnsiTheme="minorHAnsi" w:cstheme="minorBidi"/>
+                                <w:noProof/>
+                                <w:kern w:val="0"/>
+                                <w:lang w:val="en-GB"/>
+                              </w:rPr>
+                              <w:drawing>
+                                <wp:inline distT="0" distB="0" distL="0" distR="0" wp14:anchorId="6FFFB802" wp14:editId="2D9569EA">
+                                  <wp:extent cx="2876826" cy="1726095"/>
+                                  <wp:effectExtent l="0" t="0" r="0" b="7620"/>
+                                  <wp:docPr id="1708147523" name="Picture 4"/>
+                                  <wp:cNvGraphicFramePr>
+                                    <a:graphicFrameLocks xmlns:a="http://schemas.openxmlformats.org/drawingml/2006/main" noChangeAspect="1"/>
+                                  </wp:cNvGraphicFramePr>
+                                  <a:graphic xmlns:a="http://schemas.openxmlformats.org/drawingml/2006/main">
+                                    <a:graphicData uri="http://schemas.openxmlformats.org/drawingml/2006/picture">
+                                      <pic:pic xmlns:pic="http://schemas.openxmlformats.org/drawingml/2006/picture">
+                                        <pic:nvPicPr>
+                                          <pic:cNvPr id="1708147523" name="Picture 4"/>
+                                          <pic:cNvPicPr>
+                                            <a:picLocks noChangeAspect="1" noChangeArrowheads="1"/>
+                                          </pic:cNvPicPr>
+                                        </pic:nvPicPr>
+                                        <pic:blipFill>
+                                          <a:blip r:embed="rId13">
+                                            <a:extLst>
+                                              <a:ext uri="{28A0092B-C50C-407E-A947-70E740481C1C}">
+                                                <a14:useLocalDpi xmlns:a14="http://schemas.microsoft.com/office/drawing/2010/main" val="0"/>
+                                              </a:ext>
+                                            </a:extLst>
+                                          </a:blip>
+                                          <a:stretch>
+                                            <a:fillRect/>
+                                          </a:stretch>
+                                        </pic:blipFill>
+                                        <pic:spPr bwMode="auto">
+                                          <a:xfrm>
+                                            <a:off x="0" y="0"/>
+                                            <a:ext cx="2876826" cy="1726095"/>
+                                          </a:xfrm>
+                                          <a:prstGeom prst="rect">
+                                            <a:avLst/>
+                                          </a:prstGeom>
+                                          <a:noFill/>
+                                          <a:ln>
+                                            <a:noFill/>
+                                          </a:ln>
+                                        </pic:spPr>
+                                      </pic:pic>
+                                    </a:graphicData>
+                                  </a:graphic>
+                                </wp:inline>
+                              </w:drawing>
+                            </w:r>
+                          </w:p>
+                          <w:p>
+                            <w:pPr>
+                              <w:pStyle w:val="TableFigurecaption"/>
+                              <w:spacing w:beforeLines="100" w:before="240"/>
+                              <w:rPr>
+                                <w:rFonts w:eastAsia="ＭＳ 明朝"/>
+                              </w:rPr>
+                            </w:pPr>
+                            <w:r>
+                              <w:rPr>
+                                <w:rFonts w:eastAsia="ＭＳ 明朝"/>
+                              </w:rPr>
+                              <w:t>Fig. </w:t>
+                            </w:r>
+                            <w:r>
+                              <w:rPr>
+                                <w:rFonts w:eastAsia="ＭＳ 明朝"/>
+                              </w:rPr>
+                              <w:t>3</w:t>
+                            </w:r>
+                            <w:r>
+                              <w:rPr>
+                                <w:rFonts w:eastAsia="ＭＳ 明朝"/>
+                              </w:rPr>
+                              <w:t xml:space="preserve"> </w:t>
+                            </w:r>
+                            <w:r>
+                              <w:rPr>
+                                <w:rFonts w:eastAsia="ＭＳ 明朝"/>
+                              </w:rPr>
+                              <w:t>Experimental and numerical laminar burning velocity of NH3/</w:t>
+                            </w:r>
+                            <w:r>
+                              <w:rPr>
+                                <w:rFonts w:eastAsia="ＭＳ 明朝"/>
+                              </w:rPr>
+                              <w:t>C</w:t>
+                            </w:r>
+                            <w:r>
+                              <w:rPr>
+                                <w:rFonts w:eastAsia="ＭＳ 明朝"/>
+                              </w:rPr>
+                              <w:t>H</w:t>
+                            </w:r>
+                            <w:r>
+                              <w:rPr>
+                                <w:rFonts w:eastAsia="ＭＳ 明朝"/>
+                              </w:rPr>
+                              <w:t>4</w:t>
+                            </w:r>
+                            <w:r>
+                              <w:rPr>
+                                <w:rFonts w:eastAsia="ＭＳ 明朝"/>
+                              </w:rPr>
+                              <w:t>/air flames under stoichiometric condition</w:t>
+                            </w:r>
+                            <w:r>
+                              <w:rPr>
+                                <w:rFonts w:eastAsia="ＭＳ 明朝"/>
+                              </w:rPr>
+                              <w:t xml:space="preserve"> and 1 atm of pressure</w:t>
+                            </w:r>
+                            <w:r>
+                              <w:rPr>
+                                <w:rFonts w:eastAsia="ＭＳ 明朝"/>
+                              </w:rPr>
+                              <w:t xml:space="preserve"> at various</w:t>
+                            </w:r>
+                            <w:r>
+                              <w:rPr>
+                                <w:rFonts w:eastAsia="ＭＳ 明朝"/>
+                              </w:rPr>
+                              <w:t xml:space="preserve"> </w:t>
+                            </w:r>
+                            <w:r>
+                              <w:rPr>
+                                <w:rFonts w:eastAsia="ＭＳ 明朝"/>
+                              </w:rPr>
+                              <w:t>ammonia</w:t>
+                            </w:r>
+                            <w:r>
+                              <w:rPr>
+                                <w:rFonts w:eastAsia="ＭＳ 明朝"/>
+                              </w:rPr>
+                              <w:t xml:space="preserve"> concentrations</w:t>
+                            </w:r>
+                            <w:r>
+                              <w:rPr>
+                                <w:rFonts w:eastAsia="ＭＳ 明朝"/>
+                              </w:rPr>
+                              <w:t>.</w:t>
+                            </w:r>
+                          </w:p>
+                          <w:p>
+                            <w:pPr>
+                              <w:pStyle w:val="TableFigurecaption"/>
+                              <w:spacing w:beforeLines="100" w:before="240" w:afterLines="0" w:after="0"/>
+                              <w:rPr>
+                                <w:rFonts w:eastAsia="ＭＳ 明朝"/>
+                              </w:rPr>
+                            </w:pPr>
+                          </w:p>
+                        </w:txbxContent>
+                      </wps:txbx>
+                      <wps:bodyPr rot="0" vertOverflow="clip" horzOverflow="clip" vert="horz" wrap="square" lIns="91440" tIns="45720" rIns="91440" bIns="45720" anchor="t" anchorCtr="0">
+                        <a:noAutofit/>
+                      </wps:bodyPr>
+                    </wps:wsp>
+                  </a:graphicData>
+                </a:graphic>
+                <wp14:sizeRelH relativeFrom="margin">
+                  <wp14:pctWidth>0</wp14:pctWidth>
+                </wp14:sizeRelH>
+                <wp14:sizeRelV relativeFrom="margin">
+                  <wp14:pctHeight>0</wp14:pctHeight>
+                </wp14:sizeRelV>
+              </wp:anchor>
+            </w:drawing>
+          </mc:Choice>
+          <mc:Fallback>
+            <w:pict>
+              <v:shape w14:anchorId="1B1AD8E6" id="Text Box 5" o:spid="_x0000_s1030" type="#_x0000_t202" style="position:absolute;left:0;text-align:left;margin-left:56.45pt;margin-top:70.95pt;width:240.1pt;height:210.8pt;z-index:251663360;visibility:visible;mso-wrap-style:square;mso-width-percent:0;mso-height-percent:0;mso-wrap-distance-left:9pt;mso-wrap-distance-top:0;mso-wrap-distance-right:9pt;mso-wrap-distance-bottom:0;mso-position-horizontal:absolute;mso-position-horizontal-relative:page;mso-position-vertical:absolute;mso-position-vertical-relative:page;mso-width-percent:0;mso-height-percent:0;mso-width-relative:margin;mso-height-relative:margin;v-text-anchor:top" o:gfxdata="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" stroked="f">
+                <v:textbox>
+                  <w:txbxContent>
+                    <w:p>
+                      <w:pPr>
+                        <w:jc w:val="center"/>
+                      </w:pPr>
+                      <w:r>
+                        <w:rPr>
+                          <w:rFonts w:asciiTheme="minorHAnsi" w:eastAsiaTheme="minorEastAsia" w:hAnsiTheme="minorHAnsi" w:cstheme="minorBidi"/>
+                          <w:noProof/>
+                          <w:kern w:val="0"/>
+                          <w:lang w:val="en-GB"/>
+                        </w:rPr>
+                        <w:drawing>
+                          <wp:inline distT="0" distB="0" distL="0" distR="0" wp14:anchorId="6FFFB802" wp14:editId="2D9569EA">
+                            <wp:extent cx="2876826" cy="1726095"/>
+                            <wp:effectExtent l="0" t="0" r="0" b="7620"/>
+                            <wp:docPr id="1708147523" name="Picture 4"/>
+                            <wp:cNvGraphicFramePr>
+                              <a:graphicFrameLocks xmlns:a="http://schemas.openxmlformats.org/drawingml/2006/main" noChangeAspect="1"/>
+                            </wp:cNvGraphicFramePr>
+                            <a:graphic xmlns:a="http://schemas.openxmlformats.org/drawingml/2006/main">
+                              <a:graphicData uri="http://schemas.openxmlformats.org/drawingml/2006/picture">
+                                <pic:pic xmlns:pic="http://schemas.openxmlformats.org/drawingml/2006/picture">
+                                  <pic:nvPicPr>
+                                    <pic:cNvPr id="1708147523" name="Picture 4"/>
+                                    <pic:cNvPicPr>
+                                      <a:picLocks noChangeAspect="1" noChangeArrowheads="1"/>
+                                    </pic:cNvPicPr>
+                                  </pic:nvPicPr>
+                                  <pic:blipFill>
+                                    <a:blip r:embed="rId13">
+                                      <a:extLst>
+                                        <a:ext uri="{28A0092B-C50C-407E-A947-70E740481C1C}">
+                                          <a14:useLocalDpi xmlns:a14="http://schemas.microsoft.com/office/drawing/2010/main" val="0"/>
+                                        </a:ext>
+                                      </a:extLst>
+                                    </a:blip>
+                                    <a:stretch>
+                                      <a:fillRect/>
+                                    </a:stretch>
+                                  </pic:blipFill>
+                                  <pic:spPr bwMode="auto">
+                                    <a:xfrm>
+                                      <a:off x="0" y="0"/>
+                                      <a:ext cx="2876826" cy="1726095"/>
+                                    </a:xfrm>
+                                    <a:prstGeom prst="rect">
+                                      <a:avLst/>
+                                    </a:prstGeom>
+                                    <a:noFill/>
+                                    <a:ln>
+                                      <a:noFill/>
+                                    </a:ln>
+                                  </pic:spPr>
+                                </pic:pic>
+                              </a:graphicData>
+                            </a:graphic>
+                          </wp:inline>
+                        </w:drawing>
+                      </w:r>
+                    </w:p>
+                    <w:p>
+                      <w:pPr>
+                        <w:pStyle w:val="TableFigurecaption"/>
+                        <w:spacing w:beforeLines="100" w:before="240"/>
+                        <w:rPr>
+                          <w:rFonts w:eastAsia="ＭＳ 明朝"/>
+                        </w:rPr>
+                      </w:pPr>
+                      <w:r>
+                        <w:rPr>
+                          <w:rFonts w:eastAsia="ＭＳ 明朝"/>
+                        </w:rPr>
+                        <w:t>Fig. </w:t>
+                      </w:r>
+                      <w:r>
+                        <w:rPr>
+                          <w:rFonts w:eastAsia="ＭＳ 明朝"/>
+                        </w:rPr>
+                        <w:t>3</w:t>
+                      </w:r>
+                      <w:r>
+                        <w:rPr>
+                          <w:rFonts w:eastAsia="ＭＳ 明朝"/>
+                        </w:rPr>
+                        <w:t xml:space="preserve"> </w:t>
+                      </w:r>
+                      <w:r>
+                        <w:rPr>
+                          <w:rFonts w:eastAsia="ＭＳ 明朝"/>
+                        </w:rPr>
+                        <w:t>Experimental and numerical laminar burning velocity of NH3/</w:t>
+                      </w:r>
+                      <w:r>
+                        <w:rPr>
+                          <w:rFonts w:eastAsia="ＭＳ 明朝"/>
+                        </w:rPr>
+                        <w:t>C</w:t>
+                      </w:r>
+                      <w:r>
+                        <w:rPr>
+                          <w:rFonts w:eastAsia="ＭＳ 明朝"/>
+                        </w:rPr>
+                        <w:t>H</w:t>
+                      </w:r>
+                      <w:r>
+                        <w:rPr>
+                          <w:rFonts w:eastAsia="ＭＳ 明朝"/>
+                        </w:rPr>
+                        <w:t>4</w:t>
+                      </w:r>
+                      <w:r>
+                        <w:rPr>
+                          <w:rFonts w:eastAsia="ＭＳ 明朝"/>
+                        </w:rPr>
+                        <w:t>/air flames under stoichiometric condition</w:t>
+                      </w:r>
+                      <w:r>
+                        <w:rPr>
+                          <w:rFonts w:eastAsia="ＭＳ 明朝"/>
+                        </w:rPr>
+                        <w:t xml:space="preserve"> and 1 atm of pressure</w:t>
+                      </w:r>
+                      <w:r>
+                        <w:rPr>
+                          <w:rFonts w:eastAsia="ＭＳ 明朝"/>
+                        </w:rPr>
+                        <w:t xml:space="preserve"> at various</w:t>
+                      </w:r>
+                      <w:r>
+                        <w:rPr>
+                          <w:rFonts w:eastAsia="ＭＳ 明朝"/>
+                        </w:rPr>
+                        <w:t xml:space="preserve"> </w:t>
+                      </w:r>
+                      <w:r>
+                        <w:rPr>
+                          <w:rFonts w:eastAsia="ＭＳ 明朝"/>
+                        </w:rPr>
+                        <w:t>ammonia</w:t>
+                      </w:r>
+                      <w:r>
+                        <w:rPr>
+                          <w:rFonts w:eastAsia="ＭＳ 明朝"/>
+                        </w:rPr>
+                        <w:t xml:space="preserve"> concentrations</w:t>
+                      </w:r>
+                      <w:r>
+                        <w:rPr>
+                          <w:rFonts w:eastAsia="ＭＳ 明朝"/>
+                        </w:rPr>
+                        <w:t>.</w:t>
+                      </w:r>
+                    </w:p>
+                    <w:p>
+                      <w:pPr>
+                        <w:pStyle w:val="TableFigurecaption"/>
+                        <w:spacing w:beforeLines="100" w:before="240" w:afterLines="0" w:after="0"/>
+                        <w:rPr>
+                          <w:rFonts w:eastAsia="ＭＳ 明朝"/>
+                        </w:rPr>
+                      </w:pPr>
+                    </w:p>
+                  </w:txbxContent>
+                </v:textbox>
+                <w10:wrap type="topAndBottom" anchorx="page" anchory="page"/>
+                <w10:anchorlock/>
+              </v:shape>
+            </w:pict>
+          </mc:Fallback>
+        </mc:AlternateContent>
+      </w:r>
+      <w:r>
+        <w:t>atm of pressure, intermediate H</w:t>
+      </w:r>
+      <w:r>
+        <w:rPr>
+          <w:vertAlign w:val="subscript"/>
+        </w:rPr>
+        <w:t>2</w:t>
+      </w:r>
+      <w:r>
+        <w:t xml:space="preserve"> concentration (</w:t>
       </w:r>
       <m:oMath>
         <m:sSub>
@@ -7146,6 +8491,9 @@
           </m:e>
           <m:sub>
             <m:r>
+              <m:rPr>
+                <m:sty m:val="p"/>
+              </m:rPr>
               <w:rPr>
                 <w:rFonts w:ascii="Cambria Math" w:hAnsi="Cambria Math"/>
               </w:rPr>
@@ -7161,7 +8509,31 @@
         </m:r>
       </m:oMath>
       <w:r>
-        <w:t xml:space="preserve">) were validated while, at 5 atm of pressure, only </w:t>
+        <w:t xml:space="preserve">) were validated </w:t>
+      </w:r>
+      <w:r>
+        <w:t xml:space="preserve">with datasets from Wang et al. </w:t>
+      </w:r>
+      <w:r>
+        <w:fldChar w:fldCharType="begin"/>
+      </w:r>
+      <w:r>
+        <w:instrText xml:space="preserve"> ADDIN ZOTERO_ITEM CSL_CITATION {"citationID":"O3jfqFGP","properties":{"unsorted":false,"formattedCitation":"[13]","plainCitation":"[13]","noteIndex":0},"citationItems":[{"id":727,"uris":["http://zotero.org/users/20740871/items/XCXB3HFQ"],"itemData":{"id":727,"type":"article-journal","abstract":"Mixing ammonia with syngas can be a promising way to overcome the low reactivity of ammonia, allowing it to find usage in IGCC (Integrated Gasification Combined Cycle) systems and gas turbines for power generation. However, fundamental experimental data on laminar burning velocity of NH3/syngas/air are rather scarce, especially at elevated pressures. This information is critical for the development and validation of reaction mechanisms and advances in combustor design. In the present work, measurements of the laminar burning velocities (SL) of NH3/syngas/air, NH3/CO/air, and NH3/H2/air premixed flames were performed by the heat flux method at pressures up to 5 atm, equivalence ratios ranging from 0.7 to 1.6, ammonia mole fractions in the fuel mixture from 0.2 to 1.0 in the NH3/syngas/air mixtures and 0.03–1.0 in the NH3/CO/air mixtures. Several recently published ammonia oxidation mechanisms were tested against the present experimental data. The measurements and predictions of SL exhibit discrepancies especially for NH3/H2/air flames at elevated pressures. The pressure exponent factors, β, characterizing burning velocity at elevated pressure via empirical power-law correlation SL/SL0 = (P/P0)β are extracted from the measured SL and compared with the numerical results. The thermal, diffusion, and chemical effects of blending syngas with ammonia on SL of the mixtures are distinguished, and the dominant role of the adiabatic flame temperature on the variation of the pressure exponent β is discussed. Kinetic modeling and sensitivity analyses showed that reactions of NHi to N2Hi (i = 0–4) species affect the predicted SL under rich conditions. At elevated pressures, these reactions also affect the NO formation via third-body collision reactions and NHi + NO reactions. Even for rich flames, the ammonia consumption is favored with the addition of syngas which also promotes NO formation by enriching the H and OH radical pools and increasing the flame temperature. The addition of hydrogen or carbon monoxide has equally promoting effect on the ammonia decomposition and NOx formation although their flame speed differs a lot.","citation-key":"wangExperimentalStudyKinetic2020","container-title":"Combustion and Flame","DOI":"10.1016/j.combustflame.2020.08.004","ISSN":"0010-2180","journalAbbreviation":"Combustion and Flame","page":"270-287","source":"ScienceDirect","title":"Experimental study and kinetic analysis of the laminar burning velocity of NH3/syngas/air, NH3/CO/air and NH3/H2/air premixed flames at elevated pressures","volume":"221","author":[{"family":"Wang","given":"Shixing"},{"family":"Wang","given":"Zhihua"},{"family":"Elbaz","given":"Ayman M."},{"family":"Han","given":"Xinlu"},{"family":"He","given":"Yong"},{"family":"Costa","given":"Mário"},{"family":"Konnov","given":"Alexander A."},{"family":"Roberts","given":"William L."}],"issued":{"date-parts":[["2020",11,1]]}}}],"schema":"https://github.com/citation-style-language/schema/raw/master/csl-citation.json"} </w:instrText>
+      </w:r>
+      <w:r>
+        <w:fldChar w:fldCharType="separate"/>
+      </w:r>
+      <w:r>
+        <w:t>[13]</w:t>
+      </w:r>
+      <w:r>
+        <w:fldChar w:fldCharType="end"/>
+      </w:r>
+      <w:r>
+        <w:t xml:space="preserve"> </w:t>
+      </w:r>
+      <w:r>
+        <w:t xml:space="preserve">while, at 5 atm of pressure, only </w:t>
       </w:r>
       <m:oMath>
         <m:sSub>
@@ -7183,6 +8555,9 @@
           </m:e>
           <m:sub>
             <m:r>
+              <m:rPr>
+                <m:sty m:val="p"/>
+              </m:rPr>
               <w:rPr>
                 <w:rFonts w:ascii="Cambria Math" w:hAnsi="Cambria Math"/>
               </w:rPr>
@@ -7198,189 +8573,28 @@
         </m:r>
       </m:oMath>
       <w:r>
-        <w:t xml:space="preserve"> could be validated. This suggests that Present Mech is now capable of modelling flame speed of hydrogen enriched ammonia combustion. When comparing NH</w:t>
-      </w:r>
-      <w:r>
-        <w:rPr>
-          <w:vertAlign w:val="subscript"/>
-        </w:rPr>
-        <w:t>3</w:t>
-      </w:r>
-      <w:r>
-        <w:t>/CH</w:t>
-      </w:r>
-      <w:r>
-        <w:rPr>
-          <w:vertAlign w:val="subscript"/>
-        </w:rPr>
-        <w:t>4</w:t>
-      </w:r>
-      <w:r>
-        <w:t xml:space="preserve">/air predictions to measured </w:t>
-      </w:r>
-      <m:oMath>
-        <m:sSub>
-          <m:sSubPr>
-            <m:ctrlPr>
-              <w:rPr>
-                <w:rFonts w:ascii="Cambria Math" w:hAnsi="Cambria Math"/>
-                <w:i/>
-              </w:rPr>
-            </m:ctrlPr>
-          </m:sSubPr>
-          <m:e>
-            <m:r>
-              <w:rPr>
-                <w:rFonts w:ascii="Cambria Math" w:hAnsi="Cambria Math"/>
-              </w:rPr>
-              <m:t>S</m:t>
-            </m:r>
-          </m:e>
-          <m:sub>
-            <m:r>
-              <w:rPr>
-                <w:rFonts w:ascii="Cambria Math" w:hAnsi="Cambria Math"/>
-              </w:rPr>
-              <m:t>L</m:t>
-            </m:r>
-          </m:sub>
-        </m:sSub>
-      </m:oMath>
-      <w:r>
-        <w:t xml:space="preserve">, the </w:t>
-      </w:r>
-      <m:oMath>
-        <m:sSub>
-          <m:sSubPr>
-            <m:ctrlPr>
-              <w:rPr>
-                <w:rFonts w:ascii="Cambria Math" w:hAnsi="Cambria Math"/>
-              </w:rPr>
-            </m:ctrlPr>
-          </m:sSubPr>
-          <m:e>
-            <m:r>
-              <w:rPr>
-                <w:rFonts w:ascii="Cambria Math" w:hAnsi="Cambria Math"/>
-              </w:rPr>
-              <m:t>S</m:t>
-            </m:r>
-          </m:e>
-          <m:sub>
-            <m:r>
-              <w:rPr>
-                <w:rFonts w:ascii="Cambria Math" w:hAnsi="Cambria Math"/>
-              </w:rPr>
-              <m:t>L</m:t>
-            </m:r>
-          </m:sub>
-        </m:sSub>
-      </m:oMath>
-      <w:r>
-        <w:t xml:space="preserve"> predictions are satisfactory. The model </w:t>
-      </w:r>
-      <w:r>
-        <w:t>can</w:t>
-      </w:r>
-      <w:r>
-        <w:t xml:space="preserve"> match </w:t>
-      </w:r>
-      <m:oMath>
-        <m:sSub>
-          <m:sSubPr>
-            <m:ctrlPr>
-              <w:rPr>
-                <w:rFonts w:ascii="Cambria Math" w:hAnsi="Cambria Math"/>
-              </w:rPr>
-            </m:ctrlPr>
-          </m:sSubPr>
-          <m:e>
-            <m:r>
-              <w:rPr>
-                <w:rFonts w:ascii="Cambria Math" w:hAnsi="Cambria Math"/>
-              </w:rPr>
-              <m:t>S</m:t>
-            </m:r>
-          </m:e>
-          <m:sub>
-            <m:r>
-              <w:rPr>
-                <w:rFonts w:ascii="Cambria Math" w:hAnsi="Cambria Math"/>
-              </w:rPr>
-              <m:t>L</m:t>
-            </m:r>
-          </m:sub>
-        </m:sSub>
-      </m:oMath>
-      <w:r>
-        <w:t xml:space="preserve"> predictions to Okafor et al. (2019) </w:t>
+        <w:t xml:space="preserve"> could be validated</w:t>
+      </w:r>
+      <w:r>
+        <w:t xml:space="preserve"> with the dataset from Gotama et al. </w:t>
       </w:r>
       <w:r>
         <w:fldChar w:fldCharType="begin"/>
       </w:r>
       <w:r>
-        <w:instrText xml:space="preserve"> ADDIN ZOTERO_ITEM CSL_CITATION {"citationID":"RaXOGHsk","properties":{"unsorted":false,"formattedCitation":"[1]","plainCitation":"[1]","noteIndex":0},"citationItems":[{"id":196,"uris":["http://zotero.org/users/20740871/items/GI6AGGV5"],"itemData":{"id":196,"type":"article-journal","abstract":"Ammonia and blends of ammonia with methane are gaining increased interest as fuels for gas turbine applications and hence optimized reduced reaction mechanisms for the fuels are required for the development of combustors. However, there is a scarcity of measured data on the laminar burning velocity of the fuels for optimizing and validating reaction mechanisms especially at high pressures. In this study, an extensive set of measurements of the unstretched laminar burning velocity and Markstein lengths of CH4NH3-air flames at high pressures are reported for the first time and an optimized reduced reaction mechanism is proposed. The experiments were conducted in a constant volume chamber for various ammonia heat fractions in the fuel ranging from 0 to 0.30, equivalence ratios ranging from 0.7 to 1.3, and mixture pressures ranging from 0.10 to 0.50 MPa. The reduced reaction mechanism was developed from a detailed reaction mechanism for CH4NH3-air flames by Okafor et al., and optimized against the present measurements and data in the literature. It is shown that the reduced mechanism models the unstretched laminar burning velocity of NH3/air and CH4NH3-air flames with high fidelity at all studied conditions. It also models satisfactorily NH3, NO and CO concentration in CH4NH3O2N2 oxidation in a laminar flow reactor. Furthermore, the reduced mechanism is demonstrated to predict NO, OH, and NH profiles in a premixed stagnation NH3-air flame satisfactorily. The experimental measurements were also used to validate selected detailed reaction mechanisms. It was found that the significant over-prediction of NO production from NH3 oxidation by GRI Mech 3.0 is primarily due to the influence of the reaction NH+H2OHNO+H2, which in fact may not be important in fuel NO chemistry.","citation-key":"okaforMeasurement2019","container-title":"Combustion and Flame","DOI":"10.1016/j.combustflame.2019.03.008","ISSN":"0010-2180","journalAbbreviation":"Combustion and Flame","page":"162-175","source":"ScienceDirect","title":"Measurement and modelling of the laminar burning velocity of methane-ammonia-air flames at high pressures using a reduced reaction mechanism","volume":"204","author":[{"family":"Okafor","given":"Ekenechukwu Chijioke"},{"family":"Naito","given":"Yuji"},{"family":"Colson","given":"Sophie"},{"family":"Ichikawa","given":"Akinori"},{"family":"Kudo","given":"Taku"},{"family":"Hayakawa","given":"Akihiro"},{"family":"Kobayashi","given":"Hideaki"}],"issued":{"date-parts":[["2019",6,1]]}}}],"schema":"https://github.com/citation-style-language/schema/raw/master/csl-citation.json"} </w:instrText>
+        <w:instrText xml:space="preserve"> ADDIN ZOTERO_ITEM CSL_CITATION {"citationID":"pGpNApZ5","properties":{"unsorted":false,"formattedCitation":"[6]","plainCitation":"[6]","noteIndex":0},"citationItems":[{"id":733,"uris":["http://zotero.org/users/20740871/items/T3E45C4C"],"itemData":{"id":733,"type":"article-journal","abstract":"The application of ammonia (NH3) blended with hydrogen (H2) as a fuel in combustion systems is a practical approach to decarbonise the energy sector, and the combustion of the fuel at rich conditions is relevant in emissions control through rich-lean combustion. However, the chemistry of rich NH3/H2 flames at high pressure, and the interaction between NH3 and H2 still need to be clarified. Therefore, the present study focuses on the chemical kinetics of NH3/H2/air flames at rich conditions and elevated pressures. To validate chemical kinetics in the literature, the laminar burning velocity of NH3/H2/Air premixed flames were measured at 0.1 and 0.5 MPa and equivalence ratios up to 1.8. The results show that the seven kinetics mechanisms studied could not satisfactorily predict the measurements at fuel-rich conditions and elevated pressure. The kinetics mechanism by Han et al. was optimized, leading to a new detailed kinetics, which can be reduced to 26 species and 119 reactions and satisfactorily predicts the present measurements and those in the literature. Analysis of the chemistry of NH3/H2 flames using the new mechanism shows NH3 and H2 kinetics are strongly coupled through a H2 decomposition/recovery mechanism, here named H2 recovery mechanism, which is important in modelling the burning velocity of the flame at fuel-rich conditions. The burned gas Markstein length was also extracted from the measured flame speed and its behaviour was studied using theoretical correlations.","citation-key":"gotamaMeasurement2022","container-title":"Combustion and Flame","DOI":"10.1016/j.combustflame.2021.111753","ISSN":"0010-2180","journalAbbreviation":"Combustion and Flame","page":"111753","source":"ScienceDirect","title":"Measurement of the laminar burning velocity and kinetics study of the importance of the hydrogen recovery mechanism of ammonia/hydrogen/air premixed flames","volume":"236","author":[{"family":"Gotama","given":"Gabriel J."},{"family":"Hayakawa","given":"Akihiro"},{"family":"Okafor","given":"Ekenechukwu C."},{"family":"Kanoshima","given":"Ryuhei"},{"family":"Hayashi","given":"Masao"},{"family":"Kudo","given":"Taku"},{"family":"Kobayashi","given":"Hideaki"}],"issued":{"date-parts":[["2022",2,1]]}}}],"schema":"https://github.com/citation-style-language/schema/raw/master/csl-citation.json"} </w:instrText>
       </w:r>
       <w:r>
         <w:fldChar w:fldCharType="separate"/>
       </w:r>
       <w:r>
-        <w:t>[1]</w:t>
+        <w:t>[6]</w:t>
       </w:r>
       <w:r>
         <w:fldChar w:fldCharType="end"/>
       </w:r>
       <w:r>
-        <w:t xml:space="preserve"> for all the its data points across elevated pressures, increasing </w:t>
-      </w:r>
-      <m:oMath>
-        <m:sSub>
-          <m:sSubPr>
-            <m:ctrlPr>
-              <w:rPr>
-                <w:rFonts w:ascii="Cambria Math" w:hAnsi="Cambria Math"/>
-                <w:i/>
-              </w:rPr>
-            </m:ctrlPr>
-          </m:sSubPr>
-          <m:e>
-            <m:r>
-              <w:rPr>
-                <w:rFonts w:ascii="Cambria Math" w:hAnsi="Cambria Math"/>
-              </w:rPr>
-              <m:t>X</m:t>
-            </m:r>
-          </m:e>
-          <m:sub>
-            <m:r>
-              <w:rPr>
-                <w:rFonts w:ascii="Cambria Math" w:hAnsi="Cambria Math"/>
-              </w:rPr>
-              <m:t>CH4</m:t>
-            </m:r>
-          </m:sub>
-        </m:sSub>
-      </m:oMath>
-      <w:r>
-        <w:t xml:space="preserve"> and different equivalence ratios. This implies that the underlying Okafor Reduced Mech optimizations for NH</w:t>
-      </w:r>
-      <w:r>
-        <w:rPr>
-          <w:vertAlign w:val="subscript"/>
-        </w:rPr>
-        <w:t>3</w:t>
-      </w:r>
-      <w:r>
-        <w:t>/CH</w:t>
-      </w:r>
-      <w:r>
-        <w:rPr>
-          <w:vertAlign w:val="subscript"/>
-        </w:rPr>
-        <w:t>4</w:t>
-      </w:r>
-      <w:r>
-        <w:t>/air flame chemistry in Present Mech is unaffected.</w:t>
+        <w:t>. This suggests that Present Mech is now capable of modelling flame speed of hydrogen enriched ammonia combustion.</w:t>
       </w:r>
     </w:p>
     <w:p>
@@ -7418,13 +8632,10 @@
           <w:i/>
           <w:iCs/>
         </w:rPr>
-        <w:t>Combustion and Flame</w:t>
-      </w:r>
-      <w:r>
-        <w:t>, 204, (2019), 162–175</w:t>
-      </w:r>
-      <w:r>
-        <w:t>.</w:t>
+        <w:t>Combust. Flame</w:t>
+      </w:r>
+      <w:r>
+        <w:t>, 204, (2019), 162–175.</w:t>
       </w:r>
     </w:p>
     <w:p>
@@ -7439,13 +8650,10 @@
           <w:i/>
           <w:iCs/>
         </w:rPr>
-        <w:t>Combustion and Flame</w:t>
-      </w:r>
-      <w:r>
-        <w:t>, 187, (2018), 185–198</w:t>
-      </w:r>
-      <w:r>
-        <w:t>.</w:t>
+        <w:t>Combust. Flame</w:t>
+      </w:r>
+      <w:r>
+        <w:t>, 187, (2018), 185–198.</w:t>
       </w:r>
     </w:p>
     <w:p>
@@ -7460,13 +8668,10 @@
           <w:i/>
           <w:iCs/>
         </w:rPr>
-        <w:t>Combustion and Flame</w:t>
-      </w:r>
-      <w:r>
-        <w:t>, 210, (2019), 236–246</w:t>
-      </w:r>
-      <w:r>
-        <w:t>.</w:t>
+        <w:t>Combust. Flame</w:t>
+      </w:r>
+      <w:r>
+        <w:t>, 210, (2019), 236–246.</w:t>
       </w:r>
     </w:p>
     <w:p>
@@ -7481,7 +8686,7 @@
           <w:i/>
           <w:iCs/>
         </w:rPr>
-        <w:t>Renewable and Sustainable Energy Reviews</w:t>
+        <w:t>Renew. Sustain. Energy Rev.</w:t>
       </w:r>
       <w:r>
         <w:t>, 147, (2021), 111254.</w:t>
@@ -7492,15 +8697,7 @@
         <w:pStyle w:val="Reference"/>
       </w:pPr>
       <w:r>
-        <w:t xml:space="preserve">R. Li, A. A. Konnov, G. He, F. Qin, and D. </w:t>
-      </w:r>
-      <w:proofErr w:type="gramStart"/>
-      <w:r>
-        <w:t>Zhang,</w:t>
-      </w:r>
-      <w:proofErr w:type="gramEnd"/>
-      <w:r>
-        <w:t xml:space="preserve"> </w:t>
+        <w:t xml:space="preserve">R. Li, A. A. Konnov, G. He, F. Qin, and D. Zhang, </w:t>
       </w:r>
       <w:r>
         <w:rPr>
@@ -7518,22 +8715,14 @@
         <w:pStyle w:val="Reference"/>
       </w:pPr>
       <w:r>
-        <w:t xml:space="preserve">G. J. Gotama, A. Hayakawa, E. C. Okafor, R. </w:t>
-      </w:r>
-      <w:proofErr w:type="spellStart"/>
-      <w:r>
-        <w:t>Kanoshima</w:t>
-      </w:r>
-      <w:proofErr w:type="spellEnd"/>
-      <w:r>
-        <w:t xml:space="preserve">, M. Hayashi, T. Kudo, and H. Kobayashi, </w:t>
+        <w:t xml:space="preserve">G. J. Gotama, A. Hayakawa, E. C. Okafor, R. Kanoshima, M. Hayashi, T. Kudo, and H. Kobayashi, </w:t>
       </w:r>
       <w:r>
         <w:rPr>
           <w:i/>
           <w:iCs/>
         </w:rPr>
-        <w:t>Combustion and Flame</w:t>
+        <w:t>Combust. Flame</w:t>
       </w:r>
       <w:r>
         <w:t>, 236, (2022), 111753.</w:t>
@@ -7551,7 +8740,7 @@
           <w:i/>
           <w:iCs/>
         </w:rPr>
-        <w:t>Combustion and Flame</w:t>
+        <w:t>Combust. Flame</w:t>
       </w:r>
       <w:r>
         <w:t>, 213, (2020), 1–13.</w:t>
@@ -7569,7 +8758,7 @@
           <w:i/>
           <w:iCs/>
         </w:rPr>
-        <w:t>Combustion and Flame</w:t>
+        <w:t>Combust. Flame</w:t>
       </w:r>
       <w:r>
         <w:t>, 185, (2017), 16–27.</w:t>
@@ -7587,7 +8776,7 @@
           <w:i/>
           <w:iCs/>
         </w:rPr>
-        <w:t>Progress in Energy and Combustion Science</w:t>
+        <w:t>Prog. Energy Combust. Sci.</w:t>
       </w:r>
       <w:r>
         <w:t>, 15, (1989), 287–338.</w:t>
@@ -7598,17 +8787,17 @@
         <w:pStyle w:val="Reference"/>
       </w:pPr>
       <w:r>
-        <w:t xml:space="preserve">H. Nakamura and S. Hasegawa, </w:t>
+        <w:t xml:space="preserve">X. Han, K. Wan, and T. Nagy, </w:t>
       </w:r>
       <w:r>
         <w:rPr>
           <w:i/>
           <w:iCs/>
         </w:rPr>
-        <w:t>Proceedings of the Combustion Institute</w:t>
-      </w:r>
-      <w:r>
-        <w:t>, 36, (2017), 4217–4226.</w:t>
+        <w:t>Combust. Flame</w:t>
+      </w:r>
+      <w:r>
+        <w:t>, 286, (2026), 114855.</w:t>
       </w:r>
     </w:p>
     <w:p>
@@ -7616,25 +8805,17 @@
         <w:pStyle w:val="Reference"/>
       </w:pPr>
       <w:r>
-        <w:t xml:space="preserve">J. Otomo, M. Koshi, T. </w:t>
-      </w:r>
-      <w:proofErr w:type="spellStart"/>
-      <w:r>
-        <w:t>Mitsumori</w:t>
-      </w:r>
-      <w:proofErr w:type="spellEnd"/>
-      <w:r>
-        <w:t xml:space="preserve">, H. Iwasaki, and K. Yamada, </w:t>
+        <w:t xml:space="preserve">X. Han, Z. Wang, M. Costa, Z. Sun, Y. He, and K. Cen, </w:t>
       </w:r>
       <w:r>
         <w:rPr>
           <w:i/>
           <w:iCs/>
         </w:rPr>
-        <w:t>International Journal of Hydrogen Energy</w:t>
-      </w:r>
-      <w:r>
-        <w:t>, 43, (2018), 3004–3014.</w:t>
+        <w:t>Combust. Flame</w:t>
+      </w:r>
+      <w:r>
+        <w:t>, 206, (2019), 214–226.</w:t>
       </w:r>
     </w:p>
     <w:p>
@@ -7642,7 +8823,17 @@
         <w:pStyle w:val="Reference"/>
       </w:pPr>
       <w:r>
-        <w:t>Abe, S., Kitagawa, T., and Okafor E. C., Proceedings of the 35th Internal Combustion Engine Symposium [No. 24-51], (2024).</w:t>
+        <w:t xml:space="preserve">Z. Ling, J. Lin, J. Li, X. Han, M. Liu, D. Yuan, and Z. Wang, </w:t>
+      </w:r>
+      <w:r>
+        <w:rPr>
+          <w:i/>
+          <w:iCs/>
+        </w:rPr>
+        <w:t>J. Energy Inst.</w:t>
+      </w:r>
+      <w:r>
+        <w:t>, 126, (2026), 102503.</w:t>
       </w:r>
     </w:p>
     <w:p>
@@ -7650,58 +8841,32 @@
         <w:pStyle w:val="Reference"/>
       </w:pPr>
       <w:r>
-        <w:t xml:space="preserve">X. Han, K. Wan, and T. Nagy, </w:t>
+        <w:t xml:space="preserve">S. Wang, Z. Wang, A. M. Elbaz, X. Han, Y. He, M. Costa, A. A. Konnov, and W. L. Roberts, </w:t>
       </w:r>
       <w:r>
         <w:rPr>
           <w:i/>
           <w:iCs/>
         </w:rPr>
-        <w:t>Combustion and Flame</w:t>
-      </w:r>
-      <w:r>
-        <w:t>, 286, (2026), 114855.</w:t>
+        <w:t>Combust. Flame</w:t>
+      </w:r>
+      <w:r>
+        <w:t>, 221, (2020), 270–287.</w:t>
       </w:r>
     </w:p>
     <w:p>
       <w:pPr>
         <w:pStyle w:val="Reference"/>
-      </w:pPr>
-      <w:r>
-        <w:t xml:space="preserve">X. Han, Z. Wang, M. Costa, Z. Sun, Y. He, and K. Cen, </w:t>
-      </w:r>
-      <w:r>
-        <w:rPr>
-          <w:i/>
-          <w:iCs/>
-        </w:rPr>
-        <w:t>Combustion and Flame</w:t>
-      </w:r>
-      <w:r>
-        <w:t>, 206, (2019), 214–226.</w:t>
-      </w:r>
-    </w:p>
-    <w:p>
-      <w:pPr>
-        <w:pStyle w:val="Reference"/>
-      </w:pPr>
-      <w:r>
-        <w:t xml:space="preserve">Z. Ling, J. Lin, J. Li, X. Han, M. Liu, D. Yuan, and Z. Wang, </w:t>
-      </w:r>
-      <w:r>
-        <w:rPr>
-          <w:i/>
-          <w:iCs/>
-        </w:rPr>
-        <w:t>Journal of the Energy Institute</w:t>
-      </w:r>
-      <w:r>
-        <w:t>, 126, (2026), 102503.</w:t>
-      </w:r>
+        <w:numPr>
+          <w:ilvl w:val="0"/>
+          <w:numId w:val="0"/>
+        </w:numPr>
+        <w:ind w:left="440" w:hanging="440"/>
+      </w:pPr>
     </w:p>
     <w:sectPr>
-      <w:headerReference w:type="default" r:id="rId11"/>
-      <w:footerReference w:type="default" r:id="rId12"/>
+      <w:headerReference w:type="default" r:id="rId14"/>
+      <w:footerReference w:type="default" r:id="rId15"/>
       <w:type w:val="continuous"/>
       <w:pgSz w:w="11906" w:h="16838"/>
       <w:pgMar w:top="1418" w:right="1134" w:bottom="1418" w:left="1134" w:header="851" w:footer="964" w:gutter="0"/>
@@ -8315,7 +9480,7 @@
       </w:pPr>
     </w:lvl>
   </w:abstractNum>
-  <w:abstractNum w:abstractNumId="5" w15:restartNumberingAfterBreak="0">
+  <w:abstractNum w:abstractNumId="4" w15:restartNumberingAfterBreak="0">
     <w:nsid w:val="1DB96881"/>
     <w:multiLevelType w:val="multilevel"/>
     <w:tmpl w:val="182491DE"/>
@@ -8437,7 +9602,7 @@
       </w:rPr>
     </w:lvl>
   </w:abstractNum>
-  <w:abstractNum w:abstractNumId="6" w15:restartNumberingAfterBreak="0">
+  <w:abstractNum w:abstractNumId="5" w15:restartNumberingAfterBreak="0">
     <w:nsid w:val="298A441A"/>
     <w:multiLevelType w:val="multilevel"/>
     <w:tmpl w:val="0F74241A"/>
@@ -8559,7 +9724,7 @@
       </w:rPr>
     </w:lvl>
   </w:abstractNum>
-  <w:abstractNum w:abstractNumId="7" w15:restartNumberingAfterBreak="0">
+  <w:abstractNum w:abstractNumId="6" w15:restartNumberingAfterBreak="0">
     <w:nsid w:val="30917A7B"/>
     <w:multiLevelType w:val="multilevel"/>
     <w:tmpl w:val="F1F041E8"/>
@@ -8681,7 +9846,7 @@
       </w:rPr>
     </w:lvl>
   </w:abstractNum>
-  <w:abstractNum w:abstractNumId="8" w15:restartNumberingAfterBreak="0">
+  <w:abstractNum w:abstractNumId="7" w15:restartNumberingAfterBreak="0">
     <w:nsid w:val="49A21690"/>
     <w:multiLevelType w:val="hybridMultilevel"/>
     <w:tmpl w:val="A0380B70"/>
@@ -8767,7 +9932,7 @@
       </w:pPr>
     </w:lvl>
   </w:abstractNum>
-  <w:abstractNum w:abstractNumId="9" w15:restartNumberingAfterBreak="0">
+  <w:abstractNum w:abstractNumId="8" w15:restartNumberingAfterBreak="0">
     <w:nsid w:val="51270177"/>
     <w:multiLevelType w:val="multilevel"/>
     <w:tmpl w:val="FF725CC2"/>
@@ -8889,7 +10054,7 @@
       </w:rPr>
     </w:lvl>
   </w:abstractNum>
-  <w:abstractNum w:abstractNumId="10" w15:restartNumberingAfterBreak="0">
+  <w:abstractNum w:abstractNumId="9" w15:restartNumberingAfterBreak="0">
     <w:nsid w:val="5622195C"/>
     <w:multiLevelType w:val="multilevel"/>
     <w:tmpl w:val="7284956E"/>
@@ -8979,7 +10144,7 @@
       </w:pPr>
     </w:lvl>
   </w:abstractNum>
-  <w:abstractNum w:abstractNumId="11" w15:restartNumberingAfterBreak="0">
+  <w:abstractNum w:abstractNumId="10" w15:restartNumberingAfterBreak="0">
     <w:nsid w:val="654E40D3"/>
     <w:multiLevelType w:val="multilevel"/>
     <w:tmpl w:val="3D34777A"/>
@@ -9069,7 +10234,7 @@
       </w:pPr>
     </w:lvl>
   </w:abstractNum>
-  <w:abstractNum w:abstractNumId="12" w15:restartNumberingAfterBreak="0">
+  <w:abstractNum w:abstractNumId="11" w15:restartNumberingAfterBreak="0">
     <w:nsid w:val="6C1A66D4"/>
     <w:multiLevelType w:val="multilevel"/>
     <w:tmpl w:val="87BCC9E0"/>
@@ -9193,7 +10358,7 @@
       </w:rPr>
     </w:lvl>
   </w:abstractNum>
-  <w:abstractNum w:abstractNumId="13" w15:restartNumberingAfterBreak="0">
+  <w:abstractNum w:abstractNumId="12" w15:restartNumberingAfterBreak="0">
     <w:nsid w:val="72D47AD6"/>
     <w:multiLevelType w:val="multilevel"/>
     <w:tmpl w:val="7F6E11FC"/>
@@ -9315,13 +10480,13 @@
     </w:lvl>
   </w:abstractNum>
   <w:num w:numId="1" w16cid:durableId="1427385142">
-    <w:abstractNumId w:val="12"/>
+    <w:abstractNumId w:val="11"/>
   </w:num>
   <w:num w:numId="2" w16cid:durableId="987706551">
     <w:abstractNumId w:val="3"/>
   </w:num>
   <w:num w:numId="3" w16cid:durableId="641813209">
-    <w:abstractNumId w:val="7"/>
+    <w:abstractNumId w:val="6"/>
   </w:num>
   <w:num w:numId="4" w16cid:durableId="643698014">
     <w:abstractNumId w:val="1"/>
@@ -9330,27 +10495,27 @@
     <w:abstractNumId w:val="2"/>
   </w:num>
   <w:num w:numId="6" w16cid:durableId="641160190">
-    <w:abstractNumId w:val="11"/>
+    <w:abstractNumId w:val="10"/>
   </w:num>
   <w:num w:numId="7" w16cid:durableId="62029372">
-    <w:abstractNumId w:val="10"/>
+    <w:abstractNumId w:val="9"/>
   </w:num>
   <w:num w:numId="8" w16cid:durableId="1606503576">
-    <w:abstractNumId w:val="6"/>
+    <w:abstractNumId w:val="5"/>
   </w:num>
   <w:num w:numId="9" w16cid:durableId="1705131004">
-    <w:abstractNumId w:val="9"/>
+    <w:abstractNumId w:val="8"/>
   </w:num>
   <w:num w:numId="10" w16cid:durableId="780414384">
-    <w:abstractNumId w:val="13"/>
+    <w:abstractNumId w:val="12"/>
   </w:num>
   <w:num w:numId="11" w16cid:durableId="1938782168">
-    <w:abstractNumId w:val="5"/>
+    <w:abstractNumId w:val="4"/>
   </w:num>
   <w:num w:numId="12" w16cid:durableId="1692875334">
-    <w:abstractNumId w:val="8"/>
+    <w:abstractNumId w:val="7"/>
   </w:num>
-  <w:num w:numId="16" w16cid:durableId="1909924580">
+  <w:num w:numId="13" w16cid:durableId="1909924580">
     <w:abstractNumId w:val="0"/>
   </w:num>
 </w:numbering>
@@ -10306,6 +11471,15 @@
       <w:lang w:val="en-GB"/>
     </w:rPr>
   </w:style>
+  <w:style w:type="paragraph" w:styleId="Bibliography">
+    <w:name w:val="Bibliography"/>
+    <w:basedOn w:val="Normal"/>
+    <w:next w:val="Normal"/>
+    <w:uiPriority w:val="37"/>
+    <w:semiHidden/>
+    <w:unhideWhenUsed/>
+    <w:rsid w:val="0057402D"/>
+  </w:style>
 </w:styles>
 </file>
 

</xml_diff>